<commit_message>
Chapter 4: add code walkthroughs (ML + Confidence Engine) with figures
Per uni convention, explain the two most important code components at
source-code level with syntax-highlighted code figures and block-by-
block explanation:
- ML (predictor.py): the feature definition excluding cvss_score
  (anti-leakage) and the feature-extraction + prediction path.
- Confidence Engine (confidence_engine.py): the weighted scoring +
  PoC/informational overrides, and example factor computations with
  the classification thresholds.

Adds two "Tools/Libraries" component tables (Table 4.1, 4.2) and four
code figures; renumbers all downstream figures to 4.1–4.27 (12
diagrams + 4 code + 11 screenshots). Rebuilt the .docx (27 embedded
images).
</commit_message>
<xml_diff>
--- a/docs/Chapter_4_Design_and_Implementation.docx
+++ b/docs/Chapter_4_Design_and_Implementation.docx
@@ -2,7 +2,7 @@
 <file path=word/document.xml><?xml version="1.0" encoding="utf-8"?>
 <w:document xmlns:w="http://schemas.openxmlformats.org/wordprocessingml/2006/main" xmlns:m="http://schemas.openxmlformats.org/officeDocument/2006/math" xmlns:r="http://schemas.openxmlformats.org/officeDocument/2006/relationships" xmlns:o="urn:schemas-microsoft-com:office:office" xmlns:v="urn:schemas-microsoft-com:vml" xmlns:w10="urn:schemas-microsoft-com:office:word" xmlns:a="http://schemas.openxmlformats.org/drawingml/2006/main" xmlns:pic="http://schemas.openxmlformats.org/drawingml/2006/picture" xmlns:wp="http://schemas.openxmlformats.org/drawingml/2006/wordprocessingDrawing">
   <w:body>
-    <w:bookmarkStart w:id="117" w:name="chapter-4-design-and-implementation"/>
+    <w:bookmarkStart w:id="129" w:name="chapter-4-design-and-implementation"/>
     <w:p>
       <w:pPr>
         <w:pStyle w:val="Heading1"/>
@@ -3501,7 +3501,7 @@
         <w:t xml:space="preserve"> </w:t>
       </w:r>
       <w:r>
-        <w:t xml:space="preserve">The login and registration screens (Figures 4.14 and 4.15) present a single focused form. Their minimalism reflects the design goal of moving the analyst into the workspace with the least friction; all other functionality is gated behind successful authentication.</w:t>
+        <w:t xml:space="preserve">The login and registration screens (Figures 4.18 and 4.19) present a single focused form. Their minimalism reflects the design goal of moving the analyst into the workspace with the least friction; all other functionality is gated behind successful authentication.</w:t>
       </w:r>
     </w:p>
     <w:p>
@@ -3519,7 +3519,7 @@
         <w:t xml:space="preserve"> </w:t>
       </w:r>
       <w:r>
-        <w:t xml:space="preserve">The dashboard (Figure 4.16) is the landing screen and the clearest expression of the system's value. It is organised top-to-bottom in decreasing order of abstraction: four key-performance-indicator cards give the headline counts (Total Findings, Confirmed, Needs Review, Total Uploads); three charts characterise the dataset (a severity-breakdown pie, a classification-results pie, and a scans-by-tool bar chart); and a Top-10-by-CVSS table lets the analyst drill straight into the most severe findings. This layout embodies the "overview first, detail on demand" principle of information-dashboard design.</w:t>
+        <w:t xml:space="preserve">The dashboard (Figure 4.20) is the landing screen and the clearest expression of the system's value. It is organised top-to-bottom in decreasing order of abstraction: four key-performance-indicator cards give the headline counts (Total Findings, Confirmed, Needs Review, Total Uploads); three charts characterise the dataset (a severity-breakdown pie, a classification-results pie, and a scans-by-tool bar chart); and a Top-10-by-CVSS table lets the analyst drill straight into the most severe findings. This layout embodies the "overview first, detail on demand" principle of information-dashboard design.</w:t>
       </w:r>
     </w:p>
     <w:p>
@@ -3537,7 +3537,7 @@
         <w:t xml:space="preserve"> </w:t>
       </w:r>
       <w:r>
-        <w:t xml:space="preserve">The upload screen (Figure 4.17) is the primary ingestion path. It is divided into three regions: a scanner-type selector and drag-and-drop file zone; a</w:t>
+        <w:t xml:space="preserve">The upload screen (Figure 4.21) is the primary ingestion path. It is divided into three regions: a scanner-type selector and drag-and-drop file zone; a</w:t>
       </w:r>
       <w:r>
         <w:t xml:space="preserve"> </w:t>
@@ -3571,7 +3571,7 @@
         <w:t xml:space="preserve"> </w:t>
       </w:r>
       <w:r>
-        <w:t xml:space="preserve">The Auto Scan screen (Figure 4.18) provides a target field, scanner check-boxes, and, crucially, an explicit authorisation acknowledgement that must be ticked before a scan can start. This gate is the interface-level expression of the responsible-operation principle.</w:t>
+        <w:t xml:space="preserve">The Auto Scan screen (Figure 4.22) provides a target field, scanner check-boxes, and, crucially, an explicit authorisation acknowledgement that must be ticked before a scan can start. This gate is the interface-level expression of the responsible-operation principle.</w:t>
       </w:r>
     </w:p>
     <w:p>
@@ -3589,7 +3589,7 @@
         <w:t xml:space="preserve"> </w:t>
       </w:r>
       <w:r>
-        <w:t xml:space="preserve">The findings screen (Figure 4.19) is the analyst's primary working list: a filterable, sortable table of all normalised findings, with columns for severity, CVSS, classification, scanner, and CWE. The classification badge in each row lets the analyst immediately focus on</w:t>
+        <w:t xml:space="preserve">The findings screen (Figure 4.23) is the analyst's primary working list: a filterable, sortable table of all normalised findings, with columns for severity, CVSS, classification, scanner, and CWE. The classification badge in each row lets the analyst immediately focus on</w:t>
       </w:r>
       <w:r>
         <w:t xml:space="preserve"> </w:t>
@@ -3623,7 +3623,7 @@
         <w:t xml:space="preserve"> </w:t>
       </w:r>
       <w:r>
-        <w:t xml:space="preserve">The finding-detail screen (Figure 4.20) is the deepest and most important screen. It presents, in a single scroll, the finding's identity and metadata, its classification (with an override control), the</w:t>
+        <w:t xml:space="preserve">The finding-detail screen (Figure 4.24) is the deepest and most important screen. It presents, in a single scroll, the finding's identity and metadata, its classification (with an override control), the</w:t>
       </w:r>
       <w:r>
         <w:t xml:space="preserve"> </w:t>
@@ -3728,7 +3728,7 @@
     </w:p>
     <w:bookmarkEnd w:id="62"/>
     <w:bookmarkEnd w:id="63"/>
-    <w:bookmarkStart w:id="75" w:name="X91b3a7e34e6a6cb09e8dd74f95685ddbfe6f32d"/>
+    <w:bookmarkStart w:id="87" w:name="X91b3a7e34e6a6cb09e8dd74f95685ddbfe6f32d"/>
     <w:p>
       <w:pPr>
         <w:pStyle w:val="Heading2"/>
@@ -4259,7 +4259,7 @@
       </w:r>
     </w:p>
     <w:bookmarkEnd w:id="68"/>
-    <w:bookmarkStart w:id="69" w:name="X1f3e8fc82b78115a362ceb7c66825d5571239e9"/>
+    <w:bookmarkStart w:id="75" w:name="X1f3e8fc82b78115a362ceb7c66825d5571239e9"/>
     <w:p>
       <w:pPr>
         <w:pStyle w:val="Heading3"/>
@@ -4352,38 +4352,232 @@
         <w:t xml:space="preserve">An honest limitation is stated for completeness: the CVSS base score is a deterministic function of its sub-metrics, so this task is close to deterministic and the model is effectively relearning the CVSS scoring formula. The high accuracy is therefore legitimate (there is no leakage) but reflects the near-deterministic nature of the task. The genuinely novel analytical contribution of the project is not this prioritiser but the Confidence Engine described next, which predicts something CVSS cannot express — the probability that a finding is a true positive.</w:t>
       </w:r>
     </w:p>
-    <w:bookmarkEnd w:id="69"/>
-    <w:bookmarkStart w:id="73" w:name="X41ec9e93018ee17147604b600ccaf079d47cba3"/>
-    <w:p>
-      <w:pPr>
-        <w:pStyle w:val="Heading3"/>
-      </w:pPr>
-      <w:r>
-        <w:t xml:space="preserve">4.5.4 Confidence Scoring in Detail</w:t>
-      </w:r>
-    </w:p>
-    <w:p>
-      <w:pPr>
-        <w:pStyle w:val="FirstParagraph"/>
-      </w:pPr>
-      <w:r>
-        <w:t xml:space="preserve">The Confidence Engine is the system's central innovation. It answers a different question from severity:</w:t>
-      </w:r>
-      <w:r>
-        <w:t xml:space="preserve"> </w:t>
-      </w:r>
-      <w:r>
-        <w:rPr>
-          <w:b/>
-          <w:bCs/>
-        </w:rPr>
-        <w:t xml:space="preserve">how likely is it that this finding is a genuine, actionable vulnerability rather than noise?</w:t>
-      </w:r>
-      <w:r>
-        <w:t xml:space="preserve"> </w:t>
-      </w:r>
-      <w:r>
-        <w:t xml:space="preserve">It computes a weighted score from six</w:t>
+    <w:p>
+      <w:pPr>
+        <w:pStyle w:val="BodyText"/>
+      </w:pPr>
+      <w:r>
+        <w:t xml:space="preserve">Table 4.1 lists the tools and libraries used to build and run the model.</w:t>
+      </w:r>
+    </w:p>
+    <w:tbl>
+      <w:tblPr>
+        <w:tblStyle w:val="Table"/>
+        <w:tblW w:type="auto" w:w="0"/>
+        <w:tblLook w:firstRow="1" w:lastRow="0" w:firstColumn="0" w:lastColumn="0" w:noHBand="0" w:noVBand="0" w:val="0020"/>
+      </w:tblPr>
+      <w:tblGrid>
+        <w:gridCol w:w="2640"/>
+        <w:gridCol w:w="2640"/>
+        <w:gridCol w:w="2640"/>
+      </w:tblGrid>
+      <w:tr>
+        <w:trPr>
+          <w:tblHeader w:val="on"/>
+        </w:trPr>
+        <w:tc>
+          <w:tcPr/>
+          <w:p>
+            <w:pPr>
+              <w:pStyle w:val="Compact"/>
+            </w:pPr>
+            <w:r>
+              <w:t xml:space="preserve">Index</w:t>
+            </w:r>
+          </w:p>
+        </w:tc>
+        <w:tc>
+          <w:tcPr/>
+          <w:p>
+            <w:pPr>
+              <w:pStyle w:val="Compact"/>
+            </w:pPr>
+            <w:r>
+              <w:t xml:space="preserve">Tool / Library</w:t>
+            </w:r>
+          </w:p>
+        </w:tc>
+        <w:tc>
+          <w:tcPr/>
+          <w:p>
+            <w:pPr>
+              <w:pStyle w:val="Compact"/>
+            </w:pPr>
+            <w:r>
+              <w:t xml:space="preserve">Purpose</w:t>
+            </w:r>
+          </w:p>
+        </w:tc>
+      </w:tr>
+      <w:tr>
+        <w:tc>
+          <w:tcPr/>
+          <w:p>
+            <w:pPr>
+              <w:pStyle w:val="Compact"/>
+            </w:pPr>
+            <w:r>
+              <w:t xml:space="preserve">1</w:t>
+            </w:r>
+          </w:p>
+        </w:tc>
+        <w:tc>
+          <w:tcPr/>
+          <w:p>
+            <w:pPr>
+              <w:pStyle w:val="Compact"/>
+            </w:pPr>
+            <w:r>
+              <w:t xml:space="preserve">NumPy</w:t>
+            </w:r>
+          </w:p>
+        </w:tc>
+        <w:tc>
+          <w:tcPr/>
+          <w:p>
+            <w:pPr>
+              <w:pStyle w:val="Compact"/>
+            </w:pPr>
+            <w:r>
+              <w:t xml:space="preserve">Numerical arrays for the pure-Python Random Forest; the only dependency required at inference time.</w:t>
+            </w:r>
+          </w:p>
+        </w:tc>
+      </w:tr>
+      <w:tr>
+        <w:tc>
+          <w:tcPr/>
+          <w:p>
+            <w:pPr>
+              <w:pStyle w:val="Compact"/>
+            </w:pPr>
+            <w:r>
+              <w:t xml:space="preserve">2</w:t>
+            </w:r>
+          </w:p>
+        </w:tc>
+        <w:tc>
+          <w:tcPr/>
+          <w:p>
+            <w:pPr>
+              <w:pStyle w:val="Compact"/>
+            </w:pPr>
+            <w:r>
+              <w:t xml:space="preserve">scikit-learn</w:t>
+            </w:r>
+          </w:p>
+        </w:tc>
+        <w:tc>
+          <w:tcPr/>
+          <w:p>
+            <w:pPr>
+              <w:pStyle w:val="Compact"/>
+            </w:pPr>
+            <w:r>
+              <w:t xml:space="preserve">Used during training only, for the stratified train/test split and evaluation utilities.</w:t>
+            </w:r>
+          </w:p>
+        </w:tc>
+      </w:tr>
+      <w:tr>
+        <w:tc>
+          <w:tcPr/>
+          <w:p>
+            <w:pPr>
+              <w:pStyle w:val="Compact"/>
+            </w:pPr>
+            <w:r>
+              <w:t xml:space="preserve">3</w:t>
+            </w:r>
+          </w:p>
+        </w:tc>
+        <w:tc>
+          <w:tcPr/>
+          <w:p>
+            <w:pPr>
+              <w:pStyle w:val="Compact"/>
+            </w:pPr>
+            <w:r>
+              <w:t xml:space="preserve">ijson</w:t>
+            </w:r>
+          </w:p>
+        </w:tc>
+        <w:tc>
+          <w:tcPr/>
+          <w:p>
+            <w:pPr>
+              <w:pStyle w:val="Compact"/>
+            </w:pPr>
+            <w:r>
+              <w:t xml:space="preserve">Streams the compressed NVD JSON feeds with constant memory during training and enrichment.</w:t>
+            </w:r>
+          </w:p>
+        </w:tc>
+      </w:tr>
+      <w:tr>
+        <w:tc>
+          <w:tcPr/>
+          <w:p>
+            <w:pPr>
+              <w:pStyle w:val="Compact"/>
+            </w:pPr>
+            <w:r>
+              <w:t xml:space="preserve">4</w:t>
+            </w:r>
+          </w:p>
+        </w:tc>
+        <w:tc>
+          <w:tcPr/>
+          <w:p>
+            <w:pPr>
+              <w:pStyle w:val="Compact"/>
+            </w:pPr>
+            <w:r>
+              <w:t xml:space="preserve">NVD JSON 2.0 feeds</w:t>
+            </w:r>
+          </w:p>
+        </w:tc>
+        <w:tc>
+          <w:tcPr/>
+          <w:p>
+            <w:pPr>
+              <w:pStyle w:val="Compact"/>
+            </w:pPr>
+            <w:r>
+              <w:t xml:space="preserve">The 108,495-record real-world training corpus (CVSS-v3 vectors + CWE, for 2023–2025).</w:t>
+            </w:r>
+          </w:p>
+        </w:tc>
+      </w:tr>
+    </w:tbl>
+    <w:p>
+      <w:pPr>
+        <w:pStyle w:val="BodyText"/>
+      </w:pPr>
+      <w:r>
+        <w:rPr>
+          <w:b/>
+          <w:bCs/>
+        </w:rPr>
+        <w:t xml:space="preserve">Table 4.1: Machine-Learning Component — Tools and Libraries</w:t>
+      </w:r>
+    </w:p>
+    <w:p>
+      <w:pPr>
+        <w:pStyle w:val="BodyText"/>
+      </w:pPr>
+      <w:r>
+        <w:rPr>
+          <w:b/>
+          <w:bCs/>
+        </w:rPr>
+        <w:t xml:space="preserve">Feature definition and the anti-leakage decision.</w:t>
+      </w:r>
+      <w:r>
+        <w:t xml:space="preserve"> </w:t>
+      </w:r>
+      <w:r>
+        <w:t xml:space="preserve">The single most important design decision in the model concerns</w:t>
       </w:r>
       <w:r>
         <w:t xml:space="preserve"> </w:t>
@@ -4393,52 +4587,22 @@
           <w:i/>
           <w:iCs/>
         </w:rPr>
-        <w:t xml:space="preserve">reliability</w:t>
-      </w:r>
-      <w:r>
-        <w:t xml:space="preserve"> </w:t>
-      </w:r>
-      <w:r>
-        <w:t xml:space="preserve">factors, whose weights sum to 100: scanner agreement (25), severity consistency (20), CVE availability (15), exploit availability (15), PoC validation (15), and CWE mapping (10). The resulting 0–100 score is classified as</w:t>
-      </w:r>
-      <w:r>
-        <w:t xml:space="preserve"> </w:t>
-      </w:r>
-      <w:r>
-        <w:rPr>
-          <w:b/>
-          <w:bCs/>
-        </w:rPr>
-        <w:t xml:space="preserve">Confirmed (≥70)</w:t>
-      </w:r>
-      <w:r>
-        <w:t xml:space="preserve">,</w:t>
-      </w:r>
-      <w:r>
-        <w:t xml:space="preserve"> </w:t>
-      </w:r>
-      <w:r>
-        <w:rPr>
-          <w:b/>
-          <w:bCs/>
-        </w:rPr>
-        <w:t xml:space="preserve">Needs Manual Verification (40–69)</w:t>
-      </w:r>
-      <w:r>
-        <w:t xml:space="preserve">, or</w:t>
-      </w:r>
-      <w:r>
-        <w:t xml:space="preserve"> </w:t>
-      </w:r>
-      <w:r>
-        <w:rPr>
-          <w:b/>
-          <w:bCs/>
-        </w:rPr>
-        <w:t xml:space="preserve">Not Confirmed (&lt;40)</w:t>
-      </w:r>
-      <w:r>
-        <w:t xml:space="preserve">; independently, a confirmed proof-of-concept check overrides the classification to</w:t>
+        <w:t xml:space="preserve">which inputs it is permitted to see</w:t>
+      </w:r>
+      <w:r>
+        <w:t xml:space="preserve">. Figure 4.13 shows the feature definition in</w:t>
+      </w:r>
+      <w:r>
+        <w:t xml:space="preserve"> </w:t>
+      </w:r>
+      <w:r>
+        <w:rPr>
+          <w:rStyle w:val="VerbatimChar"/>
+        </w:rPr>
+        <w:t xml:space="preserve">predictor.py</w:t>
+      </w:r>
+      <w:r>
+        <w:t xml:space="preserve">. The model is given the eight CVSS v3 sub-metrics (attack vector, attack complexity, privileges required, user interaction, scope, and the three impact metrics) together with the numeric CWE identifier — nine features in total — but it is deliberately</w:t>
       </w:r>
       <w:r>
         <w:t xml:space="preserve"> </w:t>
@@ -4448,18 +4612,29 @@
           <w:i/>
           <w:iCs/>
         </w:rPr>
-        <w:t xml:space="preserve">Confirmed</w:t>
-      </w:r>
-      <w:r>
-        <w:t xml:space="preserve">.</w:t>
-      </w:r>
-    </w:p>
-    <w:p>
-      <w:pPr>
-        <w:pStyle w:val="BodyText"/>
-      </w:pPr>
-      <w:r>
-        <w:t xml:space="preserve">Figure 4.13 shows the confidence panel from the interface for a confirmed SQL-injection finding, which makes the computation concrete.</w:t>
+        <w:t xml:space="preserve">not</w:t>
+      </w:r>
+      <w:r>
+        <w:t xml:space="preserve"> </w:t>
+      </w:r>
+      <w:r>
+        <w:t xml:space="preserve">given the CVSS base score. The inline comment records the reason: because the training label (the severity band) is itself derived from the base score, feeding the score back in as an input would constitute</w:t>
+      </w:r>
+      <w:r>
+        <w:t xml:space="preserve"> </w:t>
+      </w:r>
+      <w:r>
+        <w:rPr>
+          <w:i/>
+          <w:iCs/>
+        </w:rPr>
+        <w:t xml:space="preserve">target leakage</w:t>
+      </w:r>
+      <w:r>
+        <w:t xml:space="preserve"> </w:t>
+      </w:r>
+      <w:r>
+        <w:t xml:space="preserve">and would let the model trivially reproduce the label, yielding a meaningless near-perfect accuracy. Excluding it forces the model to learn the relationship between the underlying vector components and the severity band, which is the genuine learning task.</w:t>
       </w:r>
     </w:p>
     <w:p>
@@ -4469,20 +4644,895 @@
       <w:r>
         <w:drawing>
           <wp:inline>
-            <wp:extent cx="5334000" cy="3036093"/>
+            <wp:extent cx="5334000" cy="1942011"/>
             <wp:effectExtent b="0" l="0" r="0" t="0"/>
-            <wp:docPr descr="Confidence-score breakdown panel" title="" id="71" name="Picture"/>
+            <wp:docPr descr="Feature definition excluding the CVSS base score" title="" id="70" name="Picture"/>
             <a:graphic>
               <a:graphicData uri="http://schemas.openxmlformats.org/drawingml/2006/picture">
                 <pic:pic>
                   <pic:nvPicPr>
-                    <pic:cNvPr descr="images/11-confidence-panel.png" id="72" name="Picture"/>
+                    <pic:cNvPr descr="images/code-ml-features.png" id="71" name="Picture"/>
                     <pic:cNvPicPr>
                       <a:picLocks noChangeArrowheads="1" noChangeAspect="1"/>
                     </pic:cNvPicPr>
                   </pic:nvPicPr>
                   <pic:blipFill>
-                    <a:blip r:embed="rId70"/>
+                    <a:blip r:embed="rId69"/>
+                    <a:stretch>
+                      <a:fillRect/>
+                    </a:stretch>
+                  </pic:blipFill>
+                  <pic:spPr bwMode="auto">
+                    <a:xfrm>
+                      <a:off x="0" y="0"/>
+                      <a:ext cx="5334000" cy="1942011"/>
+                    </a:xfrm>
+                    <a:prstGeom prst="rect">
+                      <a:avLst/>
+                    </a:prstGeom>
+                    <a:noFill/>
+                    <a:ln w="9525">
+                      <a:noFill/>
+                      <a:headEnd/>
+                      <a:tailEnd/>
+                    </a:ln>
+                  </pic:spPr>
+                </pic:pic>
+              </a:graphicData>
+            </a:graphic>
+          </wp:inline>
+        </w:drawing>
+      </w:r>
+    </w:p>
+    <w:p>
+      <w:pPr>
+        <w:pStyle w:val="BodyText"/>
+      </w:pPr>
+      <w:r>
+        <w:rPr>
+          <w:b/>
+          <w:bCs/>
+        </w:rPr>
+        <w:t xml:space="preserve">Figure 4.13: Feature Definition (predictor.py) — the CVSS base score is deliberately excluded to prevent target leakage</w:t>
+      </w:r>
+    </w:p>
+    <w:p>
+      <w:pPr>
+        <w:pStyle w:val="BodyText"/>
+      </w:pPr>
+      <w:r>
+        <w:rPr>
+          <w:b/>
+          <w:bCs/>
+        </w:rPr>
+        <w:t xml:space="preserve">Feature extraction and inference.</w:t>
+      </w:r>
+      <w:r>
+        <w:t xml:space="preserve"> </w:t>
+      </w:r>
+      <w:r>
+        <w:t xml:space="preserve">Figure 4.14 shows how a stored finding is converted into a feature vector and classified. The</w:t>
+      </w:r>
+      <w:r>
+        <w:t xml:space="preserve"> </w:t>
+      </w:r>
+      <w:r>
+        <w:rPr>
+          <w:rStyle w:val="VerbatimChar"/>
+        </w:rPr>
+        <w:t xml:space="preserve">_build_feature_vector</w:t>
+      </w:r>
+      <w:r>
+        <w:t xml:space="preserve"> </w:t>
+      </w:r>
+      <w:r>
+        <w:t xml:space="preserve">method encodes each categorical CVSS sub-metric into an integer using a fixed mapping and extracts the numeric part of the CWE identifier; if the structured CWE is missing, it falls back to a keyword lookup on the finding's title and description, so that even a bare web finding yields usable features rather than an all-zero vector. The</w:t>
+      </w:r>
+      <w:r>
+        <w:t xml:space="preserve"> </w:t>
+      </w:r>
+      <w:r>
+        <w:rPr>
+          <w:rStyle w:val="VerbatimChar"/>
+        </w:rPr>
+        <w:t xml:space="preserve">predict_finding</w:t>
+      </w:r>
+      <w:r>
+        <w:t xml:space="preserve"> </w:t>
+      </w:r>
+      <w:r>
+        <w:t xml:space="preserve">method then loads the serialised model once, wraps the feature vector in a NumPy array, and calls the forest's</w:t>
+      </w:r>
+      <w:r>
+        <w:t xml:space="preserve"> </w:t>
+      </w:r>
+      <w:r>
+        <w:rPr>
+          <w:rStyle w:val="VerbatimChar"/>
+        </w:rPr>
+        <w:t xml:space="preserve">predict</w:t>
+      </w:r>
+      <w:r>
+        <w:t xml:space="preserve"> </w:t>
+      </w:r>
+      <w:r>
+        <w:t xml:space="preserve">and</w:t>
+      </w:r>
+      <w:r>
+        <w:t xml:space="preserve"> </w:t>
+      </w:r>
+      <w:r>
+        <w:rPr>
+          <w:rStyle w:val="VerbatimChar"/>
+        </w:rPr>
+        <w:t xml:space="preserve">predict_proba</w:t>
+      </w:r>
+      <w:r>
+        <w:t xml:space="preserve"> </w:t>
+      </w:r>
+      <w:r>
+        <w:t xml:space="preserve">methods to obtain both the predicted severity band and the per-class probabilities. The probabilities are persisted alongside the prediction so that the interface can display the model's confidence in each band, as seen in the "ML Priority Prediction" panel of the finding-detail screen (Figure 4.24).</w:t>
+      </w:r>
+    </w:p>
+    <w:p>
+      <w:pPr>
+        <w:pStyle w:val="BodyText"/>
+      </w:pPr>
+      <w:r>
+        <w:drawing>
+          <wp:inline>
+            <wp:extent cx="5334000" cy="4375870"/>
+            <wp:effectExtent b="0" l="0" r="0" t="0"/>
+            <wp:docPr descr="Feature extraction and prediction" title="" id="73" name="Picture"/>
+            <a:graphic>
+              <a:graphicData uri="http://schemas.openxmlformats.org/drawingml/2006/picture">
+                <pic:pic>
+                  <pic:nvPicPr>
+                    <pic:cNvPr descr="images/code-ml-inference.png" id="74" name="Picture"/>
+                    <pic:cNvPicPr>
+                      <a:picLocks noChangeArrowheads="1" noChangeAspect="1"/>
+                    </pic:cNvPicPr>
+                  </pic:nvPicPr>
+                  <pic:blipFill>
+                    <a:blip r:embed="rId72"/>
+                    <a:stretch>
+                      <a:fillRect/>
+                    </a:stretch>
+                  </pic:blipFill>
+                  <pic:spPr bwMode="auto">
+                    <a:xfrm>
+                      <a:off x="0" y="0"/>
+                      <a:ext cx="5334000" cy="4375870"/>
+                    </a:xfrm>
+                    <a:prstGeom prst="rect">
+                      <a:avLst/>
+                    </a:prstGeom>
+                    <a:noFill/>
+                    <a:ln w="9525">
+                      <a:noFill/>
+                      <a:headEnd/>
+                      <a:tailEnd/>
+                    </a:ln>
+                  </pic:spPr>
+                </pic:pic>
+              </a:graphicData>
+            </a:graphic>
+          </wp:inline>
+        </w:drawing>
+      </w:r>
+    </w:p>
+    <w:p>
+      <w:pPr>
+        <w:pStyle w:val="BodyText"/>
+      </w:pPr>
+      <w:r>
+        <w:rPr>
+          <w:b/>
+          <w:bCs/>
+        </w:rPr>
+        <w:t xml:space="preserve">Figure 4.14: Feature Extraction and Prediction (predictor.py)</w:t>
+      </w:r>
+    </w:p>
+    <w:bookmarkEnd w:id="75"/>
+    <w:bookmarkStart w:id="85" w:name="X41ec9e93018ee17147604b600ccaf079d47cba3"/>
+    <w:p>
+      <w:pPr>
+        <w:pStyle w:val="Heading3"/>
+      </w:pPr>
+      <w:r>
+        <w:t xml:space="preserve">4.5.4 Confidence Scoring in Detail</w:t>
+      </w:r>
+    </w:p>
+    <w:p>
+      <w:pPr>
+        <w:pStyle w:val="FirstParagraph"/>
+      </w:pPr>
+      <w:r>
+        <w:t xml:space="preserve">The Confidence Engine is the system's central innovation. It answers a different question from severity:</w:t>
+      </w:r>
+      <w:r>
+        <w:t xml:space="preserve"> </w:t>
+      </w:r>
+      <w:r>
+        <w:rPr>
+          <w:b/>
+          <w:bCs/>
+        </w:rPr>
+        <w:t xml:space="preserve">how likely is it that this finding is a genuine, actionable vulnerability rather than noise?</w:t>
+      </w:r>
+      <w:r>
+        <w:t xml:space="preserve"> </w:t>
+      </w:r>
+      <w:r>
+        <w:t xml:space="preserve">It computes a weighted score from six</w:t>
+      </w:r>
+      <w:r>
+        <w:t xml:space="preserve"> </w:t>
+      </w:r>
+      <w:r>
+        <w:rPr>
+          <w:i/>
+          <w:iCs/>
+        </w:rPr>
+        <w:t xml:space="preserve">reliability</w:t>
+      </w:r>
+      <w:r>
+        <w:t xml:space="preserve"> </w:t>
+      </w:r>
+      <w:r>
+        <w:t xml:space="preserve">factors, whose weights sum to 100. Table 4.2 lists the factors, their weights, and what each measures.</w:t>
+      </w:r>
+    </w:p>
+    <w:tbl>
+      <w:tblPr>
+        <w:tblStyle w:val="Table"/>
+        <w:tblW w:type="auto" w:w="0"/>
+        <w:tblLook w:firstRow="1" w:lastRow="0" w:firstColumn="0" w:lastColumn="0" w:noHBand="0" w:noVBand="0" w:val="0020"/>
+      </w:tblPr>
+      <w:tblGrid>
+        <w:gridCol w:w="2640"/>
+        <w:gridCol w:w="2640"/>
+        <w:gridCol w:w="2640"/>
+      </w:tblGrid>
+      <w:tr>
+        <w:trPr>
+          <w:tblHeader w:val="on"/>
+        </w:trPr>
+        <w:tc>
+          <w:tcPr/>
+          <w:p>
+            <w:pPr>
+              <w:pStyle w:val="Compact"/>
+            </w:pPr>
+            <w:r>
+              <w:t xml:space="preserve">Factor</w:t>
+            </w:r>
+          </w:p>
+        </w:tc>
+        <w:tc>
+          <w:tcPr/>
+          <w:p>
+            <w:pPr>
+              <w:pStyle w:val="Compact"/>
+              <w:jc w:val="center"/>
+            </w:pPr>
+            <w:r>
+              <w:t xml:space="preserve">Weight</w:t>
+            </w:r>
+          </w:p>
+        </w:tc>
+        <w:tc>
+          <w:tcPr/>
+          <w:p>
+            <w:pPr>
+              <w:pStyle w:val="Compact"/>
+            </w:pPr>
+            <w:r>
+              <w:t xml:space="preserve">What it measures</w:t>
+            </w:r>
+          </w:p>
+        </w:tc>
+      </w:tr>
+      <w:tr>
+        <w:tc>
+          <w:tcPr/>
+          <w:p>
+            <w:pPr>
+              <w:pStyle w:val="Compact"/>
+            </w:pPr>
+            <w:r>
+              <w:t xml:space="preserve">Scanner agreement</w:t>
+            </w:r>
+          </w:p>
+        </w:tc>
+        <w:tc>
+          <w:tcPr/>
+          <w:p>
+            <w:pPr>
+              <w:pStyle w:val="Compact"/>
+              <w:jc w:val="center"/>
+            </w:pPr>
+            <w:r>
+              <w:t xml:space="preserve">25</w:t>
+            </w:r>
+          </w:p>
+        </w:tc>
+        <w:tc>
+          <w:tcPr/>
+          <w:p>
+            <w:pPr>
+              <w:pStyle w:val="Compact"/>
+            </w:pPr>
+            <w:r>
+              <w:t xml:space="preserve">Independent corroboration — how many separate tools flagged the same issue.</w:t>
+            </w:r>
+          </w:p>
+        </w:tc>
+      </w:tr>
+      <w:tr>
+        <w:tc>
+          <w:tcPr/>
+          <w:p>
+            <w:pPr>
+              <w:pStyle w:val="Compact"/>
+            </w:pPr>
+            <w:r>
+              <w:t xml:space="preserve">Severity consistency</w:t>
+            </w:r>
+          </w:p>
+        </w:tc>
+        <w:tc>
+          <w:tcPr/>
+          <w:p>
+            <w:pPr>
+              <w:pStyle w:val="Compact"/>
+              <w:jc w:val="center"/>
+            </w:pPr>
+            <w:r>
+              <w:t xml:space="preserve">20</w:t>
+            </w:r>
+          </w:p>
+        </w:tc>
+        <w:tc>
+          <w:tcPr/>
+          <w:p>
+            <w:pPr>
+              <w:pStyle w:val="Compact"/>
+            </w:pPr>
+            <w:r>
+              <w:t xml:space="preserve">Whether the ML-predicted severity agrees with the scanner's reported severity.</w:t>
+            </w:r>
+          </w:p>
+        </w:tc>
+      </w:tr>
+      <w:tr>
+        <w:tc>
+          <w:tcPr/>
+          <w:p>
+            <w:pPr>
+              <w:pStyle w:val="Compact"/>
+            </w:pPr>
+            <w:r>
+              <w:t xml:space="preserve">CVE availability</w:t>
+            </w:r>
+          </w:p>
+        </w:tc>
+        <w:tc>
+          <w:tcPr/>
+          <w:p>
+            <w:pPr>
+              <w:pStyle w:val="Compact"/>
+              <w:jc w:val="center"/>
+            </w:pPr>
+            <w:r>
+              <w:t xml:space="preserve">15</w:t>
+            </w:r>
+          </w:p>
+        </w:tc>
+        <w:tc>
+          <w:tcPr/>
+          <w:p>
+            <w:pPr>
+              <w:pStyle w:val="Compact"/>
+            </w:pPr>
+            <w:r>
+              <w:t xml:space="preserve">Whether the finding maps to a catalogued CVE.</w:t>
+            </w:r>
+          </w:p>
+        </w:tc>
+      </w:tr>
+      <w:tr>
+        <w:tc>
+          <w:tcPr/>
+          <w:p>
+            <w:pPr>
+              <w:pStyle w:val="Compact"/>
+            </w:pPr>
+            <w:r>
+              <w:t xml:space="preserve">Exploit availability</w:t>
+            </w:r>
+          </w:p>
+        </w:tc>
+        <w:tc>
+          <w:tcPr/>
+          <w:p>
+            <w:pPr>
+              <w:pStyle w:val="Compact"/>
+              <w:jc w:val="center"/>
+            </w:pPr>
+            <w:r>
+              <w:t xml:space="preserve">15</w:t>
+            </w:r>
+          </w:p>
+        </w:tc>
+        <w:tc>
+          <w:tcPr/>
+          <w:p>
+            <w:pPr>
+              <w:pStyle w:val="Compact"/>
+            </w:pPr>
+            <w:r>
+              <w:t xml:space="preserve">Whether a public exploit exists for the issue (via Exploit-DB).</w:t>
+            </w:r>
+          </w:p>
+        </w:tc>
+      </w:tr>
+      <w:tr>
+        <w:tc>
+          <w:tcPr/>
+          <w:p>
+            <w:pPr>
+              <w:pStyle w:val="Compact"/>
+            </w:pPr>
+            <w:r>
+              <w:t xml:space="preserve">PoC validation</w:t>
+            </w:r>
+          </w:p>
+        </w:tc>
+        <w:tc>
+          <w:tcPr/>
+          <w:p>
+            <w:pPr>
+              <w:pStyle w:val="Compact"/>
+              <w:jc w:val="center"/>
+            </w:pPr>
+            <w:r>
+              <w:t xml:space="preserve">15</w:t>
+            </w:r>
+          </w:p>
+        </w:tc>
+        <w:tc>
+          <w:tcPr/>
+          <w:p>
+            <w:pPr>
+              <w:pStyle w:val="Compact"/>
+            </w:pPr>
+            <w:r>
+              <w:t xml:space="preserve">Whether an active, non-destructive check confirmed the issue.</w:t>
+            </w:r>
+          </w:p>
+        </w:tc>
+      </w:tr>
+      <w:tr>
+        <w:tc>
+          <w:tcPr/>
+          <w:p>
+            <w:pPr>
+              <w:pStyle w:val="Compact"/>
+            </w:pPr>
+            <w:r>
+              <w:t xml:space="preserve">CWE mapping</w:t>
+            </w:r>
+          </w:p>
+        </w:tc>
+        <w:tc>
+          <w:tcPr/>
+          <w:p>
+            <w:pPr>
+              <w:pStyle w:val="Compact"/>
+              <w:jc w:val="center"/>
+            </w:pPr>
+            <w:r>
+              <w:t xml:space="preserve">10</w:t>
+            </w:r>
+          </w:p>
+        </w:tc>
+        <w:tc>
+          <w:tcPr/>
+          <w:p>
+            <w:pPr>
+              <w:pStyle w:val="Compact"/>
+            </w:pPr>
+            <w:r>
+              <w:t xml:space="preserve">Whether the finding has a recognised weakness class.</w:t>
+            </w:r>
+          </w:p>
+        </w:tc>
+      </w:tr>
+    </w:tbl>
+    <w:p>
+      <w:pPr>
+        <w:pStyle w:val="BodyText"/>
+      </w:pPr>
+      <w:r>
+        <w:rPr>
+          <w:b/>
+          <w:bCs/>
+        </w:rPr>
+        <w:t xml:space="preserve">Table 4.2: Confidence Engine — Factors and Weights</w:t>
+      </w:r>
+    </w:p>
+    <w:p>
+      <w:pPr>
+        <w:pStyle w:val="BodyText"/>
+      </w:pPr>
+      <w:r>
+        <w:t xml:space="preserve">The resulting 0–100 score is classified as</w:t>
+      </w:r>
+      <w:r>
+        <w:t xml:space="preserve"> </w:t>
+      </w:r>
+      <w:r>
+        <w:rPr>
+          <w:b/>
+          <w:bCs/>
+        </w:rPr>
+        <w:t xml:space="preserve">Confirmed (≥70)</w:t>
+      </w:r>
+      <w:r>
+        <w:t xml:space="preserve">,</w:t>
+      </w:r>
+      <w:r>
+        <w:t xml:space="preserve"> </w:t>
+      </w:r>
+      <w:r>
+        <w:rPr>
+          <w:b/>
+          <w:bCs/>
+        </w:rPr>
+        <w:t xml:space="preserve">Needs Manual Verification (40–69)</w:t>
+      </w:r>
+      <w:r>
+        <w:t xml:space="preserve">, or</w:t>
+      </w:r>
+      <w:r>
+        <w:t xml:space="preserve"> </w:t>
+      </w:r>
+      <w:r>
+        <w:rPr>
+          <w:b/>
+          <w:bCs/>
+        </w:rPr>
+        <w:t xml:space="preserve">Not Confirmed (&lt;40)</w:t>
+      </w:r>
+      <w:r>
+        <w:t xml:space="preserve">; independently, a confirmed proof-of-concept check overrides the classification to</w:t>
+      </w:r>
+      <w:r>
+        <w:t xml:space="preserve"> </w:t>
+      </w:r>
+      <w:r>
+        <w:rPr>
+          <w:i/>
+          <w:iCs/>
+        </w:rPr>
+        <w:t xml:space="preserve">Confirmed</w:t>
+      </w:r>
+      <w:r>
+        <w:t xml:space="preserve">.</w:t>
+      </w:r>
+    </w:p>
+    <w:p>
+      <w:pPr>
+        <w:pStyle w:val="BodyText"/>
+      </w:pPr>
+      <w:r>
+        <w:rPr>
+          <w:b/>
+          <w:bCs/>
+        </w:rPr>
+        <w:t xml:space="preserve">The scoring computation.</w:t>
+      </w:r>
+      <w:r>
+        <w:t xml:space="preserve"> </w:t>
+      </w:r>
+      <w:r>
+        <w:t xml:space="preserve">Figure 4.15 shows the core of the scoring method. Each factor returns a raw score in the range 0–100; the total is the weighted sum of those raw scores (each divided by 100 and multiplied by its weight), capped to the 0–100 range. Two overrides then apply. First, if any</w:t>
+      </w:r>
+      <w:r>
+        <w:t xml:space="preserve"> </w:t>
+      </w:r>
+      <w:r>
+        <w:rPr>
+          <w:i/>
+          <w:iCs/>
+        </w:rPr>
+        <w:t xml:space="preserve">strong, vulnerability-specific</w:t>
+      </w:r>
+      <w:r>
+        <w:t xml:space="preserve"> </w:t>
+      </w:r>
+      <w:r>
+        <w:t xml:space="preserve">proof-of-concept check confirmed the finding, the classification is forced to</w:t>
+      </w:r>
+      <w:r>
+        <w:t xml:space="preserve"> </w:t>
+      </w:r>
+      <w:r>
+        <w:rPr>
+          <w:i/>
+          <w:iCs/>
+        </w:rPr>
+        <w:t xml:space="preserve">Confirmed</w:t>
+      </w:r>
+      <w:r>
+        <w:t xml:space="preserve"> </w:t>
+      </w:r>
+      <w:r>
+        <w:t xml:space="preserve">and the score is rescaled into the 70–100 band — but note the deliberate restriction to strong, type-matched check types, so that a generic input reflection or a server-banner match cannot spuriously confirm a finding. Second, a scanner-rated</w:t>
+      </w:r>
+      <w:r>
+        <w:t xml:space="preserve"> </w:t>
+      </w:r>
+      <w:r>
+        <w:rPr>
+          <w:i/>
+          <w:iCs/>
+        </w:rPr>
+        <w:t xml:space="preserve">informational</w:t>
+      </w:r>
+      <w:r>
+        <w:t xml:space="preserve"> </w:t>
+      </w:r>
+      <w:r>
+        <w:t xml:space="preserve">finding is bucketed as "Informational" rather than being given a true-or-false verdict, because such findings (technology or version detection) are not vulnerabilities to confirm or deny. Otherwise the numeric score is mapped to a classification by the threshold function.</w:t>
+      </w:r>
+    </w:p>
+    <w:p>
+      <w:pPr>
+        <w:pStyle w:val="BodyText"/>
+      </w:pPr>
+      <w:r>
+        <w:drawing>
+          <wp:inline>
+            <wp:extent cx="5334000" cy="3604666"/>
+            <wp:effectExtent b="0" l="0" r="0" t="0"/>
+            <wp:docPr descr="Weighted scoring, PoC override, and classification" title="" id="77" name="Picture"/>
+            <a:graphic>
+              <a:graphicData uri="http://schemas.openxmlformats.org/drawingml/2006/picture">
+                <pic:pic>
+                  <pic:nvPicPr>
+                    <pic:cNvPr descr="images/code-confidence-score.png" id="78" name="Picture"/>
+                    <pic:cNvPicPr>
+                      <a:picLocks noChangeArrowheads="1" noChangeAspect="1"/>
+                    </pic:cNvPicPr>
+                  </pic:nvPicPr>
+                  <pic:blipFill>
+                    <a:blip r:embed="rId76"/>
+                    <a:stretch>
+                      <a:fillRect/>
+                    </a:stretch>
+                  </pic:blipFill>
+                  <pic:spPr bwMode="auto">
+                    <a:xfrm>
+                      <a:off x="0" y="0"/>
+                      <a:ext cx="5334000" cy="3604666"/>
+                    </a:xfrm>
+                    <a:prstGeom prst="rect">
+                      <a:avLst/>
+                    </a:prstGeom>
+                    <a:noFill/>
+                    <a:ln w="9525">
+                      <a:noFill/>
+                      <a:headEnd/>
+                      <a:tailEnd/>
+                    </a:ln>
+                  </pic:spPr>
+                </pic:pic>
+              </a:graphicData>
+            </a:graphic>
+          </wp:inline>
+        </w:drawing>
+      </w:r>
+    </w:p>
+    <w:p>
+      <w:pPr>
+        <w:pStyle w:val="BodyText"/>
+      </w:pPr>
+      <w:r>
+        <w:rPr>
+          <w:b/>
+          <w:bCs/>
+        </w:rPr>
+        <w:t xml:space="preserve">Figure 4.15: Confidence Scoring — Weights, Weighted Sum, and Overrides (confidence_engine.py)</w:t>
+      </w:r>
+    </w:p>
+    <w:p>
+      <w:pPr>
+        <w:pStyle w:val="BodyText"/>
+      </w:pPr>
+      <w:r>
+        <w:rPr>
+          <w:b/>
+          <w:bCs/>
+        </w:rPr>
+        <w:t xml:space="preserve">How individual factors are computed.</w:t>
+      </w:r>
+      <w:r>
+        <w:t xml:space="preserve"> </w:t>
+      </w:r>
+      <w:r>
+        <w:t xml:space="preserve">Figure 4.16 shows two representative factor methods together with the classification-threshold function. The scanner-agreement factor scales with the number of corroborating scanners — a single scanner scores partially, whereas two or more score highly — and it returns a human-readable</w:t>
+      </w:r>
+      <w:r>
+        <w:t xml:space="preserve"> </w:t>
+      </w:r>
+      <w:r>
+        <w:rPr>
+          <w:i/>
+          <w:iCs/>
+        </w:rPr>
+        <w:t xml:space="preserve">reason</w:t>
+      </w:r>
+      <w:r>
+        <w:t xml:space="preserve"> </w:t>
+      </w:r>
+      <w:r>
+        <w:t xml:space="preserve">string that becomes part of the finding's rationale. The CVE-availability factor is binary on the presence of a catalogued CVE. The</w:t>
+      </w:r>
+      <w:r>
+        <w:t xml:space="preserve"> </w:t>
+      </w:r>
+      <w:r>
+        <w:rPr>
+          <w:rStyle w:val="VerbatimChar"/>
+        </w:rPr>
+        <w:t xml:space="preserve">_classify</w:t>
+      </w:r>
+      <w:r>
+        <w:t xml:space="preserve"> </w:t>
+      </w:r>
+      <w:r>
+        <w:t xml:space="preserve">function applies the fixed thresholds — 70 and 40 — that separate</w:t>
+      </w:r>
+      <w:r>
+        <w:t xml:space="preserve"> </w:t>
+      </w:r>
+      <w:r>
+        <w:rPr>
+          <w:i/>
+          <w:iCs/>
+        </w:rPr>
+        <w:t xml:space="preserve">Confirmed</w:t>
+      </w:r>
+      <w:r>
+        <w:t xml:space="preserve">,</w:t>
+      </w:r>
+      <w:r>
+        <w:t xml:space="preserve"> </w:t>
+      </w:r>
+      <w:r>
+        <w:rPr>
+          <w:i/>
+          <w:iCs/>
+        </w:rPr>
+        <w:t xml:space="preserve">Needs Manual Verification</w:t>
+      </w:r>
+      <w:r>
+        <w:t xml:space="preserve">, and</w:t>
+      </w:r>
+      <w:r>
+        <w:t xml:space="preserve"> </w:t>
+      </w:r>
+      <w:r>
+        <w:rPr>
+          <w:i/>
+          <w:iCs/>
+        </w:rPr>
+        <w:t xml:space="preserve">Not Confirmed</w:t>
+      </w:r>
+      <w:r>
+        <w:t xml:space="preserve">. Because every factor returns both a raw score and a reason, the final verdict is fully explainable rather than a black-box number.</w:t>
+      </w:r>
+    </w:p>
+    <w:p>
+      <w:pPr>
+        <w:pStyle w:val="BodyText"/>
+      </w:pPr>
+      <w:r>
+        <w:drawing>
+          <wp:inline>
+            <wp:extent cx="5334000" cy="3200400"/>
+            <wp:effectExtent b="0" l="0" r="0" t="0"/>
+            <wp:docPr descr="Example factor computations and the classification thresholds" title="" id="80" name="Picture"/>
+            <a:graphic>
+              <a:graphicData uri="http://schemas.openxmlformats.org/drawingml/2006/picture">
+                <pic:pic>
+                  <pic:nvPicPr>
+                    <pic:cNvPr descr="images/code-confidence-factor.png" id="81" name="Picture"/>
+                    <pic:cNvPicPr>
+                      <a:picLocks noChangeArrowheads="1" noChangeAspect="1"/>
+                    </pic:cNvPicPr>
+                  </pic:nvPicPr>
+                  <pic:blipFill>
+                    <a:blip r:embed="rId79"/>
+                    <a:stretch>
+                      <a:fillRect/>
+                    </a:stretch>
+                  </pic:blipFill>
+                  <pic:spPr bwMode="auto">
+                    <a:xfrm>
+                      <a:off x="0" y="0"/>
+                      <a:ext cx="5334000" cy="3200400"/>
+                    </a:xfrm>
+                    <a:prstGeom prst="rect">
+                      <a:avLst/>
+                    </a:prstGeom>
+                    <a:noFill/>
+                    <a:ln w="9525">
+                      <a:noFill/>
+                      <a:headEnd/>
+                      <a:tailEnd/>
+                    </a:ln>
+                  </pic:spPr>
+                </pic:pic>
+              </a:graphicData>
+            </a:graphic>
+          </wp:inline>
+        </w:drawing>
+      </w:r>
+    </w:p>
+    <w:p>
+      <w:pPr>
+        <w:pStyle w:val="BodyText"/>
+      </w:pPr>
+      <w:r>
+        <w:rPr>
+          <w:b/>
+          <w:bCs/>
+        </w:rPr>
+        <w:t xml:space="preserve">Figure 4.16: Example Factor Computations and Classification Thresholds (confidence_engine.py)</w:t>
+      </w:r>
+    </w:p>
+    <w:p>
+      <w:pPr>
+        <w:pStyle w:val="BodyText"/>
+      </w:pPr>
+      <w:r>
+        <w:rPr>
+          <w:b/>
+          <w:bCs/>
+        </w:rPr>
+        <w:t xml:space="preserve">A worked example.</w:t>
+      </w:r>
+      <w:r>
+        <w:t xml:space="preserve"> </w:t>
+      </w:r>
+      <w:r>
+        <w:t xml:space="preserve">Figure 4.17 shows the confidence panel from the interface for a confirmed SQL-injection finding, which makes the computation concrete.</w:t>
+      </w:r>
+    </w:p>
+    <w:p>
+      <w:pPr>
+        <w:pStyle w:val="BodyText"/>
+      </w:pPr>
+      <w:r>
+        <w:drawing>
+          <wp:inline>
+            <wp:extent cx="5334000" cy="3036093"/>
+            <wp:effectExtent b="0" l="0" r="0" t="0"/>
+            <wp:docPr descr="Confidence-score breakdown panel" title="" id="83" name="Picture"/>
+            <a:graphic>
+              <a:graphicData uri="http://schemas.openxmlformats.org/drawingml/2006/picture">
+                <pic:pic>
+                  <pic:nvPicPr>
+                    <pic:cNvPr descr="images/11-confidence-panel.png" id="84" name="Picture"/>
+                    <pic:cNvPicPr>
+                      <a:picLocks noChangeArrowheads="1" noChangeAspect="1"/>
+                    </pic:cNvPicPr>
+                  </pic:nvPicPr>
+                  <pic:blipFill>
+                    <a:blip r:embed="rId82"/>
                     <a:stretch>
                       <a:fillRect/>
                     </a:stretch>
@@ -4518,7 +5568,7 @@
           <w:b/>
           <w:bCs/>
         </w:rPr>
-        <w:t xml:space="preserve">Figure 4.13: Confidence-Score Breakdown (Finding Detail)</w:t>
+        <w:t xml:space="preserve">Figure 4.17: Confidence-Score Breakdown (Finding Detail)</w:t>
       </w:r>
     </w:p>
     <w:p>
@@ -4598,8 +5648,8 @@
         <w:t xml:space="preserve">classification (it never wrongly confirmed a false positive in the benchmark), and roughly 81% suppression of false positives at the auto-dismiss threshold.</w:t>
       </w:r>
     </w:p>
-    <w:bookmarkEnd w:id="73"/>
-    <w:bookmarkStart w:id="74" w:name="Xaf1c0e46d15e41ac94286ca4982927ee0dd888e"/>
+    <w:bookmarkEnd w:id="85"/>
+    <w:bookmarkStart w:id="86" w:name="Xaf1c0e46d15e41ac94286ca4982927ee0dd888e"/>
     <w:p>
       <w:pPr>
         <w:pStyle w:val="Heading3"/>
@@ -4613,7 +5663,7 @@
         <w:pStyle w:val="FirstParagraph"/>
       </w:pPr>
       <w:r>
-        <w:t xml:space="preserve">The final stage renders a professional PDF triage report suitable for handing to stakeholders. The report opens with a cover page carrying the report metadata and a severity summary (Figure 4.22), followed by an executive summary that narrates the scan and tabulates the classification and severity breakdowns (Figure 4.23), and then the per-finding detail including the confidence rationale. Because the report reads from the same normalised findings and confidence scores as the interface, the two views are always consistent.</w:t>
+        <w:t xml:space="preserve">The final stage renders a professional PDF triage report suitable for handing to stakeholders. The report opens with a cover page carrying the report metadata and a severity summary (Figure 4.26), followed by an executive summary that narrates the scan and tabulates the classification and severity breakdowns (Figure 4.27), and then the per-finding detail including the confidence rationale. Because the report reads from the same normalised findings and confidence scores as the interface, the two views are always consistent.</w:t>
       </w:r>
     </w:p>
     <w:p>
@@ -4623,9 +5673,9 @@
         </w:pict>
       </w:r>
     </w:p>
-    <w:bookmarkEnd w:id="74"/>
-    <w:bookmarkEnd w:id="75"/>
-    <w:bookmarkStart w:id="115" w:name="X54341d584745e7411aa4f4707f5121fcc739cb5"/>
+    <w:bookmarkEnd w:id="86"/>
+    <w:bookmarkEnd w:id="87"/>
+    <w:bookmarkStart w:id="127" w:name="X54341d584745e7411aa4f4707f5121fcc739cb5"/>
     <w:p>
       <w:pPr>
         <w:pStyle w:val="Heading2"/>
@@ -4655,7 +5705,7 @@
         <w:t xml:space="preserve">.</w:t>
       </w:r>
     </w:p>
-    <w:bookmarkStart w:id="79" w:name="X831bf8cb68fb81f8f88eb045a3d2ee1390654c7"/>
+    <w:bookmarkStart w:id="91" w:name="X831bf8cb68fb81f8f88eb045a3d2ee1390654c7"/>
     <w:p>
       <w:pPr>
         <w:pStyle w:val="Heading3"/>
@@ -4673,283 +5723,12 @@
           <wp:inline>
             <wp:extent cx="5334000" cy="3189287"/>
             <wp:effectExtent b="0" l="0" r="0" t="0"/>
-            <wp:docPr descr="Login screen" title="" id="77" name="Picture"/>
+            <wp:docPr descr="Login screen" title="" id="89" name="Picture"/>
             <a:graphic>
               <a:graphicData uri="http://schemas.openxmlformats.org/drawingml/2006/picture">
                 <pic:pic>
                   <pic:nvPicPr>
-                    <pic:cNvPr descr="images/01-login.png" id="78" name="Picture"/>
-                    <pic:cNvPicPr>
-                      <a:picLocks noChangeArrowheads="1" noChangeAspect="1"/>
-                    </pic:cNvPicPr>
-                  </pic:nvPicPr>
-                  <pic:blipFill>
-                    <a:blip r:embed="rId76"/>
-                    <a:stretch>
-                      <a:fillRect/>
-                    </a:stretch>
-                  </pic:blipFill>
-                  <pic:spPr bwMode="auto">
-                    <a:xfrm>
-                      <a:off x="0" y="0"/>
-                      <a:ext cx="5334000" cy="3189287"/>
-                    </a:xfrm>
-                    <a:prstGeom prst="rect">
-                      <a:avLst/>
-                    </a:prstGeom>
-                    <a:noFill/>
-                    <a:ln w="9525">
-                      <a:noFill/>
-                      <a:headEnd/>
-                      <a:tailEnd/>
-                    </a:ln>
-                  </pic:spPr>
-                </pic:pic>
-              </a:graphicData>
-            </a:graphic>
-          </wp:inline>
-        </w:drawing>
-      </w:r>
-    </w:p>
-    <w:p>
-      <w:pPr>
-        <w:pStyle w:val="BodyText"/>
-      </w:pPr>
-      <w:r>
-        <w:rPr>
-          <w:b/>
-          <w:bCs/>
-        </w:rPr>
-        <w:t xml:space="preserve">Figure 4.14: Login Screen.</w:t>
-      </w:r>
-      <w:r>
-        <w:t xml:space="preserve"> </w:t>
-      </w:r>
-      <w:r>
-        <w:rPr>
-          <w:i/>
-          <w:iCs/>
-        </w:rPr>
-        <w:t xml:space="preserve">Justification.</w:t>
-      </w:r>
-      <w:r>
-        <w:t xml:space="preserve"> </w:t>
-      </w:r>
-      <w:r>
-        <w:t xml:space="preserve">The entry point demonstrates the JWT-secured authentication gate. All data routes are protected, and unauthenticated access redirects here. The focused, minimal form reflects the design priority of getting an analyst into the workspace quickly.</w:t>
-      </w:r>
-    </w:p>
-    <w:bookmarkEnd w:id="79"/>
-    <w:bookmarkStart w:id="83" w:name="X554ca8f5079771fa3b5a9c73f668d2a59be3842"/>
-    <w:p>
-      <w:pPr>
-        <w:pStyle w:val="Heading3"/>
-      </w:pPr>
-      <w:r>
-        <w:t xml:space="preserve">4.6.2 Registration</w:t>
-      </w:r>
-    </w:p>
-    <w:p>
-      <w:pPr>
-        <w:pStyle w:val="FirstParagraph"/>
-      </w:pPr>
-      <w:r>
-        <w:drawing>
-          <wp:inline>
-            <wp:extent cx="5334000" cy="3189287"/>
-            <wp:effectExtent b="0" l="0" r="0" t="0"/>
-            <wp:docPr descr="Registration screen" title="" id="81" name="Picture"/>
-            <a:graphic>
-              <a:graphicData uri="http://schemas.openxmlformats.org/drawingml/2006/picture">
-                <pic:pic>
-                  <pic:nvPicPr>
-                    <pic:cNvPr descr="images/02-register.png" id="82" name="Picture"/>
-                    <pic:cNvPicPr>
-                      <a:picLocks noChangeArrowheads="1" noChangeAspect="1"/>
-                    </pic:cNvPicPr>
-                  </pic:nvPicPr>
-                  <pic:blipFill>
-                    <a:blip r:embed="rId80"/>
-                    <a:stretch>
-                      <a:fillRect/>
-                    </a:stretch>
-                  </pic:blipFill>
-                  <pic:spPr bwMode="auto">
-                    <a:xfrm>
-                      <a:off x="0" y="0"/>
-                      <a:ext cx="5334000" cy="3189287"/>
-                    </a:xfrm>
-                    <a:prstGeom prst="rect">
-                      <a:avLst/>
-                    </a:prstGeom>
-                    <a:noFill/>
-                    <a:ln w="9525">
-                      <a:noFill/>
-                      <a:headEnd/>
-                      <a:tailEnd/>
-                    </a:ln>
-                  </pic:spPr>
-                </pic:pic>
-              </a:graphicData>
-            </a:graphic>
-          </wp:inline>
-        </w:drawing>
-      </w:r>
-    </w:p>
-    <w:p>
-      <w:pPr>
-        <w:pStyle w:val="BodyText"/>
-      </w:pPr>
-      <w:r>
-        <w:rPr>
-          <w:b/>
-          <w:bCs/>
-        </w:rPr>
-        <w:t xml:space="preserve">Figure 4.15: Registration Screen.</w:t>
-      </w:r>
-      <w:r>
-        <w:t xml:space="preserve"> </w:t>
-      </w:r>
-      <w:r>
-        <w:rPr>
-          <w:i/>
-          <w:iCs/>
-        </w:rPr>
-        <w:t xml:space="preserve">Justification.</w:t>
-      </w:r>
-      <w:r>
-        <w:t xml:space="preserve"> </w:t>
-      </w:r>
-      <w:r>
-        <w:t xml:space="preserve">New analysts self-register; the API hashes the password and issues a token on success. It documents the complete account-creation path (UC1).</w:t>
-      </w:r>
-    </w:p>
-    <w:bookmarkEnd w:id="83"/>
-    <w:bookmarkStart w:id="87" w:name="Xc736af9b4f661537cca52631185f21e222e4ab8"/>
-    <w:p>
-      <w:pPr>
-        <w:pStyle w:val="Heading3"/>
-      </w:pPr>
-      <w:r>
-        <w:t xml:space="preserve">4.6.3 Dashboard</w:t>
-      </w:r>
-    </w:p>
-    <w:p>
-      <w:pPr>
-        <w:pStyle w:val="FirstParagraph"/>
-      </w:pPr>
-      <w:r>
-        <w:drawing>
-          <wp:inline>
-            <wp:extent cx="5334000" cy="4663545"/>
-            <wp:effectExtent b="0" l="0" r="0" t="0"/>
-            <wp:docPr descr="Dashboard" title="" id="85" name="Picture"/>
-            <a:graphic>
-              <a:graphicData uri="http://schemas.openxmlformats.org/drawingml/2006/picture">
-                <pic:pic>
-                  <pic:nvPicPr>
-                    <pic:cNvPr descr="images/03-dashboard.png" id="86" name="Picture"/>
-                    <pic:cNvPicPr>
-                      <a:picLocks noChangeArrowheads="1" noChangeAspect="1"/>
-                    </pic:cNvPicPr>
-                  </pic:nvPicPr>
-                  <pic:blipFill>
-                    <a:blip r:embed="rId84"/>
-                    <a:stretch>
-                      <a:fillRect/>
-                    </a:stretch>
-                  </pic:blipFill>
-                  <pic:spPr bwMode="auto">
-                    <a:xfrm>
-                      <a:off x="0" y="0"/>
-                      <a:ext cx="5334000" cy="4663545"/>
-                    </a:xfrm>
-                    <a:prstGeom prst="rect">
-                      <a:avLst/>
-                    </a:prstGeom>
-                    <a:noFill/>
-                    <a:ln w="9525">
-                      <a:noFill/>
-                      <a:headEnd/>
-                      <a:tailEnd/>
-                    </a:ln>
-                  </pic:spPr>
-                </pic:pic>
-              </a:graphicData>
-            </a:graphic>
-          </wp:inline>
-        </w:drawing>
-      </w:r>
-    </w:p>
-    <w:p>
-      <w:pPr>
-        <w:pStyle w:val="BodyText"/>
-      </w:pPr>
-      <w:r>
-        <w:rPr>
-          <w:b/>
-          <w:bCs/>
-        </w:rPr>
-        <w:t xml:space="preserve">Figure 4.16: Dashboard.</w:t>
-      </w:r>
-      <w:r>
-        <w:t xml:space="preserve"> </w:t>
-      </w:r>
-      <w:r>
-        <w:rPr>
-          <w:i/>
-          <w:iCs/>
-        </w:rPr>
-        <w:t xml:space="preserve">Justification.</w:t>
-      </w:r>
-      <w:r>
-        <w:t xml:space="preserve"> </w:t>
-      </w:r>
-      <w:r>
-        <w:t xml:space="preserve">This is the analyst's landing view and the clearest demonstration of the system's value. The key-performance-indicator cards quantify the workload (sixteen findings, of which only four are</w:t>
-      </w:r>
-      <w:r>
-        <w:t xml:space="preserve"> </w:t>
-      </w:r>
-      <w:r>
-        <w:rPr>
-          <w:i/>
-          <w:iCs/>
-        </w:rPr>
-        <w:t xml:space="preserve">Confirmed</w:t>
-      </w:r>
-      <w:r>
-        <w:t xml:space="preserve"> </w:t>
-      </w:r>
-      <w:r>
-        <w:t xml:space="preserve">and none need review — the remainder auto-dismissed); the three charts characterise the dataset; and the Top-10 table surfaces the highest-CVSS findings with their classification and CWE. Together they show the triage system converting raw scanner noise into a prioritised, actionable shortlist.</w:t>
-      </w:r>
-    </w:p>
-    <w:bookmarkEnd w:id="87"/>
-    <w:bookmarkStart w:id="91" w:name="Xc2857fb31bdd292898b6b05a29eb176d9346aa0"/>
-    <w:p>
-      <w:pPr>
-        <w:pStyle w:val="Heading3"/>
-      </w:pPr>
-      <w:r>
-        <w:t xml:space="preserve">4.6.4 Upload Scans</w:t>
-      </w:r>
-    </w:p>
-    <w:p>
-      <w:pPr>
-        <w:pStyle w:val="FirstParagraph"/>
-      </w:pPr>
-      <w:r>
-        <w:drawing>
-          <wp:inline>
-            <wp:extent cx="5334000" cy="3189287"/>
-            <wp:effectExtent b="0" l="0" r="0" t="0"/>
-            <wp:docPr descr="Upload screen" title="" id="89" name="Picture"/>
-            <a:graphic>
-              <a:graphicData uri="http://schemas.openxmlformats.org/drawingml/2006/picture">
-                <pic:pic>
-                  <pic:nvPicPr>
-                    <pic:cNvPr descr="images/04-upload.png" id="90" name="Picture"/>
+                    <pic:cNvPr descr="images/01-login.png" id="90" name="Picture"/>
                     <pic:cNvPicPr>
                       <a:picLocks noChangeArrowheads="1" noChangeAspect="1"/>
                     </pic:cNvPicPr>
@@ -4991,7 +5770,7 @@
           <w:b/>
           <w:bCs/>
         </w:rPr>
-        <w:t xml:space="preserve">Figure 4.17: Upload Screen.</w:t>
+        <w:t xml:space="preserve">Figure 4.18: Login Screen.</w:t>
       </w:r>
       <w:r>
         <w:t xml:space="preserve"> </w:t>
@@ -5007,33 +5786,17 @@
         <w:t xml:space="preserve"> </w:t>
       </w:r>
       <w:r>
-        <w:t xml:space="preserve">This is the primary ingestion path (UC2). It shows the scanner-type selector, the drag-and-drop zone, the two clearly-labelled Pipeline Options (Exploit Lookup and PoC Validation) with their safety notes, and the upload-history table with a per-row</w:t>
-      </w:r>
-      <w:r>
-        <w:t xml:space="preserve"> </w:t>
-      </w:r>
-      <w:r>
-        <w:rPr>
-          <w:i/>
-          <w:iCs/>
-        </w:rPr>
-        <w:t xml:space="preserve">Run Pipeline</w:t>
-      </w:r>
-      <w:r>
-        <w:t xml:space="preserve"> </w:t>
-      </w:r>
-      <w:r>
-        <w:t xml:space="preserve">action.</w:t>
+        <w:t xml:space="preserve">The entry point demonstrates the JWT-secured authentication gate. All data routes are protected, and unauthenticated access redirects here. The focused, minimal form reflects the design priority of getting an analyst into the workspace quickly.</w:t>
       </w:r>
     </w:p>
     <w:bookmarkEnd w:id="91"/>
-    <w:bookmarkStart w:id="95" w:name="X51366124bbb38c79718f3316eb565126ea316b8"/>
+    <w:bookmarkStart w:id="95" w:name="X554ca8f5079771fa3b5a9c73f668d2a59be3842"/>
     <w:p>
       <w:pPr>
         <w:pStyle w:val="Heading3"/>
       </w:pPr>
       <w:r>
-        <w:t xml:space="preserve">4.6.5 Auto Scan</w:t>
+        <w:t xml:space="preserve">4.6.2 Registration</w:t>
       </w:r>
     </w:p>
     <w:p>
@@ -5045,12 +5808,12 @@
           <wp:inline>
             <wp:extent cx="5334000" cy="3189287"/>
             <wp:effectExtent b="0" l="0" r="0" t="0"/>
-            <wp:docPr descr="Auto Scan screen" title="" id="93" name="Picture"/>
+            <wp:docPr descr="Registration screen" title="" id="93" name="Picture"/>
             <a:graphic>
               <a:graphicData uri="http://schemas.openxmlformats.org/drawingml/2006/picture">
                 <pic:pic>
                   <pic:nvPicPr>
-                    <pic:cNvPr descr="images/05-autoscan.png" id="94" name="Picture"/>
+                    <pic:cNvPr descr="images/02-register.png" id="94" name="Picture"/>
                     <pic:cNvPicPr>
                       <a:picLocks noChangeArrowheads="1" noChangeAspect="1"/>
                     </pic:cNvPicPr>
@@ -5092,7 +5855,7 @@
           <w:b/>
           <w:bCs/>
         </w:rPr>
-        <w:t xml:space="preserve">Figure 4.18: Auto Scan Screen.</w:t>
+        <w:t xml:space="preserve">Figure 4.19: Registration Screen.</w:t>
       </w:r>
       <w:r>
         <w:t xml:space="preserve"> </w:t>
@@ -5108,17 +5871,17 @@
         <w:t xml:space="preserve"> </w:t>
       </w:r>
       <w:r>
-        <w:t xml:space="preserve">This shows the optional orchestration layer (UC3): a target field, scanner selection, and the explicit authorisation acknowledgement that gates all active scanning. The screen embodies the responsible-use design constraint that intrusive scanning must be deliberately opted into.</w:t>
+        <w:t xml:space="preserve">New analysts self-register; the API hashes the password and issues a token on success. It documents the complete account-creation path (UC1).</w:t>
       </w:r>
     </w:p>
     <w:bookmarkEnd w:id="95"/>
-    <w:bookmarkStart w:id="99" w:name="X82b1df9bde87e06f2113dd04155c164935be6fa"/>
+    <w:bookmarkStart w:id="99" w:name="Xc736af9b4f661537cca52631185f21e222e4ab8"/>
     <w:p>
       <w:pPr>
         <w:pStyle w:val="Heading3"/>
       </w:pPr>
       <w:r>
-        <w:t xml:space="preserve">4.6.6 Findings</w:t>
+        <w:t xml:space="preserve">4.6.3 Dashboard</w:t>
       </w:r>
     </w:p>
     <w:p>
@@ -5128,14 +5891,14 @@
       <w:r>
         <w:drawing>
           <wp:inline>
-            <wp:extent cx="5334000" cy="4911725"/>
+            <wp:extent cx="5334000" cy="4663545"/>
             <wp:effectExtent b="0" l="0" r="0" t="0"/>
-            <wp:docPr descr="Findings list" title="" id="97" name="Picture"/>
+            <wp:docPr descr="Dashboard" title="" id="97" name="Picture"/>
             <a:graphic>
               <a:graphicData uri="http://schemas.openxmlformats.org/drawingml/2006/picture">
                 <pic:pic>
                   <pic:nvPicPr>
-                    <pic:cNvPr descr="images/06-findings.png" id="98" name="Picture"/>
+                    <pic:cNvPr descr="images/03-dashboard.png" id="98" name="Picture"/>
                     <pic:cNvPicPr>
                       <a:picLocks noChangeArrowheads="1" noChangeAspect="1"/>
                     </pic:cNvPicPr>
@@ -5149,7 +5912,7 @@
                   <pic:spPr bwMode="auto">
                     <a:xfrm>
                       <a:off x="0" y="0"/>
-                      <a:ext cx="5334000" cy="4911725"/>
+                      <a:ext cx="5334000" cy="4663545"/>
                     </a:xfrm>
                     <a:prstGeom prst="rect">
                       <a:avLst/>
@@ -5177,7 +5940,7 @@
           <w:b/>
           <w:bCs/>
         </w:rPr>
-        <w:t xml:space="preserve">Figure 4.19: Findings List.</w:t>
+        <w:t xml:space="preserve">Figure 4.20: Dashboard.</w:t>
       </w:r>
       <w:r>
         <w:t xml:space="preserve"> </w:t>
@@ -5193,7 +5956,7 @@
         <w:t xml:space="preserve"> </w:t>
       </w:r>
       <w:r>
-        <w:t xml:space="preserve">The working list (UC5), where an analyst filters and sorts the full set of normalised findings. Each row's classification badge lets the analyst focus immediately on</w:t>
+        <w:t xml:space="preserve">This is the analyst's landing view and the clearest demonstration of the system's value. The key-performance-indicator cards quantify the workload (sixteen findings, of which only four are</w:t>
       </w:r>
       <w:r>
         <w:t xml:space="preserve"> </w:t>
@@ -5209,17 +5972,17 @@
         <w:t xml:space="preserve"> </w:t>
       </w:r>
       <w:r>
-        <w:t xml:space="preserve">items, demonstrating the practical false-positive reduction the project set out to achieve.</w:t>
+        <w:t xml:space="preserve">and none need review — the remainder auto-dismissed); the three charts characterise the dataset; and the Top-10 table surfaces the highest-CVSS findings with their classification and CWE. Together they show the triage system converting raw scanner noise into a prioritised, actionable shortlist.</w:t>
       </w:r>
     </w:p>
     <w:bookmarkEnd w:id="99"/>
-    <w:bookmarkStart w:id="103" w:name="X94c2a5a95d007c0a47c95b07faa6257478ed869"/>
+    <w:bookmarkStart w:id="103" w:name="Xc2857fb31bdd292898b6b05a29eb176d9346aa0"/>
     <w:p>
       <w:pPr>
         <w:pStyle w:val="Heading3"/>
       </w:pPr>
       <w:r>
-        <w:t xml:space="preserve">4.6.7 Finding Detail</w:t>
+        <w:t xml:space="preserve">4.6.4 Upload Scans</w:t>
       </w:r>
     </w:p>
     <w:p>
@@ -5229,14 +5992,14 @@
       <w:r>
         <w:drawing>
           <wp:inline>
-            <wp:extent cx="5334000" cy="8026929"/>
+            <wp:extent cx="5334000" cy="3189287"/>
             <wp:effectExtent b="0" l="0" r="0" t="0"/>
-            <wp:docPr descr="Finding detail" title="" id="101" name="Picture"/>
+            <wp:docPr descr="Upload screen" title="" id="101" name="Picture"/>
             <a:graphic>
               <a:graphicData uri="http://schemas.openxmlformats.org/drawingml/2006/picture">
                 <pic:pic>
                   <pic:nvPicPr>
-                    <pic:cNvPr descr="images/07-finding-detail.png" id="102" name="Picture"/>
+                    <pic:cNvPr descr="images/04-upload.png" id="102" name="Picture"/>
                     <pic:cNvPicPr>
                       <a:picLocks noChangeArrowheads="1" noChangeAspect="1"/>
                     </pic:cNvPicPr>
@@ -5250,7 +6013,7 @@
                   <pic:spPr bwMode="auto">
                     <a:xfrm>
                       <a:off x="0" y="0"/>
-                      <a:ext cx="5334000" cy="8026929"/>
+                      <a:ext cx="5334000" cy="3189287"/>
                     </a:xfrm>
                     <a:prstGeom prst="rect">
                       <a:avLst/>
@@ -5278,7 +6041,7 @@
           <w:b/>
           <w:bCs/>
         </w:rPr>
-        <w:t xml:space="preserve">Figure 4.20: Finding Detail.</w:t>
+        <w:t xml:space="preserve">Figure 4.21: Upload Screen.</w:t>
       </w:r>
       <w:r>
         <w:t xml:space="preserve"> </w:t>
@@ -5294,17 +6057,33 @@
         <w:t xml:space="preserve"> </w:t>
       </w:r>
       <w:r>
-        <w:t xml:space="preserve">The most important screen for the project's thesis. For the confirmed SQL-injection finding it shows the confidence score with its full six-factor breakdown, the machine-learning priority prediction, the CVSS v3 metrics, the description and recommended solution, and the proof-of-concept evidence that triggered the confirmation. This is the concrete realisation of explainable, evidence-backed triage. (The confidence panel is examined in isolation in Figure 4.13.)</w:t>
+        <w:t xml:space="preserve">This is the primary ingestion path (UC2). It shows the scanner-type selector, the drag-and-drop zone, the two clearly-labelled Pipeline Options (Exploit Lookup and PoC Validation) with their safety notes, and the upload-history table with a per-row</w:t>
+      </w:r>
+      <w:r>
+        <w:t xml:space="preserve"> </w:t>
+      </w:r>
+      <w:r>
+        <w:rPr>
+          <w:i/>
+          <w:iCs/>
+        </w:rPr>
+        <w:t xml:space="preserve">Run Pipeline</w:t>
+      </w:r>
+      <w:r>
+        <w:t xml:space="preserve"> </w:t>
+      </w:r>
+      <w:r>
+        <w:t xml:space="preserve">action.</w:t>
       </w:r>
     </w:p>
     <w:bookmarkEnd w:id="103"/>
-    <w:bookmarkStart w:id="107" w:name="X3b8ffb2c2c8594b656bd2a544a17692c9dbd9a7"/>
+    <w:bookmarkStart w:id="107" w:name="X51366124bbb38c79718f3316eb565126ea316b8"/>
     <w:p>
       <w:pPr>
         <w:pStyle w:val="Heading3"/>
       </w:pPr>
       <w:r>
-        <w:t xml:space="preserve">4.6.8 Reports List</w:t>
+        <w:t xml:space="preserve">4.6.5 Auto Scan</w:t>
       </w:r>
     </w:p>
     <w:p>
@@ -5316,12 +6095,12 @@
           <wp:inline>
             <wp:extent cx="5334000" cy="3189287"/>
             <wp:effectExtent b="0" l="0" r="0" t="0"/>
-            <wp:docPr descr="Reports list" title="" id="105" name="Picture"/>
+            <wp:docPr descr="Auto Scan screen" title="" id="105" name="Picture"/>
             <a:graphic>
               <a:graphicData uri="http://schemas.openxmlformats.org/drawingml/2006/picture">
                 <pic:pic>
                   <pic:nvPicPr>
-                    <pic:cNvPr descr="images/08-reports.png" id="106" name="Picture"/>
+                    <pic:cNvPr descr="images/05-autoscan.png" id="106" name="Picture"/>
                     <pic:cNvPicPr>
                       <a:picLocks noChangeArrowheads="1" noChangeAspect="1"/>
                     </pic:cNvPicPr>
@@ -5363,7 +6142,7 @@
           <w:b/>
           <w:bCs/>
         </w:rPr>
-        <w:t xml:space="preserve">Figure 4.21: Reports List.</w:t>
+        <w:t xml:space="preserve">Figure 4.22: Auto Scan Screen.</w:t>
       </w:r>
       <w:r>
         <w:t xml:space="preserve"> </w:t>
@@ -5379,17 +6158,17 @@
         <w:t xml:space="preserve"> </w:t>
       </w:r>
       <w:r>
-        <w:t xml:space="preserve">Completes the workflow (UC9): generated PDF reports are listed and downloadable, providing the deliverable an analyst hands to stakeholders.</w:t>
+        <w:t xml:space="preserve">This shows the optional orchestration layer (UC3): a target field, scanner selection, and the explicit authorisation acknowledgement that gates all active scanning. The screen embodies the responsible-use design constraint that intrusive scanning must be deliberately opted into.</w:t>
       </w:r>
     </w:p>
     <w:bookmarkEnd w:id="107"/>
-    <w:bookmarkStart w:id="114" w:name="Xc9cdf9694989309be5c9b710b76adc554a0427e"/>
+    <w:bookmarkStart w:id="111" w:name="X82b1df9bde87e06f2113dd04155c164935be6fa"/>
     <w:p>
       <w:pPr>
         <w:pStyle w:val="Heading3"/>
       </w:pPr>
       <w:r>
-        <w:t xml:space="preserve">4.6.9 Generated PDF Report</w:t>
+        <w:t xml:space="preserve">4.6.6 Findings</w:t>
       </w:r>
     </w:p>
     <w:p>
@@ -5399,20 +6178,291 @@
       <w:r>
         <w:drawing>
           <wp:inline>
-            <wp:extent cx="5334000" cy="7541944"/>
+            <wp:extent cx="5334000" cy="4911725"/>
             <wp:effectExtent b="0" l="0" r="0" t="0"/>
-            <wp:docPr descr="PDF report cover page" title="" id="109" name="Picture"/>
+            <wp:docPr descr="Findings list" title="" id="109" name="Picture"/>
             <a:graphic>
               <a:graphicData uri="http://schemas.openxmlformats.org/drawingml/2006/picture">
                 <pic:pic>
                   <pic:nvPicPr>
-                    <pic:cNvPr descr="images/09-report-cover.png" id="110" name="Picture"/>
+                    <pic:cNvPr descr="images/06-findings.png" id="110" name="Picture"/>
                     <pic:cNvPicPr>
                       <a:picLocks noChangeArrowheads="1" noChangeAspect="1"/>
                     </pic:cNvPicPr>
                   </pic:nvPicPr>
                   <pic:blipFill>
                     <a:blip r:embed="rId108"/>
+                    <a:stretch>
+                      <a:fillRect/>
+                    </a:stretch>
+                  </pic:blipFill>
+                  <pic:spPr bwMode="auto">
+                    <a:xfrm>
+                      <a:off x="0" y="0"/>
+                      <a:ext cx="5334000" cy="4911725"/>
+                    </a:xfrm>
+                    <a:prstGeom prst="rect">
+                      <a:avLst/>
+                    </a:prstGeom>
+                    <a:noFill/>
+                    <a:ln w="9525">
+                      <a:noFill/>
+                      <a:headEnd/>
+                      <a:tailEnd/>
+                    </a:ln>
+                  </pic:spPr>
+                </pic:pic>
+              </a:graphicData>
+            </a:graphic>
+          </wp:inline>
+        </w:drawing>
+      </w:r>
+    </w:p>
+    <w:p>
+      <w:pPr>
+        <w:pStyle w:val="BodyText"/>
+      </w:pPr>
+      <w:r>
+        <w:rPr>
+          <w:b/>
+          <w:bCs/>
+        </w:rPr>
+        <w:t xml:space="preserve">Figure 4.23: Findings List.</w:t>
+      </w:r>
+      <w:r>
+        <w:t xml:space="preserve"> </w:t>
+      </w:r>
+      <w:r>
+        <w:rPr>
+          <w:i/>
+          <w:iCs/>
+        </w:rPr>
+        <w:t xml:space="preserve">Justification.</w:t>
+      </w:r>
+      <w:r>
+        <w:t xml:space="preserve"> </w:t>
+      </w:r>
+      <w:r>
+        <w:t xml:space="preserve">The working list (UC5), where an analyst filters and sorts the full set of normalised findings. Each row's classification badge lets the analyst focus immediately on</w:t>
+      </w:r>
+      <w:r>
+        <w:t xml:space="preserve"> </w:t>
+      </w:r>
+      <w:r>
+        <w:rPr>
+          <w:i/>
+          <w:iCs/>
+        </w:rPr>
+        <w:t xml:space="preserve">Confirmed</w:t>
+      </w:r>
+      <w:r>
+        <w:t xml:space="preserve"> </w:t>
+      </w:r>
+      <w:r>
+        <w:t xml:space="preserve">items, demonstrating the practical false-positive reduction the project set out to achieve.</w:t>
+      </w:r>
+    </w:p>
+    <w:bookmarkEnd w:id="111"/>
+    <w:bookmarkStart w:id="115" w:name="X94c2a5a95d007c0a47c95b07faa6257478ed869"/>
+    <w:p>
+      <w:pPr>
+        <w:pStyle w:val="Heading3"/>
+      </w:pPr>
+      <w:r>
+        <w:t xml:space="preserve">4.6.7 Finding Detail</w:t>
+      </w:r>
+    </w:p>
+    <w:p>
+      <w:pPr>
+        <w:pStyle w:val="FirstParagraph"/>
+      </w:pPr>
+      <w:r>
+        <w:drawing>
+          <wp:inline>
+            <wp:extent cx="5334000" cy="8026929"/>
+            <wp:effectExtent b="0" l="0" r="0" t="0"/>
+            <wp:docPr descr="Finding detail" title="" id="113" name="Picture"/>
+            <a:graphic>
+              <a:graphicData uri="http://schemas.openxmlformats.org/drawingml/2006/picture">
+                <pic:pic>
+                  <pic:nvPicPr>
+                    <pic:cNvPr descr="images/07-finding-detail.png" id="114" name="Picture"/>
+                    <pic:cNvPicPr>
+                      <a:picLocks noChangeArrowheads="1" noChangeAspect="1"/>
+                    </pic:cNvPicPr>
+                  </pic:nvPicPr>
+                  <pic:blipFill>
+                    <a:blip r:embed="rId112"/>
+                    <a:stretch>
+                      <a:fillRect/>
+                    </a:stretch>
+                  </pic:blipFill>
+                  <pic:spPr bwMode="auto">
+                    <a:xfrm>
+                      <a:off x="0" y="0"/>
+                      <a:ext cx="5334000" cy="8026929"/>
+                    </a:xfrm>
+                    <a:prstGeom prst="rect">
+                      <a:avLst/>
+                    </a:prstGeom>
+                    <a:noFill/>
+                    <a:ln w="9525">
+                      <a:noFill/>
+                      <a:headEnd/>
+                      <a:tailEnd/>
+                    </a:ln>
+                  </pic:spPr>
+                </pic:pic>
+              </a:graphicData>
+            </a:graphic>
+          </wp:inline>
+        </w:drawing>
+      </w:r>
+    </w:p>
+    <w:p>
+      <w:pPr>
+        <w:pStyle w:val="BodyText"/>
+      </w:pPr>
+      <w:r>
+        <w:rPr>
+          <w:b/>
+          <w:bCs/>
+        </w:rPr>
+        <w:t xml:space="preserve">Figure 4.24: Finding Detail.</w:t>
+      </w:r>
+      <w:r>
+        <w:t xml:space="preserve"> </w:t>
+      </w:r>
+      <w:r>
+        <w:rPr>
+          <w:i/>
+          <w:iCs/>
+        </w:rPr>
+        <w:t xml:space="preserve">Justification.</w:t>
+      </w:r>
+      <w:r>
+        <w:t xml:space="preserve"> </w:t>
+      </w:r>
+      <w:r>
+        <w:t xml:space="preserve">The most important screen for the project's thesis. For the confirmed SQL-injection finding it shows the confidence score with its full six-factor breakdown, the machine-learning priority prediction, the CVSS v3 metrics, the description and recommended solution, and the proof-of-concept evidence that triggered the confirmation. This is the concrete realisation of explainable, evidence-backed triage. (The confidence panel is examined in isolation in Figure 4.17.)</w:t>
+      </w:r>
+    </w:p>
+    <w:bookmarkEnd w:id="115"/>
+    <w:bookmarkStart w:id="119" w:name="X3b8ffb2c2c8594b656bd2a544a17692c9dbd9a7"/>
+    <w:p>
+      <w:pPr>
+        <w:pStyle w:val="Heading3"/>
+      </w:pPr>
+      <w:r>
+        <w:t xml:space="preserve">4.6.8 Reports List</w:t>
+      </w:r>
+    </w:p>
+    <w:p>
+      <w:pPr>
+        <w:pStyle w:val="FirstParagraph"/>
+      </w:pPr>
+      <w:r>
+        <w:drawing>
+          <wp:inline>
+            <wp:extent cx="5334000" cy="3189287"/>
+            <wp:effectExtent b="0" l="0" r="0" t="0"/>
+            <wp:docPr descr="Reports list" title="" id="117" name="Picture"/>
+            <a:graphic>
+              <a:graphicData uri="http://schemas.openxmlformats.org/drawingml/2006/picture">
+                <pic:pic>
+                  <pic:nvPicPr>
+                    <pic:cNvPr descr="images/08-reports.png" id="118" name="Picture"/>
+                    <pic:cNvPicPr>
+                      <a:picLocks noChangeArrowheads="1" noChangeAspect="1"/>
+                    </pic:cNvPicPr>
+                  </pic:nvPicPr>
+                  <pic:blipFill>
+                    <a:blip r:embed="rId116"/>
+                    <a:stretch>
+                      <a:fillRect/>
+                    </a:stretch>
+                  </pic:blipFill>
+                  <pic:spPr bwMode="auto">
+                    <a:xfrm>
+                      <a:off x="0" y="0"/>
+                      <a:ext cx="5334000" cy="3189287"/>
+                    </a:xfrm>
+                    <a:prstGeom prst="rect">
+                      <a:avLst/>
+                    </a:prstGeom>
+                    <a:noFill/>
+                    <a:ln w="9525">
+                      <a:noFill/>
+                      <a:headEnd/>
+                      <a:tailEnd/>
+                    </a:ln>
+                  </pic:spPr>
+                </pic:pic>
+              </a:graphicData>
+            </a:graphic>
+          </wp:inline>
+        </w:drawing>
+      </w:r>
+    </w:p>
+    <w:p>
+      <w:pPr>
+        <w:pStyle w:val="BodyText"/>
+      </w:pPr>
+      <w:r>
+        <w:rPr>
+          <w:b/>
+          <w:bCs/>
+        </w:rPr>
+        <w:t xml:space="preserve">Figure 4.25: Reports List.</w:t>
+      </w:r>
+      <w:r>
+        <w:t xml:space="preserve"> </w:t>
+      </w:r>
+      <w:r>
+        <w:rPr>
+          <w:i/>
+          <w:iCs/>
+        </w:rPr>
+        <w:t xml:space="preserve">Justification.</w:t>
+      </w:r>
+      <w:r>
+        <w:t xml:space="preserve"> </w:t>
+      </w:r>
+      <w:r>
+        <w:t xml:space="preserve">Completes the workflow (UC9): generated PDF reports are listed and downloadable, providing the deliverable an analyst hands to stakeholders.</w:t>
+      </w:r>
+    </w:p>
+    <w:bookmarkEnd w:id="119"/>
+    <w:bookmarkStart w:id="126" w:name="Xc9cdf9694989309be5c9b710b76adc554a0427e"/>
+    <w:p>
+      <w:pPr>
+        <w:pStyle w:val="Heading3"/>
+      </w:pPr>
+      <w:r>
+        <w:t xml:space="preserve">4.6.9 Generated PDF Report</w:t>
+      </w:r>
+    </w:p>
+    <w:p>
+      <w:pPr>
+        <w:pStyle w:val="FirstParagraph"/>
+      </w:pPr>
+      <w:r>
+        <w:drawing>
+          <wp:inline>
+            <wp:extent cx="5334000" cy="7541944"/>
+            <wp:effectExtent b="0" l="0" r="0" t="0"/>
+            <wp:docPr descr="PDF report cover page" title="" id="121" name="Picture"/>
+            <a:graphic>
+              <a:graphicData uri="http://schemas.openxmlformats.org/drawingml/2006/picture">
+                <pic:pic>
+                  <pic:nvPicPr>
+                    <pic:cNvPr descr="images/09-report-cover.png" id="122" name="Picture"/>
+                    <pic:cNvPicPr>
+                      <a:picLocks noChangeArrowheads="1" noChangeAspect="1"/>
+                    </pic:cNvPicPr>
+                  </pic:nvPicPr>
+                  <pic:blipFill>
+                    <a:blip r:embed="rId120"/>
                     <a:stretch>
                       <a:fillRect/>
                     </a:stretch>
@@ -5448,7 +6498,7 @@
           <w:b/>
           <w:bCs/>
         </w:rPr>
-        <w:t xml:space="preserve">Figure 4.22: PDF Report — Cover and Severity Summary.</w:t>
+        <w:t xml:space="preserve">Figure 4.26: PDF Report — Cover and Severity Summary.</w:t>
       </w:r>
       <w:r>
         <w:t xml:space="preserve"> </w:t>
@@ -5476,18 +6526,18 @@
           <wp:inline>
             <wp:extent cx="5334000" cy="7541944"/>
             <wp:effectExtent b="0" l="0" r="0" t="0"/>
-            <wp:docPr descr="PDF report executive summary" title="" id="112" name="Picture"/>
+            <wp:docPr descr="PDF report executive summary" title="" id="124" name="Picture"/>
             <a:graphic>
               <a:graphicData uri="http://schemas.openxmlformats.org/drawingml/2006/picture">
                 <pic:pic>
                   <pic:nvPicPr>
-                    <pic:cNvPr descr="images/10-report-summary.png" id="113" name="Picture"/>
+                    <pic:cNvPr descr="images/10-report-summary.png" id="125" name="Picture"/>
                     <pic:cNvPicPr>
                       <a:picLocks noChangeArrowheads="1" noChangeAspect="1"/>
                     </pic:cNvPicPr>
                   </pic:nvPicPr>
                   <pic:blipFill>
-                    <a:blip r:embed="rId111"/>
+                    <a:blip r:embed="rId123"/>
                     <a:stretch>
                       <a:fillRect/>
                     </a:stretch>
@@ -5523,7 +6573,7 @@
           <w:b/>
           <w:bCs/>
         </w:rPr>
-        <w:t xml:space="preserve">Figure 4.23: PDF Report — Executive Summary.</w:t>
+        <w:t xml:space="preserve">Figure 4.27: PDF Report — Executive Summary.</w:t>
       </w:r>
       <w:r>
         <w:t xml:space="preserve"> </w:t>
@@ -5575,9 +6625,9 @@
         </w:pict>
       </w:r>
     </w:p>
-    <w:bookmarkEnd w:id="114"/>
-    <w:bookmarkEnd w:id="115"/>
-    <w:bookmarkStart w:id="116" w:name="X623c2de98ec25c30e3c670a591e51ee904911e5"/>
+    <w:bookmarkEnd w:id="126"/>
+    <w:bookmarkEnd w:id="127"/>
+    <w:bookmarkStart w:id="128" w:name="X623c2de98ec25c30e3c670a591e51ee904911e5"/>
     <w:p>
       <w:pPr>
         <w:pStyle w:val="Heading2"/>
@@ -5591,7 +6641,7 @@
         <w:pStyle w:val="FirstParagraph"/>
       </w:pPr>
       <w:r>
-        <w:t xml:space="preserve">This chapter presented the design and the completed implementation of VulnTriage using an object-oriented methodology. Section 4.2 set out the five design principles that govern the system and then modelled it with a layered system-architecture diagram, a use case diagram, an activity diagram of the triage pipeline, two sequence diagrams for the principal workflows, a class diagram separating domain models from engine services, and a two-level data flow diagram. Section 4.3 documented the nine-table relational schema as an entity-relationship diagram, described each table, and justified the normalisation and the single deliberate denormalisation. Section 4.4 described the interface-design philosophy, the navigation structure, each principal screen, and the user-journey storyboard. Section 4.5 explained how the system executes across its three deployment modes, detailed the ordered engine pipeline, described the machine-learning component and its anti-leakage design, and examined the Confidence Engine's scoring in depth using a real interface capture. Section 4.6 presented eleven annotated screenshots of the finished product — including the exported PDF report — with a justification for each.</w:t>
+        <w:t xml:space="preserve">This chapter presented the design and the completed implementation of VulnTriage using an object-oriented methodology. Section 4.2 set out the five design principles that govern the system and then modelled it with a layered system-architecture diagram, a use case diagram, an activity diagram of the triage pipeline, two sequence diagrams for the principal workflows, a class diagram separating domain models from engine services, and a two-level data flow diagram. Section 4.3 documented the nine-table relational schema as an entity-relationship diagram, described each table, and justified the normalisation and the single deliberate denormalisation. Section 4.4 described the interface-design philosophy, the navigation structure, each principal screen, and the user-journey storyboard. Section 4.5 explained how the system executes across its three deployment modes, detailed the ordered engine pipeline, and examined the two most important pieces of the implementation at the source-code level — the machine-learning component (with its anti-leakage feature design and its inference code) and the Confidence Engine (with its weighted-scoring code, its factor computations, and a worked example from the interface). Section 4.6 presented eleven annotated screenshots of the finished product — including the exported PDF report — with a justification for each. In total the chapter contains twelve diagrams, four annotated code figures, eleven application screenshots, and two component tables.</w:t>
       </w:r>
     </w:p>
     <w:p>
@@ -5602,8 +6652,8 @@
         <w:t xml:space="preserve">Taken together, these artefacts describe a fully realised system that ingests multi-scanner output and, through a normalisation–enrichment–prioritisation–confidence pipeline, produces explainable, prioritised, and confirmation-backed vulnerability findings. The following chapter evaluates the system's performance and effectiveness against the objectives established for the project.</w:t>
       </w:r>
     </w:p>
-    <w:bookmarkEnd w:id="116"/>
-    <w:bookmarkEnd w:id="117"/>
+    <w:bookmarkEnd w:id="128"/>
+    <w:bookmarkEnd w:id="129"/>
     <w:sectPr>
       <w:footnotePr>
         <w:numRestart w:val="eachSect"/>

</xml_diff>

<commit_message>
Chapter 4: full source-code walkthrough of every essential engine
Per the report requirement that all important code be shown and
explained, restructure §4.5 into a per-engine implementation
walkthrough (§4.5.2.1–4.5.2.10) in pipeline order, each with a
syntax-highlighted code figure and block-by-block explanation:
scanner parsing, normalisation, deduplication (SHA-256 group hash),
CWE mapping, NVD enrichment (.xz streaming + CWE back-fill),
CWE→CVSS inference, ML prioritisation (features/inference/training),
confidence scoring (weights/factors/worked example), PoC validation
(scope guard + SQLi check), and report generation. Adds §4.5.3
Auto-Scan orchestration and §4.5.4 JWT auth + pipeline wiring.

Adds 11 code figures (pygments); figures renumbered to a contiguous
4.1–4.38 (12 diagrams + 16 code/interface figures + 10 screenshots)
plus Tables 4.1–4.2. Rebuilt the .docx (38 embedded images).
</commit_message>
<xml_diff>
--- a/docs/Chapter_4_Design_and_Implementation.docx
+++ b/docs/Chapter_4_Design_and_Implementation.docx
@@ -2,7 +2,7 @@
 <file path=word/document.xml><?xml version="1.0" encoding="utf-8"?>
 <w:document xmlns:w="http://schemas.openxmlformats.org/wordprocessingml/2006/main" xmlns:m="http://schemas.openxmlformats.org/officeDocument/2006/math" xmlns:r="http://schemas.openxmlformats.org/officeDocument/2006/relationships" xmlns:o="urn:schemas-microsoft-com:office:office" xmlns:v="urn:schemas-microsoft-com:vml" xmlns:w10="urn:schemas-microsoft-com:office:word" xmlns:a="http://schemas.openxmlformats.org/drawingml/2006/main" xmlns:pic="http://schemas.openxmlformats.org/drawingml/2006/picture" xmlns:wp="http://schemas.openxmlformats.org/drawingml/2006/wordprocessingDrawing">
   <w:body>
-    <w:bookmarkStart w:id="129" w:name="chapter-4-design-and-implementation"/>
+    <w:bookmarkStart w:id="171" w:name="chapter-4-design-and-implementation"/>
     <w:p>
       <w:pPr>
         <w:pStyle w:val="Heading1"/>
@@ -3501,7 +3501,7 @@
         <w:t xml:space="preserve"> </w:t>
       </w:r>
       <w:r>
-        <w:t xml:space="preserve">The login and registration screens (Figures 4.18 and 4.19) present a single focused form. Their minimalism reflects the design goal of moving the analyst into the workspace with the least friction; all other functionality is gated behind successful authentication.</w:t>
+        <w:t xml:space="preserve">The login and registration screens (Figures 4.29 and 4.30) present a single focused form. Their minimalism reflects the design goal of moving the analyst into the workspace with the least friction; all other functionality is gated behind successful authentication.</w:t>
       </w:r>
     </w:p>
     <w:p>
@@ -3519,7 +3519,7 @@
         <w:t xml:space="preserve"> </w:t>
       </w:r>
       <w:r>
-        <w:t xml:space="preserve">The dashboard (Figure 4.20) is the landing screen and the clearest expression of the system's value. It is organised top-to-bottom in decreasing order of abstraction: four key-performance-indicator cards give the headline counts (Total Findings, Confirmed, Needs Review, Total Uploads); three charts characterise the dataset (a severity-breakdown pie, a classification-results pie, and a scans-by-tool bar chart); and a Top-10-by-CVSS table lets the analyst drill straight into the most severe findings. This layout embodies the "overview first, detail on demand" principle of information-dashboard design.</w:t>
+        <w:t xml:space="preserve">The dashboard (Figure 4.31) is the landing screen and the clearest expression of the system's value. It is organised top-to-bottom in decreasing order of abstraction: four key-performance-indicator cards give the headline counts (Total Findings, Confirmed, Needs Review, Total Uploads); three charts characterise the dataset (a severity-breakdown pie, a classification-results pie, and a scans-by-tool bar chart); and a Top-10-by-CVSS table lets the analyst drill straight into the most severe findings. This layout embodies the "overview first, detail on demand" principle of information-dashboard design.</w:t>
       </w:r>
     </w:p>
     <w:p>
@@ -3537,7 +3537,7 @@
         <w:t xml:space="preserve"> </w:t>
       </w:r>
       <w:r>
-        <w:t xml:space="preserve">The upload screen (Figure 4.21) is the primary ingestion path. It is divided into three regions: a scanner-type selector and drag-and-drop file zone; a</w:t>
+        <w:t xml:space="preserve">The upload screen (Figure 4.32) is the primary ingestion path. It is divided into three regions: a scanner-type selector and drag-and-drop file zone; a</w:t>
       </w:r>
       <w:r>
         <w:t xml:space="preserve"> </w:t>
@@ -3571,7 +3571,7 @@
         <w:t xml:space="preserve"> </w:t>
       </w:r>
       <w:r>
-        <w:t xml:space="preserve">The Auto Scan screen (Figure 4.22) provides a target field, scanner check-boxes, and, crucially, an explicit authorisation acknowledgement that must be ticked before a scan can start. This gate is the interface-level expression of the responsible-operation principle.</w:t>
+        <w:t xml:space="preserve">The Auto Scan screen (Figure 4.33) provides a target field, scanner check-boxes, and, crucially, an explicit authorisation acknowledgement that must be ticked before a scan can start. This gate is the interface-level expression of the responsible-operation principle.</w:t>
       </w:r>
     </w:p>
     <w:p>
@@ -3589,7 +3589,7 @@
         <w:t xml:space="preserve"> </w:t>
       </w:r>
       <w:r>
-        <w:t xml:space="preserve">The findings screen (Figure 4.23) is the analyst's primary working list: a filterable, sortable table of all normalised findings, with columns for severity, CVSS, classification, scanner, and CWE. The classification badge in each row lets the analyst immediately focus on</w:t>
+        <w:t xml:space="preserve">The findings screen (Figure 4.34) is the analyst's primary working list: a filterable, sortable table of all normalised findings, with columns for severity, CVSS, classification, scanner, and CWE. The classification badge in each row lets the analyst immediately focus on</w:t>
       </w:r>
       <w:r>
         <w:t xml:space="preserve"> </w:t>
@@ -3623,7 +3623,7 @@
         <w:t xml:space="preserve"> </w:t>
       </w:r>
       <w:r>
-        <w:t xml:space="preserve">The finding-detail screen (Figure 4.24) is the deepest and most important screen. It presents, in a single scroll, the finding's identity and metadata, its classification (with an override control), the</w:t>
+        <w:t xml:space="preserve">The finding-detail screen (Figure 4.35) is the deepest and most important screen. It presents, in a single scroll, the finding's identity and metadata, its classification (with an override control), the</w:t>
       </w:r>
       <w:r>
         <w:t xml:space="preserve"> </w:t>
@@ -3728,7 +3728,7 @@
     </w:p>
     <w:bookmarkEnd w:id="62"/>
     <w:bookmarkEnd w:id="63"/>
-    <w:bookmarkStart w:id="87" w:name="X91b3a7e34e6a6cb09e8dd74f95685ddbfe6f32d"/>
+    <w:bookmarkStart w:id="129" w:name="X91b3a7e34e6a6cb09e8dd74f95685ddbfe6f32d"/>
     <w:p>
       <w:pPr>
         <w:pStyle w:val="Heading2"/>
@@ -3957,13 +3957,13 @@
       </w:r>
     </w:p>
     <w:bookmarkEnd w:id="67"/>
-    <w:bookmarkStart w:id="68" w:name="X6a8766f2d259c621c3cdcbe40bcbb0342764aef"/>
+    <w:bookmarkStart w:id="120" w:name="X23ae556abcc7c78b47557acf8f0115359dcfbb9"/>
     <w:p>
       <w:pPr>
         <w:pStyle w:val="Heading3"/>
       </w:pPr>
       <w:r>
-        <w:t xml:space="preserve">4.5.2 Pipeline Execution</w:t>
+        <w:t xml:space="preserve">4.5.2 Implementation of the Pipeline Engines</w:t>
       </w:r>
     </w:p>
     <w:p>
@@ -3971,100 +3971,165 @@
         <w:pStyle w:val="FirstParagraph"/>
       </w:pPr>
       <w:r>
-        <w:t xml:space="preserve">When a report is ingested — whether by upload, by the CLI, or by an Auto Scan — the engines execute in a fixed order, each reading and writing through the ORM:</w:t>
-      </w:r>
-    </w:p>
-    <w:p>
-      <w:pPr>
-        <w:pStyle w:val="SourceCode"/>
+        <w:t xml:space="preserve">When a report is ingested — whether by upload, by the command-line interface, or by an Auto Scan — the engines execute in a fixed order, each reading and writing through the ORM:</w:t>
+      </w:r>
+    </w:p>
+    <w:p>
+      <w:pPr>
+        <w:pStyle w:val="BodyText"/>
       </w:pPr>
       <w:r>
         <w:rPr>
           <w:rStyle w:val="VerbatimChar"/>
         </w:rPr>
-        <w:t xml:space="preserve">normalisation → deduplication → cwe_mapper → nvd_enrichment</w:t>
-      </w:r>
-      <w:r>
-        <w:br/>
+        <w:t xml:space="preserve">normalisation → deduplication → cwe_mapper → nvd_enrichment → cwe_cvss_enrichment → ml/predictor → confidence_engine → (optional) poc_validator → report_generator</w:t>
+      </w:r>
+    </w:p>
+    <w:p>
+      <w:pPr>
+        <w:pStyle w:val="BodyText"/>
+      </w:pPr>
+      <w:r>
+        <w:t xml:space="preserve">The ordering is not arbitrary; each stage depends on the outputs of the previous ones. The remainder of this section walks through the implementation of each engine in this order, presenting the essential code and explaining how it works. (The route that wires the engines together is shown in §4.5.4.)</w:t>
+      </w:r>
+    </w:p>
+    <w:bookmarkStart w:id="71" w:name="Xbdfcf480f175ce15e4a2fd3a422c1366e4d5db3"/>
+    <w:p>
+      <w:pPr>
+        <w:pStyle w:val="Heading4"/>
+      </w:pPr>
+      <w:r>
+        <w:t xml:space="preserve">4.5.2.1 Scanner Parsing</w:t>
+      </w:r>
+    </w:p>
+    <w:p>
+      <w:pPr>
+        <w:pStyle w:val="FirstParagraph"/>
+      </w:pPr>
+      <w:r>
+        <w:t xml:space="preserve">Every scanner emits a different native format — ZAP produces XML, Nuclei produces JSON Lines, and Nessus produces its own</w:t>
+      </w:r>
+      <w:r>
+        <w:t xml:space="preserve"> </w:t>
       </w:r>
       <w:r>
         <w:rPr>
           <w:rStyle w:val="VerbatimChar"/>
         </w:rPr>
-        <w:t xml:space="preserve">  → cwe_cvss_enrichment → ml/predictor → confidence_engine</w:t>
-      </w:r>
-      <w:r>
-        <w:br/>
+        <w:t xml:space="preserve">.nessus</w:t>
+      </w:r>
+      <w:r>
+        <w:t xml:space="preserve"> </w:t>
+      </w:r>
+      <w:r>
+        <w:t xml:space="preserve">XML — so the first stage converts each into a common</w:t>
+      </w:r>
+      <w:r>
+        <w:t xml:space="preserve"> </w:t>
       </w:r>
       <w:r>
         <w:rPr>
           <w:rStyle w:val="VerbatimChar"/>
         </w:rPr>
-        <w:t xml:space="preserve">  → (optional) poc_validator → report_generator</w:t>
-      </w:r>
-    </w:p>
-    <w:p>
-      <w:pPr>
-        <w:pStyle w:val="FirstParagraph"/>
-      </w:pPr>
-      <w:r>
-        <w:t xml:space="preserve">The ordering is not arbitrary; each stage depends on the outputs of the previous ones.</w:t>
-      </w:r>
-    </w:p>
-    <w:p>
-      <w:pPr>
-        <w:pStyle w:val="Compact"/>
-        <w:numPr>
-          <w:ilvl w:val="0"/>
-          <w:numId w:val="1005"/>
-        </w:numPr>
-      </w:pPr>
-      <w:r>
-        <w:rPr>
-          <w:b/>
-          <w:bCs/>
-        </w:rPr>
-        <w:t xml:space="preserve">Normalisation</w:t>
-      </w:r>
-      <w:r>
-        <w:t xml:space="preserve"> </w:t>
-      </w:r>
-      <w:r>
-        <w:t xml:space="preserve">unifies severities, CWE identifiers, and field names into a common shape. It also cleans the data at this single chokepoint: it drops non-informative CWE placeholders (such as</w:t>
-      </w:r>
-      <w:r>
-        <w:t xml:space="preserve"> </w:t>
-      </w:r>
+        <w:t xml:space="preserve">Vulnerability</w:t>
+      </w:r>
+      <w:r>
+        <w:t xml:space="preserve"> </w:t>
+      </w:r>
+      <w:r>
+        <w:t xml:space="preserve">record. Figure 4.13 shows the dispatch function.</w:t>
+      </w:r>
+    </w:p>
+    <w:p>
+      <w:pPr>
+        <w:pStyle w:val="BodyText"/>
+      </w:pPr>
+      <w:r>
+        <w:drawing>
+          <wp:inline>
+            <wp:extent cx="5334000" cy="2183580"/>
+            <wp:effectExtent b="0" l="0" r="0" t="0"/>
+            <wp:docPr descr="Scanner-parser dispatch" title="" id="69" name="Picture"/>
+            <a:graphic>
+              <a:graphicData uri="http://schemas.openxmlformats.org/drawingml/2006/picture">
+                <pic:pic>
+                  <pic:nvPicPr>
+                    <pic:cNvPr descr="images/code-parsing.png" id="70" name="Picture"/>
+                    <pic:cNvPicPr>
+                      <a:picLocks noChangeArrowheads="1" noChangeAspect="1"/>
+                    </pic:cNvPicPr>
+                  </pic:nvPicPr>
+                  <pic:blipFill>
+                    <a:blip r:embed="rId68"/>
+                    <a:stretch>
+                      <a:fillRect/>
+                    </a:stretch>
+                  </pic:blipFill>
+                  <pic:spPr bwMode="auto">
+                    <a:xfrm>
+                      <a:off x="0" y="0"/>
+                      <a:ext cx="5334000" cy="2183580"/>
+                    </a:xfrm>
+                    <a:prstGeom prst="rect">
+                      <a:avLst/>
+                    </a:prstGeom>
+                    <a:noFill/>
+                    <a:ln w="9525">
+                      <a:noFill/>
+                      <a:headEnd/>
+                      <a:tailEnd/>
+                    </a:ln>
+                  </pic:spPr>
+                </pic:pic>
+              </a:graphicData>
+            </a:graphic>
+          </wp:inline>
+        </w:drawing>
+      </w:r>
+    </w:p>
+    <w:p>
+      <w:pPr>
+        <w:pStyle w:val="BodyText"/>
+      </w:pPr>
+      <w:r>
+        <w:rPr>
+          <w:b/>
+          <w:bCs/>
+        </w:rPr>
+        <w:t xml:space="preserve">Figure 4.13: Scanner-Parser Dispatch (parsers/</w:t>
+      </w:r>
+      <w:r>
+        <w:rPr>
+          <w:b/>
+          <w:b/>
+          <w:bCs/>
+          <w:bCs/>
+        </w:rPr>
+        <w:t xml:space="preserve">init</w:t>
+      </w:r>
+      <w:r>
+        <w:rPr>
+          <w:b/>
+          <w:bCs/>
+        </w:rPr>
+        <w:t xml:space="preserve">.py)</w:t>
+      </w:r>
+    </w:p>
+    <w:p>
+      <w:pPr>
+        <w:pStyle w:val="BodyText"/>
+      </w:pPr>
       <w:r>
         <w:rPr>
           <w:rStyle w:val="VerbatimChar"/>
         </w:rPr>
-        <w:t xml:space="preserve">CWE-0</w:t>
-      </w:r>
-      <w:r>
-        <w:t xml:space="preserve">, which some scanners emit to mean "no weakness assigned") so that they do not block later mapping, and it strips HTML markup from scanner descriptions so that the interface and report display readable text.</w:t>
-      </w:r>
-    </w:p>
-    <w:p>
-      <w:pPr>
-        <w:pStyle w:val="Compact"/>
-        <w:numPr>
-          <w:ilvl w:val="0"/>
-          <w:numId w:val="1005"/>
-        </w:numPr>
-      </w:pPr>
-      <w:r>
-        <w:rPr>
-          <w:b/>
-          <w:bCs/>
-        </w:rPr>
-        <w:t xml:space="preserve">De-duplication</w:t>
-      </w:r>
-      <w:r>
-        <w:t xml:space="preserve"> </w:t>
-      </w:r>
-      <w:r>
-        <w:t xml:space="preserve">computes a SHA-256</w:t>
+        <w:t xml:space="preserve">parse_scanner_file</w:t>
+      </w:r>
+      <w:r>
+        <w:t xml:space="preserve"> </w:t>
+      </w:r>
+      <w:r>
+        <w:t xml:space="preserve">selects the appropriate parser class for the declared scanner type from a registry, instantiates it with the upload record, and delegates to the parser's</w:t>
       </w:r>
       <w:r>
         <w:t xml:space="preserve"> </w:t>
@@ -4073,13 +4138,13 @@
         <w:rPr>
           <w:rStyle w:val="VerbatimChar"/>
         </w:rPr>
-        <w:t xml:space="preserve">group_hash</w:t>
-      </w:r>
-      <w:r>
-        <w:t xml:space="preserve"> </w:t>
-      </w:r>
-      <w:r>
-        <w:t xml:space="preserve">over a finding's identifying attributes and merges duplicates. When the same issue is reported by two different scanners, the merge raises the</w:t>
+        <w:t xml:space="preserve">parse</w:t>
+      </w:r>
+      <w:r>
+        <w:t xml:space="preserve"> </w:t>
+      </w:r>
+      <w:r>
+        <w:t xml:space="preserve">method, which reads the file, saves one</w:t>
       </w:r>
       <w:r>
         <w:t xml:space="preserve"> </w:t>
@@ -4088,139 +4153,46 @@
         <w:rPr>
           <w:rStyle w:val="VerbatimChar"/>
         </w:rPr>
-        <w:t xml:space="preserve">scanner_count</w:t>
-      </w:r>
-      <w:r>
-        <w:t xml:space="preserve">, which the Confidence Engine later reads as cross-tool corroboration.</w:t>
-      </w:r>
-    </w:p>
-    <w:p>
-      <w:pPr>
-        <w:pStyle w:val="Compact"/>
-        <w:numPr>
-          <w:ilvl w:val="0"/>
-          <w:numId w:val="1005"/>
-        </w:numPr>
-      </w:pPr>
-      <w:r>
-        <w:rPr>
-          <w:b/>
-          <w:bCs/>
-        </w:rPr>
-        <w:t xml:space="preserve">CWE mapping</w:t>
-      </w:r>
-      <w:r>
-        <w:t xml:space="preserve"> </w:t>
-      </w:r>
-      <w:r>
-        <w:t xml:space="preserve">must run before enrichment so that a weakness class is available for the vector-inference step; it fills a CWE from a curated keyword table (fifty-eight patterns) when the scanner supplied none.</w:t>
-      </w:r>
-    </w:p>
-    <w:p>
-      <w:pPr>
-        <w:pStyle w:val="Compact"/>
-        <w:numPr>
-          <w:ilvl w:val="0"/>
-          <w:numId w:val="1005"/>
-        </w:numPr>
-      </w:pPr>
-      <w:r>
-        <w:rPr>
-          <w:b/>
-          <w:bCs/>
-        </w:rPr>
-        <w:t xml:space="preserve">NVD enrichment</w:t>
-      </w:r>
-      <w:r>
-        <w:t xml:space="preserve"> </w:t>
-      </w:r>
-      <w:r>
-        <w:t xml:space="preserve">streams the offline NVD feeds to fill an authoritative CVSS vector and to back-fill a CWE for any finding that carries a CVE but no weakness class.</w:t>
-      </w:r>
-    </w:p>
-    <w:p>
-      <w:pPr>
-        <w:pStyle w:val="Compact"/>
-        <w:numPr>
-          <w:ilvl w:val="0"/>
-          <w:numId w:val="1005"/>
-        </w:numPr>
-      </w:pPr>
-      <w:r>
-        <w:rPr>
-          <w:b/>
-          <w:bCs/>
-        </w:rPr>
-        <w:t xml:space="preserve">CWE→CVSS enrichment</w:t>
-      </w:r>
-      <w:r>
-        <w:t xml:space="preserve"> </w:t>
-      </w:r>
-      <w:r>
-        <w:t xml:space="preserve">must run after CWE mapping and NVD enrichment, because it only acts on findings that still lack a vector; it derives a plausible CVSS vector from the CWE so that the ML model receives real features rather than an all-zero vector (which had previously caused it to predict "Low" for every web finding).</w:t>
-      </w:r>
-    </w:p>
-    <w:p>
-      <w:pPr>
-        <w:pStyle w:val="Compact"/>
-        <w:numPr>
-          <w:ilvl w:val="0"/>
-          <w:numId w:val="1005"/>
-        </w:numPr>
-      </w:pPr>
-      <w:r>
-        <w:rPr>
-          <w:b/>
-          <w:bCs/>
-        </w:rPr>
-        <w:t xml:space="preserve">ML prioritisation</w:t>
-      </w:r>
-      <w:r>
-        <w:t xml:space="preserve"> </w:t>
-      </w:r>
-      <w:r>
-        <w:t xml:space="preserve">applies the Random Forest to predict a severity band from the CVSS sub-metrics and the CWE.</w:t>
-      </w:r>
-    </w:p>
-    <w:p>
-      <w:pPr>
-        <w:pStyle w:val="Compact"/>
-        <w:numPr>
-          <w:ilvl w:val="0"/>
-          <w:numId w:val="1005"/>
-        </w:numPr>
-      </w:pPr>
-      <w:r>
-        <w:rPr>
-          <w:b/>
-          <w:bCs/>
-        </w:rPr>
-        <w:t xml:space="preserve">Confidence scoring</w:t>
-      </w:r>
-      <w:r>
-        <w:t xml:space="preserve"> </w:t>
-      </w:r>
-      <w:r>
-        <w:t xml:space="preserve">combines six reliability factors into a 0–100 score and a classification (§4.5.4).</w:t>
-      </w:r>
-    </w:p>
-    <w:p>
-      <w:pPr>
-        <w:pStyle w:val="Compact"/>
-        <w:numPr>
-          <w:ilvl w:val="0"/>
-          <w:numId w:val="1005"/>
-        </w:numPr>
-      </w:pPr>
-      <w:r>
-        <w:rPr>
-          <w:b/>
-          <w:bCs/>
-        </w:rPr>
-        <w:t xml:space="preserve">PoC validation</w:t>
-      </w:r>
-      <w:r>
-        <w:t xml:space="preserve">, when requested, runs non-destructive checks against in-scope targets; a confirmed result overrides the classification to</w:t>
+        <w:t xml:space="preserve">Vulnerability</w:t>
+      </w:r>
+      <w:r>
+        <w:t xml:space="preserve"> </w:t>
+      </w:r>
+      <w:r>
+        <w:t xml:space="preserve">row per finding, and returns the count. Each concrete parser (</w:t>
+      </w:r>
+      <w:r>
+        <w:rPr>
+          <w:rStyle w:val="VerbatimChar"/>
+        </w:rPr>
+        <w:t xml:space="preserve">ZapParser</w:t>
+      </w:r>
+      <w:r>
+        <w:t xml:space="preserve">,</w:t>
+      </w:r>
+      <w:r>
+        <w:t xml:space="preserve"> </w:t>
+      </w:r>
+      <w:r>
+        <w:rPr>
+          <w:rStyle w:val="VerbatimChar"/>
+        </w:rPr>
+        <w:t xml:space="preserve">NucleiParser</w:t>
+      </w:r>
+      <w:r>
+        <w:t xml:space="preserve">,</w:t>
+      </w:r>
+      <w:r>
+        <w:t xml:space="preserve"> </w:t>
+      </w:r>
+      <w:r>
+        <w:rPr>
+          <w:rStyle w:val="VerbatimChar"/>
+        </w:rPr>
+        <w:t xml:space="preserve">NessusParser</w:t>
+      </w:r>
+      <w:r>
+        <w:t xml:space="preserve">) understands only its own format and produces the same target type. This is the</w:t>
       </w:r>
       <w:r>
         <w:t xml:space="preserve"> </w:t>
@@ -4230,42 +4202,475 @@
           <w:i/>
           <w:iCs/>
         </w:rPr>
-        <w:t xml:space="preserve">Confirmed</w:t>
+        <w:t xml:space="preserve">strategy pattern</w:t>
+      </w:r>
+      <w:r>
+        <w:t xml:space="preserve">: adding support for a new scanner is a matter of writing one parser class and registering it, with no change to any downstream engine — the practical expression of the "separation of scanning from triage" principle from §4.2.1.</w:t>
+      </w:r>
+    </w:p>
+    <w:bookmarkEnd w:id="71"/>
+    <w:bookmarkStart w:id="75" w:name="Xc438c1e55f8c0357d519f7249fc51e9f69775bd"/>
+    <w:p>
+      <w:pPr>
+        <w:pStyle w:val="Heading4"/>
+      </w:pPr>
+      <w:r>
+        <w:t xml:space="preserve">4.5.2.2 Normalisation</w:t>
+      </w:r>
+    </w:p>
+    <w:p>
+      <w:pPr>
+        <w:pStyle w:val="FirstParagraph"/>
+      </w:pPr>
+      <w:r>
+        <w:t xml:space="preserve">Normalisation converts each raw</w:t>
+      </w:r>
+      <w:r>
+        <w:t xml:space="preserve"> </w:t>
+      </w:r>
+      <w:r>
+        <w:rPr>
+          <w:rStyle w:val="VerbatimChar"/>
+        </w:rPr>
+        <w:t xml:space="preserve">Vulnerability</w:t>
+      </w:r>
+      <w:r>
+        <w:t xml:space="preserve"> </w:t>
+      </w:r>
+      <w:r>
+        <w:t xml:space="preserve">into the canonical</w:t>
+      </w:r>
+      <w:r>
+        <w:t xml:space="preserve"> </w:t>
+      </w:r>
+      <w:r>
+        <w:rPr>
+          <w:rStyle w:val="VerbatimChar"/>
+        </w:rPr>
+        <w:t xml:space="preserve">NormalizedFinding</w:t>
+      </w:r>
+      <w:r>
+        <w:t xml:space="preserve"> </w:t>
+      </w:r>
+      <w:r>
+        <w:t xml:space="preserve">that the rest of the pipeline operates on, and it is the single chokepoint at which the data is cleaned. Figure 4.14 shows the core of the transformation.</w:t>
+      </w:r>
+    </w:p>
+    <w:p>
+      <w:pPr>
+        <w:pStyle w:val="BodyText"/>
+      </w:pPr>
+      <w:r>
+        <w:drawing>
+          <wp:inline>
+            <wp:extent cx="5334000" cy="3677405"/>
+            <wp:effectExtent b="0" l="0" r="0" t="0"/>
+            <wp:docPr descr="Building the NormalizedFinding" title="" id="73" name="Picture"/>
+            <a:graphic>
+              <a:graphicData uri="http://schemas.openxmlformats.org/drawingml/2006/picture">
+                <pic:pic>
+                  <pic:nvPicPr>
+                    <pic:cNvPr descr="images/code-normalisation.png" id="74" name="Picture"/>
+                    <pic:cNvPicPr>
+                      <a:picLocks noChangeArrowheads="1" noChangeAspect="1"/>
+                    </pic:cNvPicPr>
+                  </pic:nvPicPr>
+                  <pic:blipFill>
+                    <a:blip r:embed="rId72"/>
+                    <a:stretch>
+                      <a:fillRect/>
+                    </a:stretch>
+                  </pic:blipFill>
+                  <pic:spPr bwMode="auto">
+                    <a:xfrm>
+                      <a:off x="0" y="0"/>
+                      <a:ext cx="5334000" cy="3677405"/>
+                    </a:xfrm>
+                    <a:prstGeom prst="rect">
+                      <a:avLst/>
+                    </a:prstGeom>
+                    <a:noFill/>
+                    <a:ln w="9525">
+                      <a:noFill/>
+                      <a:headEnd/>
+                      <a:tailEnd/>
+                    </a:ln>
+                  </pic:spPr>
+                </pic:pic>
+              </a:graphicData>
+            </a:graphic>
+          </wp:inline>
+        </w:drawing>
+      </w:r>
+    </w:p>
+    <w:p>
+      <w:pPr>
+        <w:pStyle w:val="BodyText"/>
+      </w:pPr>
+      <w:r>
+        <w:rPr>
+          <w:b/>
+          <w:bCs/>
+        </w:rPr>
+        <w:t xml:space="preserve">Figure 4.14: Normalisation — Building the Canonical Finding (normalisation.py)</w:t>
+      </w:r>
+    </w:p>
+    <w:p>
+      <w:pPr>
+        <w:pStyle w:val="BodyText"/>
+      </w:pPr>
+      <w:r>
+        <w:t xml:space="preserve">The method first computes the</w:t>
+      </w:r>
+      <w:r>
+        <w:t xml:space="preserve"> </w:t>
+      </w:r>
+      <w:r>
+        <w:rPr>
+          <w:rStyle w:val="VerbatimChar"/>
+        </w:rPr>
+        <w:t xml:space="preserve">group_hash</w:t>
+      </w:r>
+      <w:r>
+        <w:t xml:space="preserve"> </w:t>
+      </w:r>
+      <w:r>
+        <w:t xml:space="preserve">(via the deduplication engine, §4.5.2.3) over the finding's identifying fields, then constructs the</w:t>
+      </w:r>
+      <w:r>
+        <w:t xml:space="preserve"> </w:t>
+      </w:r>
+      <w:r>
+        <w:rPr>
+          <w:rStyle w:val="VerbatimChar"/>
+        </w:rPr>
+        <w:t xml:space="preserve">NormalizedFinding</w:t>
+      </w:r>
+      <w:r>
+        <w:t xml:space="preserve">. Two data-cleaning steps happen here so that every later stage sees clean data:</w:t>
+      </w:r>
+      <w:r>
+        <w:t xml:space="preserve"> </w:t>
+      </w:r>
+      <w:r>
+        <w:rPr>
+          <w:rStyle w:val="VerbatimChar"/>
+        </w:rPr>
+        <w:t xml:space="preserve">extract_cwe_id</w:t>
+      </w:r>
+      <w:r>
+        <w:t xml:space="preserve"> </w:t>
+      </w:r>
+      <w:r>
+        <w:t xml:space="preserve">is run over the scanner's own CWE value so that non-informative placeholders such as</w:t>
+      </w:r>
+      <w:r>
+        <w:t xml:space="preserve"> </w:t>
+      </w:r>
+      <w:r>
+        <w:rPr>
+          <w:rStyle w:val="VerbatimChar"/>
+        </w:rPr>
+        <w:t xml:space="preserve">CWE-0</w:t>
+      </w:r>
+      <w:r>
+        <w:t xml:space="preserve"> </w:t>
+      </w:r>
+      <w:r>
+        <w:t xml:space="preserve">are dropped to</w:t>
+      </w:r>
+      <w:r>
+        <w:t xml:space="preserve"> </w:t>
+      </w:r>
+      <w:r>
+        <w:rPr>
+          <w:rStyle w:val="VerbatimChar"/>
+        </w:rPr>
+        <w:t xml:space="preserve">None</w:t>
+      </w:r>
+      <w:r>
+        <w:t xml:space="preserve"> </w:t>
+      </w:r>
+      <w:r>
+        <w:t xml:space="preserve">(allowing the CWE mapper or NVD to fill a real class), and</w:t>
+      </w:r>
+      <w:r>
+        <w:t xml:space="preserve"> </w:t>
+      </w:r>
+      <w:r>
+        <w:rPr>
+          <w:rStyle w:val="VerbatimChar"/>
+        </w:rPr>
+        <w:t xml:space="preserve">html_to_text</w:t>
+      </w:r>
+      <w:r>
+        <w:t xml:space="preserve"> </w:t>
+      </w:r>
+      <w:r>
+        <w:t xml:space="preserve">strips the HTML markup that scanners such as ZAP embed in their descriptions and solutions, so the interface and the PDF report display readable text rather than raw</w:t>
+      </w:r>
+      <w:r>
+        <w:t xml:space="preserve"> </w:t>
+      </w:r>
+      <w:r>
+        <w:rPr>
+          <w:rStyle w:val="VerbatimChar"/>
+        </w:rPr>
+        <w:t xml:space="preserve">&lt;p&gt;</w:t>
+      </w:r>
+      <w:r>
+        <w:t xml:space="preserve"> </w:t>
+      </w:r>
+      <w:r>
+        <w:t xml:space="preserve">tags. The</w:t>
+      </w:r>
+      <w:r>
+        <w:t xml:space="preserve"> </w:t>
+      </w:r>
+      <w:r>
+        <w:rPr>
+          <w:rStyle w:val="VerbatimChar"/>
+        </w:rPr>
+        <w:t xml:space="preserve">scanner_count</w:t>
+      </w:r>
+      <w:r>
+        <w:t xml:space="preserve"> </w:t>
+      </w:r>
+      <w:r>
+        <w:t xml:space="preserve">is initialised to 1 and</w:t>
+      </w:r>
+      <w:r>
+        <w:t xml:space="preserve"> </w:t>
+      </w:r>
+      <w:r>
+        <w:rPr>
+          <w:rStyle w:val="VerbatimChar"/>
+        </w:rPr>
+        <w:t xml:space="preserve">scanner_sources</w:t>
+      </w:r>
+      <w:r>
+        <w:t xml:space="preserve"> </w:t>
+      </w:r>
+      <w:r>
+        <w:t xml:space="preserve">records the originating scanner, both of which the deduplication and confidence stages later use.</w:t>
+      </w:r>
+    </w:p>
+    <w:bookmarkEnd w:id="75"/>
+    <w:bookmarkStart w:id="79" w:name="X7be591afe95c2511561b53376ab9fd8754b87c1"/>
+    <w:p>
+      <w:pPr>
+        <w:pStyle w:val="Heading4"/>
+      </w:pPr>
+      <w:r>
+        <w:t xml:space="preserve">4.5.2.3 Deduplication</w:t>
+      </w:r>
+    </w:p>
+    <w:p>
+      <w:pPr>
+        <w:pStyle w:val="FirstParagraph"/>
+      </w:pPr>
+      <w:r>
+        <w:t xml:space="preserve">A single issue is frequently reported more than once — by the same scanner on different URLs, or by two different scanners. Deduplication collapses these into one canonical finding and, crucially, records the corroboration. Figure 4.15 shows the hashing and merging code.</w:t>
+      </w:r>
+    </w:p>
+    <w:p>
+      <w:pPr>
+        <w:pStyle w:val="BodyText"/>
+      </w:pPr>
+      <w:r>
+        <w:drawing>
+          <wp:inline>
+            <wp:extent cx="5334000" cy="4944964"/>
+            <wp:effectExtent b="0" l="0" r="0" t="0"/>
+            <wp:docPr descr="Group-hash computation and cross-scanner merge" title="" id="77" name="Picture"/>
+            <a:graphic>
+              <a:graphicData uri="http://schemas.openxmlformats.org/drawingml/2006/picture">
+                <pic:pic>
+                  <pic:nvPicPr>
+                    <pic:cNvPr descr="images/code-dedup.png" id="78" name="Picture"/>
+                    <pic:cNvPicPr>
+                      <a:picLocks noChangeArrowheads="1" noChangeAspect="1"/>
+                    </pic:cNvPicPr>
+                  </pic:nvPicPr>
+                  <pic:blipFill>
+                    <a:blip r:embed="rId76"/>
+                    <a:stretch>
+                      <a:fillRect/>
+                    </a:stretch>
+                  </pic:blipFill>
+                  <pic:spPr bwMode="auto">
+                    <a:xfrm>
+                      <a:off x="0" y="0"/>
+                      <a:ext cx="5334000" cy="4944964"/>
+                    </a:xfrm>
+                    <a:prstGeom prst="rect">
+                      <a:avLst/>
+                    </a:prstGeom>
+                    <a:noFill/>
+                    <a:ln w="9525">
+                      <a:noFill/>
+                      <a:headEnd/>
+                      <a:tailEnd/>
+                    </a:ln>
+                  </pic:spPr>
+                </pic:pic>
+              </a:graphicData>
+            </a:graphic>
+          </wp:inline>
+        </w:drawing>
+      </w:r>
+    </w:p>
+    <w:p>
+      <w:pPr>
+        <w:pStyle w:val="BodyText"/>
+      </w:pPr>
+      <w:r>
+        <w:rPr>
+          <w:b/>
+          <w:bCs/>
+        </w:rPr>
+        <w:t xml:space="preserve">Figure 4.15: Deduplication — SHA-256 Group Hash and Merge (deduplication.py)</w:t>
+      </w:r>
+    </w:p>
+    <w:p>
+      <w:pPr>
+        <w:pStyle w:val="BodyText"/>
+      </w:pPr>
+      <w:r>
+        <w:rPr>
+          <w:rStyle w:val="VerbatimChar"/>
+        </w:rPr>
+        <w:t xml:space="preserve">compute_hash</w:t>
+      </w:r>
+      <w:r>
+        <w:t xml:space="preserve"> </w:t>
+      </w:r>
+      <w:r>
+        <w:t xml:space="preserve">normalises the finding's name, URL, and parameter, combines them with the CWE, and returns their SHA-256 digest; this digest is the</w:t>
+      </w:r>
+      <w:r>
+        <w:t xml:space="preserve"> </w:t>
+      </w:r>
+      <w:r>
+        <w:rPr>
+          <w:rStyle w:val="VerbatimChar"/>
+        </w:rPr>
+        <w:t xml:space="preserve">group_hash</w:t>
       </w:r>
       <w:r>
         <w:t xml:space="preserve">.</w:t>
       </w:r>
-    </w:p>
-    <w:p>
-      <w:pPr>
-        <w:pStyle w:val="Compact"/>
-        <w:numPr>
-          <w:ilvl w:val="0"/>
-          <w:numId w:val="1005"/>
-        </w:numPr>
-      </w:pPr>
-      <w:r>
-        <w:rPr>
-          <w:b/>
-          <w:bCs/>
-        </w:rPr>
-        <w:t xml:space="preserve">Report generation</w:t>
-      </w:r>
-      <w:r>
-        <w:t xml:space="preserve"> </w:t>
-      </w:r>
-      <w:r>
-        <w:t xml:space="preserve">renders the PDF triage report.</w:t>
-      </w:r>
-    </w:p>
-    <w:bookmarkEnd w:id="68"/>
-    <w:bookmarkStart w:id="75" w:name="X1f3e8fc82b78115a362ceb7c66825d5571239e9"/>
-    <w:p>
-      <w:pPr>
-        <w:pStyle w:val="Heading3"/>
-      </w:pPr>
-      <w:r>
-        <w:t xml:space="preserve">4.5.3 The Machine-Learning Component</w:t>
+      <w:r>
+        <w:t xml:space="preserve"> </w:t>
+      </w:r>
+      <w:r>
+        <w:rPr>
+          <w:rStyle w:val="VerbatimChar"/>
+        </w:rPr>
+        <w:t xml:space="preserve">merge_duplicates</w:t>
+      </w:r>
+      <w:r>
+        <w:t xml:space="preserve"> </w:t>
+      </w:r>
+      <w:r>
+        <w:t xml:space="preserve">then queries for any</w:t>
+      </w:r>
+      <w:r>
+        <w:t xml:space="preserve"> </w:t>
+      </w:r>
+      <w:r>
+        <w:rPr>
+          <w:rStyle w:val="VerbatimChar"/>
+        </w:rPr>
+        <w:t xml:space="preserve">group_hash</w:t>
+      </w:r>
+      <w:r>
+        <w:t xml:space="preserve"> </w:t>
+      </w:r>
+      <w:r>
+        <w:t xml:space="preserve">shared by more than one finding and merges the duplicates into the first occurrence,</w:t>
+      </w:r>
+      <w:r>
+        <w:t xml:space="preserve"> </w:t>
+      </w:r>
+      <w:r>
+        <w:rPr>
+          <w:b/>
+          <w:bCs/>
+        </w:rPr>
+        <w:t xml:space="preserve">incrementing</w:t>
+      </w:r>
+      <w:r>
+        <w:rPr>
+          <w:b/>
+          <w:bCs/>
+        </w:rPr>
+        <w:t xml:space="preserve"> </w:t>
+      </w:r>
+      <w:r>
+        <w:rPr>
+          <w:rStyle w:val="VerbatimChar"/>
+          <w:b/>
+          <w:bCs/>
+        </w:rPr>
+        <w:t xml:space="preserve">scanner_count</w:t>
+      </w:r>
+      <w:r>
+        <w:rPr>
+          <w:b/>
+          <w:bCs/>
+        </w:rPr>
+        <w:t xml:space="preserve"> </w:t>
+      </w:r>
+      <w:r>
+        <w:rPr>
+          <w:b/>
+          <w:bCs/>
+        </w:rPr>
+        <w:t xml:space="preserve">and combining</w:t>
+      </w:r>
+      <w:r>
+        <w:rPr>
+          <w:b/>
+          <w:bCs/>
+        </w:rPr>
+        <w:t xml:space="preserve"> </w:t>
+      </w:r>
+      <w:r>
+        <w:rPr>
+          <w:rStyle w:val="VerbatimChar"/>
+          <w:b/>
+          <w:bCs/>
+        </w:rPr>
+        <w:t xml:space="preserve">scanner_sources</w:t>
+      </w:r>
+      <w:r>
+        <w:t xml:space="preserve">. The raised</w:t>
+      </w:r>
+      <w:r>
+        <w:t xml:space="preserve"> </w:t>
+      </w:r>
+      <w:r>
+        <w:rPr>
+          <w:rStyle w:val="VerbatimChar"/>
+        </w:rPr>
+        <w:t xml:space="preserve">scanner_count</w:t>
+      </w:r>
+      <w:r>
+        <w:t xml:space="preserve"> </w:t>
+      </w:r>
+      <w:r>
+        <w:t xml:space="preserve">is exactly the cross-tool corroboration signal that the Confidence Engine reads as its highest-weighted factor (§4.5.2.8), so deduplication is not merely tidying — it produces evidence.</w:t>
+      </w:r>
+    </w:p>
+    <w:bookmarkEnd w:id="79"/>
+    <w:bookmarkStart w:id="83" w:name="X473f28712003964d423f4b3ae4b099f9e263702"/>
+    <w:p>
+      <w:pPr>
+        <w:pStyle w:val="Heading4"/>
+      </w:pPr>
+      <w:r>
+        <w:t xml:space="preserve">4.5.2.4 CWE Mapping</w:t>
       </w:r>
     </w:p>
     <w:p>
@@ -4273,49 +4678,83 @@
         <w:pStyle w:val="FirstParagraph"/>
       </w:pPr>
       <w:r>
-        <w:t xml:space="preserve">The prioritiser is a</w:t>
-      </w:r>
-      <w:r>
-        <w:t xml:space="preserve"> </w:t>
-      </w:r>
-      <w:r>
-        <w:rPr>
-          <w:b/>
-          <w:bCs/>
-        </w:rPr>
-        <w:t xml:space="preserve">Random Forest implemented in pure NumPy</w:t>
-      </w:r>
-      <w:r>
-        <w:t xml:space="preserve">, so that inference at run time requires only NumPy and not the heavier scikit-learn stack (which is used only during training). It is trained on</w:t>
-      </w:r>
-      <w:r>
-        <w:t xml:space="preserve"> </w:t>
-      </w:r>
-      <w:r>
-        <w:rPr>
-          <w:b/>
-          <w:bCs/>
-        </w:rPr>
-        <w:t xml:space="preserve">108,495</w:t>
-      </w:r>
-      <w:r>
-        <w:t xml:space="preserve"> </w:t>
-      </w:r>
-      <w:r>
-        <w:t xml:space="preserve">real CVSS-v3 records drawn from the National Vulnerability Database JSON feeds for 2023–2025. Crucially, the model predicts the severity band from the</w:t>
-      </w:r>
-      <w:r>
-        <w:t xml:space="preserve"> </w:t>
-      </w:r>
-      <w:r>
-        <w:rPr>
-          <w:b/>
-          <w:bCs/>
-        </w:rPr>
-        <w:t xml:space="preserve">eight CVSS sub-metrics and the CWE only, deliberately excluding the CVSS base score</w:t>
-      </w:r>
-      <w:r>
-        <w:t xml:space="preserve">. This exclusion prevents</w:t>
+        <w:t xml:space="preserve">When a scanner supplies no weakness class, the CWE mapper assigns one from a curated keyword table so that later stages (the CVSS-vector inference and the confidence factor) have something to work with. Figure 4.16 shows the table and the matching function.</w:t>
+      </w:r>
+    </w:p>
+    <w:p>
+      <w:pPr>
+        <w:pStyle w:val="BodyText"/>
+      </w:pPr>
+      <w:r>
+        <w:drawing>
+          <wp:inline>
+            <wp:extent cx="5334000" cy="3670013"/>
+            <wp:effectExtent b="0" l="0" r="0" t="0"/>
+            <wp:docPr descr="Keyword-to-CWE table and matcher" title="" id="81" name="Picture"/>
+            <a:graphic>
+              <a:graphicData uri="http://schemas.openxmlformats.org/drawingml/2006/picture">
+                <pic:pic>
+                  <pic:nvPicPr>
+                    <pic:cNvPr descr="images/code-cwe-mapper.png" id="82" name="Picture"/>
+                    <pic:cNvPicPr>
+                      <a:picLocks noChangeArrowheads="1" noChangeAspect="1"/>
+                    </pic:cNvPicPr>
+                  </pic:nvPicPr>
+                  <pic:blipFill>
+                    <a:blip r:embed="rId80"/>
+                    <a:stretch>
+                      <a:fillRect/>
+                    </a:stretch>
+                  </pic:blipFill>
+                  <pic:spPr bwMode="auto">
+                    <a:xfrm>
+                      <a:off x="0" y="0"/>
+                      <a:ext cx="5334000" cy="3670013"/>
+                    </a:xfrm>
+                    <a:prstGeom prst="rect">
+                      <a:avLst/>
+                    </a:prstGeom>
+                    <a:noFill/>
+                    <a:ln w="9525">
+                      <a:noFill/>
+                      <a:headEnd/>
+                      <a:tailEnd/>
+                    </a:ln>
+                  </pic:spPr>
+                </pic:pic>
+              </a:graphicData>
+            </a:graphic>
+          </wp:inline>
+        </w:drawing>
+      </w:r>
+    </w:p>
+    <w:p>
+      <w:pPr>
+        <w:pStyle w:val="BodyText"/>
+      </w:pPr>
+      <w:r>
+        <w:rPr>
+          <w:b/>
+          <w:bCs/>
+        </w:rPr>
+        <w:t xml:space="preserve">Figure 4.16: CWE Mapping — Keyword Table and Matcher (cwe_mapper.py)</w:t>
+      </w:r>
+    </w:p>
+    <w:p>
+      <w:pPr>
+        <w:pStyle w:val="BodyText"/>
+      </w:pPr>
+      <w:r>
+        <w:rPr>
+          <w:rStyle w:val="VerbatimChar"/>
+        </w:rPr>
+        <w:t xml:space="preserve">KEYWORD_CWE_MAP</w:t>
+      </w:r>
+      <w:r>
+        <w:t xml:space="preserve"> </w:t>
+      </w:r>
+      <w:r>
+        <w:t xml:space="preserve">is an ordered list of</w:t>
       </w:r>
       <w:r>
         <w:t xml:space="preserve"> </w:t>
@@ -4325,10 +4764,403 @@
           <w:i/>
           <w:iCs/>
         </w:rPr>
-        <w:t xml:space="preserve">target leakage</w:t>
-      </w:r>
-      <w:r>
-        <w:t xml:space="preserve">: because the severity band is itself derived from the base score, including the score as an input would let the model trivially reproduce the answer and report a meaningless near-perfect accuracy. On a held-out set of 21,697 real records the model achieves an</w:t>
+        <w:t xml:space="preserve">(regular expression, CWE)</w:t>
+      </w:r>
+      <w:r>
+        <w:t xml:space="preserve"> </w:t>
+      </w:r>
+      <w:r>
+        <w:t xml:space="preserve">pairs covering fifty-eight common web and infrastructure weaknesses.</w:t>
+      </w:r>
+      <w:r>
+        <w:t xml:space="preserve"> </w:t>
+      </w:r>
+      <w:r>
+        <w:rPr>
+          <w:rStyle w:val="VerbatimChar"/>
+        </w:rPr>
+        <w:t xml:space="preserve">_keyword_match</w:t>
+      </w:r>
+      <w:r>
+        <w:t xml:space="preserve"> </w:t>
+      </w:r>
+      <w:r>
+        <w:t xml:space="preserve">returns the CWE of the first pattern that matches the finding's title and description. Two design points are essential: the patterns are ordered</w:t>
+      </w:r>
+      <w:r>
+        <w:t xml:space="preserve"> </w:t>
+      </w:r>
+      <w:r>
+        <w:rPr>
+          <w:b/>
+          <w:bCs/>
+        </w:rPr>
+        <w:t xml:space="preserve">specific before general</w:t>
+      </w:r>
+      <w:r>
+        <w:t xml:space="preserve">, because the first match wins, so a specific alert cannot be swallowed by a broader one; and short acronyms are anchored with word boundaries (for example</w:t>
+      </w:r>
+      <w:r>
+        <w:t xml:space="preserve"> </w:t>
+      </w:r>
+      <w:r>
+        <w:rPr>
+          <w:rStyle w:val="VerbatimChar"/>
+        </w:rPr>
+        <w:t xml:space="preserve">\brce\b</w:t>
+      </w:r>
+      <w:r>
+        <w:t xml:space="preserve">) so that they do not match as substrings — this prevents a finding such as "Source Code Disclosure" from being mis-mapped to remote-code-execution because "sou</w:t>
+      </w:r>
+      <w:r>
+        <w:rPr>
+          <w:b/>
+          <w:bCs/>
+        </w:rPr>
+        <w:t xml:space="preserve">rce</w:t>
+      </w:r>
+      <w:r>
+        <w:t xml:space="preserve">" contains "rce".</w:t>
+      </w:r>
+    </w:p>
+    <w:bookmarkEnd w:id="83"/>
+    <w:bookmarkStart w:id="87" w:name="Xe1abe990cc56514e7f0542e8b01d4f9f1b3486b"/>
+    <w:p>
+      <w:pPr>
+        <w:pStyle w:val="Heading4"/>
+      </w:pPr>
+      <w:r>
+        <w:t xml:space="preserve">4.5.2.5 NVD Enrichment</w:t>
+      </w:r>
+    </w:p>
+    <w:p>
+      <w:pPr>
+        <w:pStyle w:val="FirstParagraph"/>
+      </w:pPr>
+      <w:r>
+        <w:t xml:space="preserve">For findings that carry a CVE identifier, the NVD enrichment engine fills the authoritative CVSS vector and back-fills a weakness class from the National Vulnerability Database — working entirely offline from local compressed feeds. Figure 4.17 shows the CWE extraction and the streaming feed reader.</w:t>
+      </w:r>
+    </w:p>
+    <w:p>
+      <w:pPr>
+        <w:pStyle w:val="BodyText"/>
+      </w:pPr>
+      <w:r>
+        <w:drawing>
+          <wp:inline>
+            <wp:extent cx="5334000" cy="5219732"/>
+            <wp:effectExtent b="0" l="0" r="0" t="0"/>
+            <wp:docPr descr="NVD CWE extraction and streaming feed reader" title="" id="85" name="Picture"/>
+            <a:graphic>
+              <a:graphicData uri="http://schemas.openxmlformats.org/drawingml/2006/picture">
+                <pic:pic>
+                  <pic:nvPicPr>
+                    <pic:cNvPr descr="images/code-nvd.png" id="86" name="Picture"/>
+                    <pic:cNvPicPr>
+                      <a:picLocks noChangeArrowheads="1" noChangeAspect="1"/>
+                    </pic:cNvPicPr>
+                  </pic:nvPicPr>
+                  <pic:blipFill>
+                    <a:blip r:embed="rId84"/>
+                    <a:stretch>
+                      <a:fillRect/>
+                    </a:stretch>
+                  </pic:blipFill>
+                  <pic:spPr bwMode="auto">
+                    <a:xfrm>
+                      <a:off x="0" y="0"/>
+                      <a:ext cx="5334000" cy="5219732"/>
+                    </a:xfrm>
+                    <a:prstGeom prst="rect">
+                      <a:avLst/>
+                    </a:prstGeom>
+                    <a:noFill/>
+                    <a:ln w="9525">
+                      <a:noFill/>
+                      <a:headEnd/>
+                      <a:tailEnd/>
+                    </a:ln>
+                  </pic:spPr>
+                </pic:pic>
+              </a:graphicData>
+            </a:graphic>
+          </wp:inline>
+        </w:drawing>
+      </w:r>
+    </w:p>
+    <w:p>
+      <w:pPr>
+        <w:pStyle w:val="BodyText"/>
+      </w:pPr>
+      <w:r>
+        <w:rPr>
+          <w:b/>
+          <w:bCs/>
+        </w:rPr>
+        <w:t xml:space="preserve">Figure 4.17: NVD Enrichment — CWE Back-fill and .xz Streaming (nvd_enrichment.py)</w:t>
+      </w:r>
+    </w:p>
+    <w:p>
+      <w:pPr>
+        <w:pStyle w:val="BodyText"/>
+      </w:pPr>
+      <w:r>
+        <w:rPr>
+          <w:rStyle w:val="VerbatimChar"/>
+        </w:rPr>
+        <w:t xml:space="preserve">_cwe_from_weaknesses</w:t>
+      </w:r>
+      <w:r>
+        <w:t xml:space="preserve"> </w:t>
+      </w:r>
+      <w:r>
+        <w:t xml:space="preserve">extracts a</w:t>
+      </w:r>
+      <w:r>
+        <w:t xml:space="preserve"> </w:t>
+      </w:r>
+      <w:r>
+        <w:rPr>
+          <w:rStyle w:val="VerbatimChar"/>
+        </w:rPr>
+        <w:t xml:space="preserve">CWE-NNN</w:t>
+      </w:r>
+      <w:r>
+        <w:t xml:space="preserve"> </w:t>
+      </w:r>
+      <w:r>
+        <w:t xml:space="preserve">identifier from the NVD record's</w:t>
+      </w:r>
+      <w:r>
+        <w:t xml:space="preserve"> </w:t>
+      </w:r>
+      <w:r>
+        <w:rPr>
+          <w:rStyle w:val="VerbatimChar"/>
+        </w:rPr>
+        <w:t xml:space="preserve">weaknesses</w:t>
+      </w:r>
+      <w:r>
+        <w:t xml:space="preserve"> </w:t>
+      </w:r>
+      <w:r>
+        <w:t xml:space="preserve">block, preferring the entry marked "Primary" and ignoring non-CWE markers.</w:t>
+      </w:r>
+      <w:r>
+        <w:t xml:space="preserve"> </w:t>
+      </w:r>
+      <w:r>
+        <w:rPr>
+          <w:rStyle w:val="VerbatimChar"/>
+        </w:rPr>
+        <w:t xml:space="preserve">_scan_feed</w:t>
+      </w:r>
+      <w:r>
+        <w:t xml:space="preserve"> </w:t>
+      </w:r>
+      <w:r>
+        <w:t xml:space="preserve">reads the feeds with the</w:t>
+      </w:r>
+      <w:r>
+        <w:t xml:space="preserve"> </w:t>
+      </w:r>
+      <w:r>
+        <w:rPr>
+          <w:rStyle w:val="VerbatimChar"/>
+        </w:rPr>
+        <w:t xml:space="preserve">ijson</w:t>
+      </w:r>
+      <w:r>
+        <w:t xml:space="preserve"> </w:t>
+      </w:r>
+      <w:r>
+        <w:t xml:space="preserve">streaming parser directly from their compressed</w:t>
+      </w:r>
+      <w:r>
+        <w:t xml:space="preserve"> </w:t>
+      </w:r>
+      <w:r>
+        <w:rPr>
+          <w:rStyle w:val="VerbatimChar"/>
+        </w:rPr>
+        <w:t xml:space="preserve">.xz</w:t>
+      </w:r>
+      <w:r>
+        <w:t xml:space="preserve"> </w:t>
+      </w:r>
+      <w:r>
+        <w:t xml:space="preserve">form, keeping only the CVE identifiers actually being looked up. This constant-memory approach is a deliberate constraint: the feeds contain over one hundred thousand records and must never be decompressed to disk, so streaming is the only viable technique. The live NVD API is retained only as a fallback when a CVE is absent from the local feeds.</w:t>
+      </w:r>
+    </w:p>
+    <w:bookmarkEnd w:id="87"/>
+    <w:bookmarkStart w:id="91" w:name="X7238be38575327c7928f0732eaa64031f17a4ad"/>
+    <w:p>
+      <w:pPr>
+        <w:pStyle w:val="Heading4"/>
+      </w:pPr>
+      <w:r>
+        <w:t xml:space="preserve">4.5.2.6 CWE→CVSS Enrichment</w:t>
+      </w:r>
+    </w:p>
+    <w:p>
+      <w:pPr>
+        <w:pStyle w:val="FirstParagraph"/>
+      </w:pPr>
+      <w:r>
+        <w:t xml:space="preserve">Web-application findings frequently have a weakness class but no CVSS vector, which would leave the machine-learning model with an all-zero feature vector. This engine derives a plausible, data-driven vector from the CWE. Figure 4.18 shows the enrichment method.</w:t>
+      </w:r>
+    </w:p>
+    <w:p>
+      <w:pPr>
+        <w:pStyle w:val="BodyText"/>
+      </w:pPr>
+      <w:r>
+        <w:drawing>
+          <wp:inline>
+            <wp:extent cx="5334000" cy="2756442"/>
+            <wp:effectExtent b="0" l="0" r="0" t="0"/>
+            <wp:docPr descr="CWE-to-CVSS vector inference" title="" id="89" name="Picture"/>
+            <a:graphic>
+              <a:graphicData uri="http://schemas.openxmlformats.org/drawingml/2006/picture">
+                <pic:pic>
+                  <pic:nvPicPr>
+                    <pic:cNvPr descr="images/code-cwe-cvss.png" id="90" name="Picture"/>
+                    <pic:cNvPicPr>
+                      <a:picLocks noChangeArrowheads="1" noChangeAspect="1"/>
+                    </pic:cNvPicPr>
+                  </pic:nvPicPr>
+                  <pic:blipFill>
+                    <a:blip r:embed="rId88"/>
+                    <a:stretch>
+                      <a:fillRect/>
+                    </a:stretch>
+                  </pic:blipFill>
+                  <pic:spPr bwMode="auto">
+                    <a:xfrm>
+                      <a:off x="0" y="0"/>
+                      <a:ext cx="5334000" cy="2756442"/>
+                    </a:xfrm>
+                    <a:prstGeom prst="rect">
+                      <a:avLst/>
+                    </a:prstGeom>
+                    <a:noFill/>
+                    <a:ln w="9525">
+                      <a:noFill/>
+                      <a:headEnd/>
+                      <a:tailEnd/>
+                    </a:ln>
+                  </pic:spPr>
+                </pic:pic>
+              </a:graphicData>
+            </a:graphic>
+          </wp:inline>
+        </w:drawing>
+      </w:r>
+    </w:p>
+    <w:p>
+      <w:pPr>
+        <w:pStyle w:val="BodyText"/>
+      </w:pPr>
+      <w:r>
+        <w:rPr>
+          <w:b/>
+          <w:bCs/>
+        </w:rPr>
+        <w:t xml:space="preserve">Figure 4.18: CWE→CVSS Vector Inference (cwe_cvss_enrichment.py)</w:t>
+      </w:r>
+    </w:p>
+    <w:p>
+      <w:pPr>
+        <w:pStyle w:val="BodyText"/>
+      </w:pPr>
+      <w:r>
+        <w:rPr>
+          <w:rStyle w:val="VerbatimChar"/>
+        </w:rPr>
+        <w:t xml:space="preserve">enrich_finding</w:t>
+      </w:r>
+      <w:r>
+        <w:t xml:space="preserve"> </w:t>
+      </w:r>
+      <w:r>
+        <w:t xml:space="preserve">acts only when</w:t>
+      </w:r>
+      <w:r>
+        <w:t xml:space="preserve"> </w:t>
+      </w:r>
+      <w:r>
+        <w:rPr>
+          <w:rStyle w:val="VerbatimChar"/>
+        </w:rPr>
+        <w:t xml:space="preserve">attack_vector</w:t>
+      </w:r>
+      <w:r>
+        <w:t xml:space="preserve"> </w:t>
+      </w:r>
+      <w:r>
+        <w:t xml:space="preserve">is still unset, so a genuine vector supplied by a scanner or by NVD always takes precedence. It looks up a modal CVSS vector for the finding's CWE — mined offline from the NVD feeds — applies the individual sub-metrics to the finding, and flags</w:t>
+      </w:r>
+      <w:r>
+        <w:t xml:space="preserve"> </w:t>
+      </w:r>
+      <w:r>
+        <w:rPr>
+          <w:rStyle w:val="VerbatimChar"/>
+        </w:rPr>
+        <w:t xml:space="preserve">_vector_inferred</w:t>
+      </w:r>
+      <w:r>
+        <w:t xml:space="preserve"> </w:t>
+      </w:r>
+      <w:r>
+        <w:t xml:space="preserve">so that the provenance of the vector is recorded and can be noted in the confidence rationale. This step is what allows a vector-less ZAP finding such as a SQL injection to be prioritised as High by the model rather than defaulting to Low.</w:t>
+      </w:r>
+    </w:p>
+    <w:bookmarkEnd w:id="91"/>
+    <w:bookmarkStart w:id="101" w:name="Xbd3597ea3cf465b4e44519a10656f9ef4af3d85"/>
+    <w:p>
+      <w:pPr>
+        <w:pStyle w:val="Heading4"/>
+      </w:pPr>
+      <w:r>
+        <w:t xml:space="preserve">4.5.2.7 Machine-Learning Prioritisation</w:t>
+      </w:r>
+    </w:p>
+    <w:p>
+      <w:pPr>
+        <w:pStyle w:val="FirstParagraph"/>
+      </w:pPr>
+      <w:r>
+        <w:t xml:space="preserve">The prioritiser is a</w:t>
+      </w:r>
+      <w:r>
+        <w:t xml:space="preserve"> </w:t>
+      </w:r>
+      <w:r>
+        <w:rPr>
+          <w:b/>
+          <w:bCs/>
+        </w:rPr>
+        <w:t xml:space="preserve">Random Forest implemented in pure NumPy</w:t>
+      </w:r>
+      <w:r>
+        <w:t xml:space="preserve">, so that inference at run time requires only NumPy and not the heavier scikit-learn stack (which is used only during training). It is trained on</w:t>
+      </w:r>
+      <w:r>
+        <w:t xml:space="preserve"> </w:t>
+      </w:r>
+      <w:r>
+        <w:rPr>
+          <w:b/>
+          <w:bCs/>
+        </w:rPr>
+        <w:t xml:space="preserve">108,495</w:t>
+      </w:r>
+      <w:r>
+        <w:t xml:space="preserve"> </w:t>
+      </w:r>
+      <w:r>
+        <w:t xml:space="preserve">real CVSS-v3 records drawn from the National Vulnerability Database JSON feeds for 2023–2025, and predicts the severity band from the eight CVSS sub-metrics and the CWE. On a held-out set of 21,697 real records the model achieves an</w:t>
       </w:r>
       <w:r>
         <w:t xml:space="preserve"> </w:t>
@@ -4341,23 +5173,7 @@
         <w:t xml:space="preserve">accuracy of 0.9968 and a macro-averaged F1 of 0.9941</w:t>
       </w:r>
       <w:r>
-        <w:t xml:space="preserve">, with all misclassifications falling on adjacent severity bands rather than being gross errors.</w:t>
-      </w:r>
-    </w:p>
-    <w:p>
-      <w:pPr>
-        <w:pStyle w:val="BodyText"/>
-      </w:pPr>
-      <w:r>
-        <w:t xml:space="preserve">An honest limitation is stated for completeness: the CVSS base score is a deterministic function of its sub-metrics, so this task is close to deterministic and the model is effectively relearning the CVSS scoring formula. The high accuracy is therefore legitimate (there is no leakage) but reflects the near-deterministic nature of the task. The genuinely novel analytical contribution of the project is not this prioritiser but the Confidence Engine described next, which predicts something CVSS cannot express — the probability that a finding is a true positive.</w:t>
-      </w:r>
-    </w:p>
-    <w:p>
-      <w:pPr>
-        <w:pStyle w:val="BodyText"/>
-      </w:pPr>
-      <w:r>
-        <w:t xml:space="preserve">Table 4.1 lists the tools and libraries used to build and run the model.</w:t>
+        <w:t xml:space="preserve">. Table 4.1 lists the tools and libraries used to build and run it.</w:t>
       </w:r>
     </w:p>
     <w:tbl>
@@ -4509,7 +5325,7 @@
               <w:pStyle w:val="Compact"/>
             </w:pPr>
             <w:r>
-              <w:t xml:space="preserve">Streams the compressed NVD JSON feeds with constant memory during training and enrichment.</w:t>
+              <w:t xml:space="preserve">Streams the compressed NVD JSON feeds with constant memory during training.</w:t>
             </w:r>
           </w:p>
         </w:tc>
@@ -4590,19 +5406,7 @@
         <w:t xml:space="preserve">which inputs it is permitted to see</w:t>
       </w:r>
       <w:r>
-        <w:t xml:space="preserve">. Figure 4.13 shows the feature definition in</w:t>
-      </w:r>
-      <w:r>
-        <w:t xml:space="preserve"> </w:t>
-      </w:r>
-      <w:r>
-        <w:rPr>
-          <w:rStyle w:val="VerbatimChar"/>
-        </w:rPr>
-        <w:t xml:space="preserve">predictor.py</w:t>
-      </w:r>
-      <w:r>
-        <w:t xml:space="preserve">. The model is given the eight CVSS v3 sub-metrics (attack vector, attack complexity, privileges required, user interaction, scope, and the three impact metrics) together with the numeric CWE identifier — nine features in total — but it is deliberately</w:t>
+        <w:t xml:space="preserve">. Figure 4.19 shows the feature definition. The model is given the eight CVSS v3 sub-metrics together with the numeric CWE identifier — nine features in total — but it is deliberately</w:t>
       </w:r>
       <w:r>
         <w:t xml:space="preserve"> </w:t>
@@ -4646,18 +5450,18 @@
           <wp:inline>
             <wp:extent cx="5334000" cy="1942011"/>
             <wp:effectExtent b="0" l="0" r="0" t="0"/>
-            <wp:docPr descr="Feature definition excluding the CVSS base score" title="" id="70" name="Picture"/>
+            <wp:docPr descr="Feature definition excluding the CVSS base score" title="" id="93" name="Picture"/>
             <a:graphic>
               <a:graphicData uri="http://schemas.openxmlformats.org/drawingml/2006/picture">
                 <pic:pic>
                   <pic:nvPicPr>
-                    <pic:cNvPr descr="images/code-ml-features.png" id="71" name="Picture"/>
+                    <pic:cNvPr descr="images/code-ml-features.png" id="94" name="Picture"/>
                     <pic:cNvPicPr>
                       <a:picLocks noChangeArrowheads="1" noChangeAspect="1"/>
                     </pic:cNvPicPr>
                   </pic:nvPicPr>
                   <pic:blipFill>
-                    <a:blip r:embed="rId69"/>
+                    <a:blip r:embed="rId92"/>
                     <a:stretch>
                       <a:fillRect/>
                     </a:stretch>
@@ -4693,7 +5497,7 @@
           <w:b/>
           <w:bCs/>
         </w:rPr>
-        <w:t xml:space="preserve">Figure 4.13: Feature Definition (predictor.py) — the CVSS base score is deliberately excluded to prevent target leakage</w:t>
+        <w:t xml:space="preserve">Figure 4.19: Feature Definition (predictor.py) — the CVSS base score is deliberately excluded to prevent target leakage</w:t>
       </w:r>
     </w:p>
     <w:p>
@@ -4711,7 +5515,7 @@
         <w:t xml:space="preserve"> </w:t>
       </w:r>
       <w:r>
-        <w:t xml:space="preserve">Figure 4.14 shows how a stored finding is converted into a feature vector and classified. The</w:t>
+        <w:t xml:space="preserve">Figure 4.20 shows how a stored finding is converted into a feature vector and classified. The</w:t>
       </w:r>
       <w:r>
         <w:t xml:space="preserve"> </w:t>
@@ -4726,7 +5530,7 @@
         <w:t xml:space="preserve"> </w:t>
       </w:r>
       <w:r>
-        <w:t xml:space="preserve">method encodes each categorical CVSS sub-metric into an integer using a fixed mapping and extracts the numeric part of the CWE identifier; if the structured CWE is missing, it falls back to a keyword lookup on the finding's title and description, so that even a bare web finding yields usable features rather than an all-zero vector. The</w:t>
+        <w:t xml:space="preserve">method encodes each categorical CVSS sub-metric into an integer using a fixed mapping and extracts the numeric part of the CWE identifier; if the structured CWE is missing, it falls back to a keyword lookup so that even a bare web finding yields usable features. The</w:t>
       </w:r>
       <w:r>
         <w:t xml:space="preserve"> </w:t>
@@ -4741,7 +5545,7 @@
         <w:t xml:space="preserve"> </w:t>
       </w:r>
       <w:r>
-        <w:t xml:space="preserve">method then loads the serialised model once, wraps the feature vector in a NumPy array, and calls the forest's</w:t>
+        <w:t xml:space="preserve">method loads the serialised model once, wraps the feature vector in a NumPy array, and calls the forest's</w:t>
       </w:r>
       <w:r>
         <w:t xml:space="preserve"> </w:t>
@@ -4771,7 +5575,7 @@
         <w:t xml:space="preserve"> </w:t>
       </w:r>
       <w:r>
-        <w:t xml:space="preserve">methods to obtain both the predicted severity band and the per-class probabilities. The probabilities are persisted alongside the prediction so that the interface can display the model's confidence in each band, as seen in the "ML Priority Prediction" panel of the finding-detail screen (Figure 4.24).</w:t>
+        <w:t xml:space="preserve">methods to obtain both the predicted severity band and the per-class probabilities, which are persisted so that the interface can display the model's confidence in each band (the "ML Priority Prediction" panel of Figure 4.35).</w:t>
       </w:r>
     </w:p>
     <w:p>
@@ -4783,18 +5587,18 @@
           <wp:inline>
             <wp:extent cx="5334000" cy="4375870"/>
             <wp:effectExtent b="0" l="0" r="0" t="0"/>
-            <wp:docPr descr="Feature extraction and prediction" title="" id="73" name="Picture"/>
+            <wp:docPr descr="Feature extraction and prediction" title="" id="96" name="Picture"/>
             <a:graphic>
               <a:graphicData uri="http://schemas.openxmlformats.org/drawingml/2006/picture">
                 <pic:pic>
                   <pic:nvPicPr>
-                    <pic:cNvPr descr="images/code-ml-inference.png" id="74" name="Picture"/>
+                    <pic:cNvPr descr="images/code-ml-inference.png" id="97" name="Picture"/>
                     <pic:cNvPicPr>
                       <a:picLocks noChangeArrowheads="1" noChangeAspect="1"/>
                     </pic:cNvPicPr>
                   </pic:nvPicPr>
                   <pic:blipFill>
-                    <a:blip r:embed="rId72"/>
+                    <a:blip r:embed="rId95"/>
                     <a:stretch>
                       <a:fillRect/>
                     </a:stretch>
@@ -4830,41 +5634,25 @@
           <w:b/>
           <w:bCs/>
         </w:rPr>
-        <w:t xml:space="preserve">Figure 4.14: Feature Extraction and Prediction (predictor.py)</w:t>
-      </w:r>
-    </w:p>
-    <w:bookmarkEnd w:id="75"/>
-    <w:bookmarkStart w:id="85" w:name="X41ec9e93018ee17147604b600ccaf079d47cba3"/>
-    <w:p>
-      <w:pPr>
-        <w:pStyle w:val="Heading3"/>
-      </w:pPr>
-      <w:r>
-        <w:t xml:space="preserve">4.5.4 Confidence Scoring in Detail</w:t>
-      </w:r>
-    </w:p>
-    <w:p>
-      <w:pPr>
-        <w:pStyle w:val="FirstParagraph"/>
-      </w:pPr>
-      <w:r>
-        <w:t xml:space="preserve">The Confidence Engine is the system's central innovation. It answers a different question from severity:</w:t>
-      </w:r>
-      <w:r>
-        <w:t xml:space="preserve"> </w:t>
-      </w:r>
-      <w:r>
-        <w:rPr>
-          <w:b/>
-          <w:bCs/>
-        </w:rPr>
-        <w:t xml:space="preserve">how likely is it that this finding is a genuine, actionable vulnerability rather than noise?</w:t>
-      </w:r>
-      <w:r>
-        <w:t xml:space="preserve"> </w:t>
-      </w:r>
-      <w:r>
-        <w:t xml:space="preserve">It computes a weighted score from six</w:t>
+        <w:t xml:space="preserve">Figure 4.20: Feature Extraction and Prediction (predictor.py)</w:t>
+      </w:r>
+    </w:p>
+    <w:p>
+      <w:pPr>
+        <w:pStyle w:val="BodyText"/>
+      </w:pPr>
+      <w:r>
+        <w:rPr>
+          <w:b/>
+          <w:bCs/>
+        </w:rPr>
+        <w:t xml:space="preserve">Training.</w:t>
+      </w:r>
+      <w:r>
+        <w:t xml:space="preserve"> </w:t>
+      </w:r>
+      <w:r>
+        <w:t xml:space="preserve">Figure 4.21 shows the core of the training routine. The real records are split into training and test sets</w:t>
       </w:r>
       <w:r>
         <w:t xml:space="preserve"> </w:t>
@@ -4874,13 +5662,130 @@
           <w:i/>
           <w:iCs/>
         </w:rPr>
+        <w:t xml:space="preserve">before</w:t>
+      </w:r>
+      <w:r>
+        <w:t xml:space="preserve"> </w:t>
+      </w:r>
+      <w:r>
+        <w:t xml:space="preserve">any synthetic balancing is applied, so that oversampled near-duplicates can never leak across the split and inflate the reported accuracy; the label is the severity band mapped from the CVSS score; the NumPy Random Forest is then fitted on the training features; and — critically — it is evaluated on the untouched real held-out rows, which is what makes the reported accuracy trustworthy.</w:t>
+      </w:r>
+    </w:p>
+    <w:p>
+      <w:pPr>
+        <w:pStyle w:val="BodyText"/>
+      </w:pPr>
+      <w:r>
+        <w:drawing>
+          <wp:inline>
+            <wp:extent cx="5334000" cy="4266391"/>
+            <wp:effectExtent b="0" l="0" r="0" t="0"/>
+            <wp:docPr descr="Random Forest training with a leakage-safe split" title="" id="99" name="Picture"/>
+            <a:graphic>
+              <a:graphicData uri="http://schemas.openxmlformats.org/drawingml/2006/picture">
+                <pic:pic>
+                  <pic:nvPicPr>
+                    <pic:cNvPr descr="images/code-ml-trainer.png" id="100" name="Picture"/>
+                    <pic:cNvPicPr>
+                      <a:picLocks noChangeArrowheads="1" noChangeAspect="1"/>
+                    </pic:cNvPicPr>
+                  </pic:nvPicPr>
+                  <pic:blipFill>
+                    <a:blip r:embed="rId98"/>
+                    <a:stretch>
+                      <a:fillRect/>
+                    </a:stretch>
+                  </pic:blipFill>
+                  <pic:spPr bwMode="auto">
+                    <a:xfrm>
+                      <a:off x="0" y="0"/>
+                      <a:ext cx="5334000" cy="4266391"/>
+                    </a:xfrm>
+                    <a:prstGeom prst="rect">
+                      <a:avLst/>
+                    </a:prstGeom>
+                    <a:noFill/>
+                    <a:ln w="9525">
+                      <a:noFill/>
+                      <a:headEnd/>
+                      <a:tailEnd/>
+                    </a:ln>
+                  </pic:spPr>
+                </pic:pic>
+              </a:graphicData>
+            </a:graphic>
+          </wp:inline>
+        </w:drawing>
+      </w:r>
+    </w:p>
+    <w:p>
+      <w:pPr>
+        <w:pStyle w:val="BodyText"/>
+      </w:pPr>
+      <w:r>
+        <w:rPr>
+          <w:b/>
+          <w:bCs/>
+        </w:rPr>
+        <w:t xml:space="preserve">Figure 4.21: Model Training — Leakage-Safe Split and Fit (model_trainer.py)</w:t>
+      </w:r>
+    </w:p>
+    <w:p>
+      <w:pPr>
+        <w:pStyle w:val="BodyText"/>
+      </w:pPr>
+      <w:r>
+        <w:t xml:space="preserve">An honest limitation is stated for completeness: the CVSS base score is a deterministic function of its sub-metrics, so this task is close to deterministic and the model is effectively relearning the CVSS scoring formula. The high accuracy is therefore legitimate (there is no leakage) but reflects the near-deterministic nature of the task. The genuinely novel analytical contribution is the Confidence Engine described next, which predicts something CVSS cannot express — the probability that a finding is a true positive.</w:t>
+      </w:r>
+    </w:p>
+    <w:bookmarkEnd w:id="101"/>
+    <w:bookmarkStart w:id="111" w:name="Xb876a7173b23e144718db5730c7d0b5f52e5ef0"/>
+    <w:p>
+      <w:pPr>
+        <w:pStyle w:val="Heading4"/>
+      </w:pPr>
+      <w:r>
+        <w:t xml:space="preserve">4.5.2.8 Confidence Scoring</w:t>
+      </w:r>
+    </w:p>
+    <w:p>
+      <w:pPr>
+        <w:pStyle w:val="FirstParagraph"/>
+      </w:pPr>
+      <w:r>
+        <w:t xml:space="preserve">The Confidence Engine is the system's central innovation. It answers a different question from severity:</w:t>
+      </w:r>
+      <w:r>
+        <w:t xml:space="preserve"> </w:t>
+      </w:r>
+      <w:r>
+        <w:rPr>
+          <w:b/>
+          <w:bCs/>
+        </w:rPr>
+        <w:t xml:space="preserve">how likely is it that this finding is a genuine, actionable vulnerability rather than noise?</w:t>
+      </w:r>
+      <w:r>
+        <w:t xml:space="preserve"> </w:t>
+      </w:r>
+      <w:r>
+        <w:t xml:space="preserve">It computes a weighted score from six</w:t>
+      </w:r>
+      <w:r>
+        <w:t xml:space="preserve"> </w:t>
+      </w:r>
+      <w:r>
+        <w:rPr>
+          <w:i/>
+          <w:iCs/>
+        </w:rPr>
         <w:t xml:space="preserve">reliability</w:t>
       </w:r>
       <w:r>
         <w:t xml:space="preserve"> </w:t>
       </w:r>
       <w:r>
-        <w:t xml:space="preserve">factors, whose weights sum to 100. Table 4.2 lists the factors, their weights, and what each measures.</w:t>
+        <w:t xml:space="preserve">factors, whose weights sum to 100. Table 4.2 lists the factors and what each measures.</w:t>
       </w:r>
     </w:p>
     <w:tbl>
@@ -5237,7 +6142,7 @@
         <w:t xml:space="preserve"> </w:t>
       </w:r>
       <w:r>
-        <w:t xml:space="preserve">Figure 4.15 shows the core of the scoring method. Each factor returns a raw score in the range 0–100; the total is the weighted sum of those raw scores (each divided by 100 and multiplied by its weight), capped to the 0–100 range. Two overrides then apply. First, if any</w:t>
+        <w:t xml:space="preserve">Figure 4.22 shows the core of the scoring method. Each factor returns a raw score in the range 0–100; the total is the weighted sum of those raw scores, capped to the 0–100 range. Two overrides then apply. First, if any</w:t>
       </w:r>
       <w:r>
         <w:t xml:space="preserve"> </w:t>
@@ -5269,7 +6174,7 @@
         <w:t xml:space="preserve"> </w:t>
       </w:r>
       <w:r>
-        <w:t xml:space="preserve">and the score is rescaled into the 70–100 band — but note the deliberate restriction to strong, type-matched check types, so that a generic input reflection or a server-banner match cannot spuriously confirm a finding. Second, a scanner-rated</w:t>
+        <w:t xml:space="preserve">and the score is rescaled into the 70–100 band — with the deliberate restriction to strong, type-matched check types, so that a generic input reflection cannot spuriously confirm a finding. Second, a scanner-rated</w:t>
       </w:r>
       <w:r>
         <w:t xml:space="preserve"> </w:t>
@@ -5285,7 +6190,7 @@
         <w:t xml:space="preserve"> </w:t>
       </w:r>
       <w:r>
-        <w:t xml:space="preserve">finding is bucketed as "Informational" rather than being given a true-or-false verdict, because such findings (technology or version detection) are not vulnerabilities to confirm or deny. Otherwise the numeric score is mapped to a classification by the threshold function.</w:t>
+        <w:t xml:space="preserve">finding is bucketed as "Informational" rather than given a true-or-false verdict. Otherwise the numeric score is mapped to a classification by the threshold function.</w:t>
       </w:r>
     </w:p>
     <w:p>
@@ -5297,18 +6202,18 @@
           <wp:inline>
             <wp:extent cx="5334000" cy="3604666"/>
             <wp:effectExtent b="0" l="0" r="0" t="0"/>
-            <wp:docPr descr="Weighted scoring, PoC override, and classification" title="" id="77" name="Picture"/>
+            <wp:docPr descr="Weighted scoring, PoC override, and classification" title="" id="103" name="Picture"/>
             <a:graphic>
               <a:graphicData uri="http://schemas.openxmlformats.org/drawingml/2006/picture">
                 <pic:pic>
                   <pic:nvPicPr>
-                    <pic:cNvPr descr="images/code-confidence-score.png" id="78" name="Picture"/>
+                    <pic:cNvPr descr="images/code-confidence-score.png" id="104" name="Picture"/>
                     <pic:cNvPicPr>
                       <a:picLocks noChangeArrowheads="1" noChangeAspect="1"/>
                     </pic:cNvPicPr>
                   </pic:nvPicPr>
                   <pic:blipFill>
-                    <a:blip r:embed="rId76"/>
+                    <a:blip r:embed="rId102"/>
                     <a:stretch>
                       <a:fillRect/>
                     </a:stretch>
@@ -5344,7 +6249,7 @@
           <w:b/>
           <w:bCs/>
         </w:rPr>
-        <w:t xml:space="preserve">Figure 4.15: Confidence Scoring — Weights, Weighted Sum, and Overrides (confidence_engine.py)</w:t>
+        <w:t xml:space="preserve">Figure 4.22: Confidence Scoring — Weights, Weighted Sum, and Overrides (confidence_engine.py)</w:t>
       </w:r>
     </w:p>
     <w:p>
@@ -5362,7 +6267,7 @@
         <w:t xml:space="preserve"> </w:t>
       </w:r>
       <w:r>
-        <w:t xml:space="preserve">Figure 4.16 shows two representative factor methods together with the classification-threshold function. The scanner-agreement factor scales with the number of corroborating scanners — a single scanner scores partially, whereas two or more score highly — and it returns a human-readable</w:t>
+        <w:t xml:space="preserve">Figure 4.23 shows two representative factor methods and the classification-threshold function. The scanner-agreement factor scales with the number of corroborating scanners and returns a human-readable</w:t>
       </w:r>
       <w:r>
         <w:t xml:space="preserve"> </w:t>
@@ -5378,7 +6283,7 @@
         <w:t xml:space="preserve"> </w:t>
       </w:r>
       <w:r>
-        <w:t xml:space="preserve">string that becomes part of the finding's rationale. The CVE-availability factor is binary on the presence of a catalogued CVE. The</w:t>
+        <w:t xml:space="preserve">string; the CVE-availability factor is binary on the presence of a catalogued CVE; and</w:t>
       </w:r>
       <w:r>
         <w:t xml:space="preserve"> </w:t>
@@ -5393,46 +6298,7 @@
         <w:t xml:space="preserve"> </w:t>
       </w:r>
       <w:r>
-        <w:t xml:space="preserve">function applies the fixed thresholds — 70 and 40 — that separate</w:t>
-      </w:r>
-      <w:r>
-        <w:t xml:space="preserve"> </w:t>
-      </w:r>
-      <w:r>
-        <w:rPr>
-          <w:i/>
-          <w:iCs/>
-        </w:rPr>
-        <w:t xml:space="preserve">Confirmed</w:t>
-      </w:r>
-      <w:r>
-        <w:t xml:space="preserve">,</w:t>
-      </w:r>
-      <w:r>
-        <w:t xml:space="preserve"> </w:t>
-      </w:r>
-      <w:r>
-        <w:rPr>
-          <w:i/>
-          <w:iCs/>
-        </w:rPr>
-        <w:t xml:space="preserve">Needs Manual Verification</w:t>
-      </w:r>
-      <w:r>
-        <w:t xml:space="preserve">, and</w:t>
-      </w:r>
-      <w:r>
-        <w:t xml:space="preserve"> </w:t>
-      </w:r>
-      <w:r>
-        <w:rPr>
-          <w:i/>
-          <w:iCs/>
-        </w:rPr>
-        <w:t xml:space="preserve">Not Confirmed</w:t>
-      </w:r>
-      <w:r>
-        <w:t xml:space="preserve">. Because every factor returns both a raw score and a reason, the final verdict is fully explainable rather than a black-box number.</w:t>
+        <w:t xml:space="preserve">applies the fixed thresholds — 70 and 40 — that separate the three classifications. Because every factor returns both a raw score and a reason, the final verdict is fully explainable rather than a black-box number.</w:t>
       </w:r>
     </w:p>
     <w:p>
@@ -5444,18 +6310,18 @@
           <wp:inline>
             <wp:extent cx="5334000" cy="3200400"/>
             <wp:effectExtent b="0" l="0" r="0" t="0"/>
-            <wp:docPr descr="Example factor computations and the classification thresholds" title="" id="80" name="Picture"/>
+            <wp:docPr descr="Example factor computations and the classification thresholds" title="" id="106" name="Picture"/>
             <a:graphic>
               <a:graphicData uri="http://schemas.openxmlformats.org/drawingml/2006/picture">
                 <pic:pic>
                   <pic:nvPicPr>
-                    <pic:cNvPr descr="images/code-confidence-factor.png" id="81" name="Picture"/>
+                    <pic:cNvPr descr="images/code-confidence-factor.png" id="107" name="Picture"/>
                     <pic:cNvPicPr>
                       <a:picLocks noChangeArrowheads="1" noChangeAspect="1"/>
                     </pic:cNvPicPr>
                   </pic:nvPicPr>
                   <pic:blipFill>
-                    <a:blip r:embed="rId79"/>
+                    <a:blip r:embed="rId105"/>
                     <a:stretch>
                       <a:fillRect/>
                     </a:stretch>
@@ -5491,7 +6357,7 @@
           <w:b/>
           <w:bCs/>
         </w:rPr>
-        <w:t xml:space="preserve">Figure 4.16: Example Factor Computations and Classification Thresholds (confidence_engine.py)</w:t>
+        <w:t xml:space="preserve">Figure 4.23: Example Factor Computations and Classification Thresholds (confidence_engine.py)</w:t>
       </w:r>
     </w:p>
     <w:p>
@@ -5509,7 +6375,52 @@
         <w:t xml:space="preserve"> </w:t>
       </w:r>
       <w:r>
-        <w:t xml:space="preserve">Figure 4.17 shows the confidence panel from the interface for a confirmed SQL-injection finding, which makes the computation concrete.</w:t>
+        <w:t xml:space="preserve">Figure 4.24 shows the confidence panel from the interface for a confirmed SQL-injection finding, which makes the computation concrete. The finding scores</w:t>
+      </w:r>
+      <w:r>
+        <w:t xml:space="preserve"> </w:t>
+      </w:r>
+      <w:r>
+        <w:rPr>
+          <w:b/>
+          <w:bCs/>
+        </w:rPr>
+        <w:t xml:space="preserve">81.3/100</w:t>
+      </w:r>
+      <w:r>
+        <w:t xml:space="preserve"> </w:t>
+      </w:r>
+      <w:r>
+        <w:t xml:space="preserve">and is classified</w:t>
+      </w:r>
+      <w:r>
+        <w:t xml:space="preserve"> </w:t>
+      </w:r>
+      <w:r>
+        <w:rPr>
+          <w:i/>
+          <w:iCs/>
+        </w:rPr>
+        <w:t xml:space="preserve">Confirmed</w:t>
+      </w:r>
+      <w:r>
+        <w:t xml:space="preserve">; the rationale explains that a proof-of-concept check actively confirmed the vulnerability, which forced the classification and scaled the score into the 70–100 band. Each of the six factors is shown with its individual contribution, weight, and a plain-language reason. This per-factor transparency is exactly what allows an analyst to trust — or challenge — the automated verdict, and the same breakdown is embedded in the PDF report. On its curated evaluation benchmark, the engine achieves a ROC-AUC of approximately 0.82, a precision of 1.0 for the</w:t>
+      </w:r>
+      <w:r>
+        <w:t xml:space="preserve"> </w:t>
+      </w:r>
+      <w:r>
+        <w:rPr>
+          <w:i/>
+          <w:iCs/>
+        </w:rPr>
+        <w:t xml:space="preserve">Confirmed</w:t>
+      </w:r>
+      <w:r>
+        <w:t xml:space="preserve"> </w:t>
+      </w:r>
+      <w:r>
+        <w:t xml:space="preserve">classification, and roughly 81% suppression of false positives at the auto-dismiss threshold.</w:t>
       </w:r>
     </w:p>
     <w:p>
@@ -5521,18 +6432,18 @@
           <wp:inline>
             <wp:extent cx="5334000" cy="3036093"/>
             <wp:effectExtent b="0" l="0" r="0" t="0"/>
-            <wp:docPr descr="Confidence-score breakdown panel" title="" id="83" name="Picture"/>
+            <wp:docPr descr="Confidence-score breakdown panel" title="" id="109" name="Picture"/>
             <a:graphic>
               <a:graphicData uri="http://schemas.openxmlformats.org/drawingml/2006/picture">
                 <pic:pic>
                   <pic:nvPicPr>
-                    <pic:cNvPr descr="images/11-confidence-panel.png" id="84" name="Picture"/>
+                    <pic:cNvPr descr="images/11-confidence-panel.png" id="110" name="Picture"/>
                     <pic:cNvPicPr>
                       <a:picLocks noChangeArrowheads="1" noChangeAspect="1"/>
                     </pic:cNvPicPr>
                   </pic:nvPicPr>
                   <pic:blipFill>
-                    <a:blip r:embed="rId82"/>
+                    <a:blip r:embed="rId108"/>
                     <a:stretch>
                       <a:fillRect/>
                     </a:stretch>
@@ -5568,31 +6479,25 @@
           <w:b/>
           <w:bCs/>
         </w:rPr>
-        <w:t xml:space="preserve">Figure 4.17: Confidence-Score Breakdown (Finding Detail)</w:t>
-      </w:r>
-    </w:p>
-    <w:p>
-      <w:pPr>
-        <w:pStyle w:val="BodyText"/>
-      </w:pPr>
-      <w:r>
-        <w:t xml:space="preserve">Reading the panel, the finding scores</w:t>
-      </w:r>
-      <w:r>
-        <w:t xml:space="preserve"> </w:t>
-      </w:r>
-      <w:r>
-        <w:rPr>
-          <w:b/>
-          <w:bCs/>
-        </w:rPr>
-        <w:t xml:space="preserve">81.3/100</w:t>
-      </w:r>
-      <w:r>
-        <w:t xml:space="preserve"> </w:t>
-      </w:r>
-      <w:r>
-        <w:t xml:space="preserve">and is classified</w:t>
+        <w:t xml:space="preserve">Figure 4.24: Confidence-Score Breakdown (Finding Detail)</w:t>
+      </w:r>
+    </w:p>
+    <w:bookmarkEnd w:id="111"/>
+    <w:bookmarkStart w:id="115" w:name="X494fa9d2e84e76cabd26c06ff6352e957e43761"/>
+    <w:p>
+      <w:pPr>
+        <w:pStyle w:val="Heading4"/>
+      </w:pPr>
+      <w:r>
+        <w:t xml:space="preserve">4.5.2.9 PoC Validation</w:t>
+      </w:r>
+    </w:p>
+    <w:p>
+      <w:pPr>
+        <w:pStyle w:val="FirstParagraph"/>
+      </w:pPr>
+      <w:r>
+        <w:t xml:space="preserve">The optional PoC validator provides</w:t>
       </w:r>
       <w:r>
         <w:t xml:space="preserve"> </w:t>
@@ -5602,139 +6507,618 @@
           <w:i/>
           <w:iCs/>
         </w:rPr>
-        <w:t xml:space="preserve">Confirmed</w:t>
-      </w:r>
-      <w:r>
-        <w:t xml:space="preserve">. The rationale line explains that a proof-of-concept check actively confirmed the vulnerability, which forced the</w:t>
-      </w:r>
-      <w:r>
-        <w:t xml:space="preserve"> </w:t>
-      </w:r>
-      <w:r>
-        <w:rPr>
-          <w:i/>
-          <w:iCs/>
-        </w:rPr>
-        <w:t xml:space="preserve">Confirmed</w:t>
-      </w:r>
-      <w:r>
-        <w:t xml:space="preserve"> </w:t>
-      </w:r>
-      <w:r>
-        <w:t xml:space="preserve">classification and scaled the score into the 70–100 band. Below the rationale, each of the six factors is shown with its individual contribution and weight: the CWE-mapping factor contributes its full amount because the finding is classified as CWE-89; the PoC-validation factor contributes because one of the controlled checks confirmed; the scanner-agreement factor contributes a partial amount because only one scanner reported the issue; and the severity-consistency factor contributes because the machine-learning priority is close to the scanner's severity. The CVE- and exploit-availability factors contribute nothing here, because this web finding carries no CVE and no known public exploit. This per-factor transparency is exactly what allows an analyst to trust — or challenge — the automated verdict, and the same breakdown is embedded in the PDF report.</w:t>
-      </w:r>
-    </w:p>
-    <w:p>
-      <w:pPr>
-        <w:pStyle w:val="BodyText"/>
-      </w:pPr>
-      <w:r>
-        <w:t xml:space="preserve">On its curated evaluation benchmark, the Confidence Engine achieves a ROC-AUC of approximately 0.82, a precision of 1.0 for the</w:t>
-      </w:r>
-      <w:r>
-        <w:t xml:space="preserve"> </w:t>
-      </w:r>
-      <w:r>
-        <w:rPr>
-          <w:i/>
-          <w:iCs/>
-        </w:rPr>
-        <w:t xml:space="preserve">Confirmed</w:t>
-      </w:r>
-      <w:r>
-        <w:t xml:space="preserve"> </w:t>
-      </w:r>
-      <w:r>
-        <w:t xml:space="preserve">classification (it never wrongly confirmed a false positive in the benchmark), and roughly 81% suppression of false positives at the auto-dismiss threshold.</w:t>
-      </w:r>
-    </w:p>
-    <w:bookmarkEnd w:id="85"/>
-    <w:bookmarkStart w:id="86" w:name="Xaf1c0e46d15e41ac94286ca4982927ee0dd888e"/>
-    <w:p>
-      <w:pPr>
-        <w:pStyle w:val="Heading3"/>
-      </w:pPr>
-      <w:r>
-        <w:t xml:space="preserve">4.5.5 Report Generation</w:t>
-      </w:r>
-    </w:p>
-    <w:p>
-      <w:pPr>
-        <w:pStyle w:val="FirstParagraph"/>
-      </w:pPr>
-      <w:r>
-        <w:t xml:space="preserve">The final stage renders a professional PDF triage report suitable for handing to stakeholders. The report opens with a cover page carrying the report metadata and a severity summary (Figure 4.26), followed by an executive summary that narrates the scan and tabulates the classification and severity breakdowns (Figure 4.27), and then the per-finding detail including the confidence rationale. Because the report reads from the same normalised findings and confidence scores as the interface, the two views are always consistent.</w:t>
-      </w:r>
-    </w:p>
-    <w:p>
-      <w:r>
-        <w:pict>
-          <v:rect style="width:0;height:1.5pt" o:hralign="center" o:hrstd="t" o:hr="t"/>
-        </w:pict>
-      </w:r>
-    </w:p>
-    <w:bookmarkEnd w:id="86"/>
-    <w:bookmarkEnd w:id="87"/>
-    <w:bookmarkStart w:id="127" w:name="X54341d584745e7411aa4f4707f5121fcc739cb5"/>
-    <w:p>
-      <w:pPr>
-        <w:pStyle w:val="Heading2"/>
-      </w:pPr>
-      <w:r>
-        <w:t xml:space="preserve">4.6 Screenshot</w:t>
-      </w:r>
-    </w:p>
-    <w:p>
-      <w:pPr>
-        <w:pStyle w:val="FirstParagraph"/>
-      </w:pPr>
-      <w:r>
-        <w:t xml:space="preserve">This section presents annotated screenshots of the completed product with a justification for each. The screenshots were captured from the running web application driven against a triaged dataset produced by an Auto Scan of a local test target (OWASP Juice Shop), yielding sixteen findings of which four are</w:t>
-      </w:r>
-      <w:r>
-        <w:t xml:space="preserve"> </w:t>
-      </w:r>
-      <w:r>
-        <w:rPr>
-          <w:i/>
-          <w:iCs/>
-        </w:rPr>
-        <w:t xml:space="preserve">Confirmed</w:t>
-      </w:r>
-      <w:r>
-        <w:t xml:space="preserve">.</w:t>
-      </w:r>
-    </w:p>
-    <w:bookmarkStart w:id="91" w:name="X831bf8cb68fb81f8f88eb045a3d2ee1390654c7"/>
-    <w:p>
-      <w:pPr>
-        <w:pStyle w:val="Heading3"/>
-      </w:pPr>
-      <w:r>
-        <w:t xml:space="preserve">4.6.1 Login</w:t>
-      </w:r>
-    </w:p>
-    <w:p>
-      <w:pPr>
-        <w:pStyle w:val="FirstParagraph"/>
+        <w:t xml:space="preserve">active</w:t>
+      </w:r>
+      <w:r>
+        <w:t xml:space="preserve"> </w:t>
+      </w:r>
+      <w:r>
+        <w:t xml:space="preserve">confirmation by sending non-destructive requests to in-scope targets. Figure 4.25 shows the authorisation guard and an example check.</w:t>
+      </w:r>
+    </w:p>
+    <w:p>
+      <w:pPr>
+        <w:pStyle w:val="BodyText"/>
       </w:pPr>
       <w:r>
         <w:drawing>
           <wp:inline>
-            <wp:extent cx="5334000" cy="3189287"/>
+            <wp:extent cx="5334000" cy="3749643"/>
             <wp:effectExtent b="0" l="0" r="0" t="0"/>
-            <wp:docPr descr="Login screen" title="" id="89" name="Picture"/>
+            <wp:docPr descr="Scope guard and SQL-injection check" title="" id="113" name="Picture"/>
             <a:graphic>
               <a:graphicData uri="http://schemas.openxmlformats.org/drawingml/2006/picture">
                 <pic:pic>
                   <pic:nvPicPr>
-                    <pic:cNvPr descr="images/01-login.png" id="90" name="Picture"/>
+                    <pic:cNvPr descr="images/code-poc.png" id="114" name="Picture"/>
                     <pic:cNvPicPr>
                       <a:picLocks noChangeArrowheads="1" noChangeAspect="1"/>
                     </pic:cNvPicPr>
                   </pic:nvPicPr>
                   <pic:blipFill>
-                    <a:blip r:embed="rId88"/>
+                    <a:blip r:embed="rId112"/>
+                    <a:stretch>
+                      <a:fillRect/>
+                    </a:stretch>
+                  </pic:blipFill>
+                  <pic:spPr bwMode="auto">
+                    <a:xfrm>
+                      <a:off x="0" y="0"/>
+                      <a:ext cx="5334000" cy="3749643"/>
+                    </a:xfrm>
+                    <a:prstGeom prst="rect">
+                      <a:avLst/>
+                    </a:prstGeom>
+                    <a:noFill/>
+                    <a:ln w="9525">
+                      <a:noFill/>
+                      <a:headEnd/>
+                      <a:tailEnd/>
+                    </a:ln>
+                  </pic:spPr>
+                </pic:pic>
+              </a:graphicData>
+            </a:graphic>
+          </wp:inline>
+        </w:drawing>
+      </w:r>
+    </w:p>
+    <w:p>
+      <w:pPr>
+        <w:pStyle w:val="BodyText"/>
+      </w:pPr>
+      <w:r>
+        <w:rPr>
+          <w:b/>
+          <w:bCs/>
+        </w:rPr>
+        <w:t xml:space="preserve">Figure 4.25: PoC Validation — Scope Guard and SQLi Check (poc_validator.py)</w:t>
+      </w:r>
+    </w:p>
+    <w:p>
+      <w:pPr>
+        <w:pStyle w:val="BodyText"/>
+      </w:pPr>
+      <w:r>
+        <w:rPr>
+          <w:rStyle w:val="VerbatimChar"/>
+        </w:rPr>
+        <w:t xml:space="preserve">_in_scope</w:t>
+      </w:r>
+      <w:r>
+        <w:t xml:space="preserve"> </w:t>
+      </w:r>
+      <w:r>
+        <w:t xml:space="preserve">compares the finding's host against the operator-supplied authorised scope and suppresses any probe to an out-of-scope host — a responsible-tooling guard that ensures the system never sends traffic to a target the operator has not authorised.</w:t>
+      </w:r>
+      <w:r>
+        <w:t xml:space="preserve"> </w:t>
+      </w:r>
+      <w:r>
+        <w:rPr>
+          <w:rStyle w:val="VerbatimChar"/>
+        </w:rPr>
+        <w:t xml:space="preserve">_sqli_check</w:t>
+      </w:r>
+      <w:r>
+        <w:t xml:space="preserve"> </w:t>
+      </w:r>
+      <w:r>
+        <w:t xml:space="preserve">illustrates a validation: it sends benign, error-provoking payloads and inspects the response for SQL error signatures; a match returns a</w:t>
+      </w:r>
+      <w:r>
+        <w:t xml:space="preserve"> </w:t>
+      </w:r>
+      <w:r>
+        <w:rPr>
+          <w:rStyle w:val="VerbatimChar"/>
+        </w:rPr>
+        <w:t xml:space="preserve">confirmed</w:t>
+      </w:r>
+      <w:r>
+        <w:t xml:space="preserve"> </w:t>
+      </w:r>
+      <w:r>
+        <w:t xml:space="preserve">result, which the Confidence Engine treats as an override to</w:t>
+      </w:r>
+      <w:r>
+        <w:t xml:space="preserve"> </w:t>
+      </w:r>
+      <w:r>
+        <w:rPr>
+          <w:i/>
+          <w:iCs/>
+        </w:rPr>
+        <w:t xml:space="preserve">Confirmed</w:t>
+      </w:r>
+      <w:r>
+        <w:t xml:space="preserve">. All checks are read-only or time-based only — they never modify data.</w:t>
+      </w:r>
+    </w:p>
+    <w:bookmarkEnd w:id="115"/>
+    <w:bookmarkStart w:id="119" w:name="Xfe117651097e576d749c642613b36911366ebea"/>
+    <w:p>
+      <w:pPr>
+        <w:pStyle w:val="Heading4"/>
+      </w:pPr>
+      <w:r>
+        <w:t xml:space="preserve">4.5.2.10 Report Generation</w:t>
+      </w:r>
+    </w:p>
+    <w:p>
+      <w:pPr>
+        <w:pStyle w:val="FirstParagraph"/>
+      </w:pPr>
+      <w:r>
+        <w:t xml:space="preserve">The final stage renders a professional PDF triage report. Figure 4.26 shows the generation method.</w:t>
+      </w:r>
+    </w:p>
+    <w:p>
+      <w:pPr>
+        <w:pStyle w:val="BodyText"/>
+      </w:pPr>
+      <w:r>
+        <w:drawing>
+          <wp:inline>
+            <wp:extent cx="5334000" cy="3296643"/>
+            <wp:effectExtent b="0" l="0" r="0" t="0"/>
+            <wp:docPr descr="Report generation" title="" id="117" name="Picture"/>
+            <a:graphic>
+              <a:graphicData uri="http://schemas.openxmlformats.org/drawingml/2006/picture">
+                <pic:pic>
+                  <pic:nvPicPr>
+                    <pic:cNvPr descr="images/code-report.png" id="118" name="Picture"/>
+                    <pic:cNvPicPr>
+                      <a:picLocks noChangeArrowheads="1" noChangeAspect="1"/>
+                    </pic:cNvPicPr>
+                  </pic:nvPicPr>
+                  <pic:blipFill>
+                    <a:blip r:embed="rId116"/>
+                    <a:stretch>
+                      <a:fillRect/>
+                    </a:stretch>
+                  </pic:blipFill>
+                  <pic:spPr bwMode="auto">
+                    <a:xfrm>
+                      <a:off x="0" y="0"/>
+                      <a:ext cx="5334000" cy="3296643"/>
+                    </a:xfrm>
+                    <a:prstGeom prst="rect">
+                      <a:avLst/>
+                    </a:prstGeom>
+                    <a:noFill/>
+                    <a:ln w="9525">
+                      <a:noFill/>
+                      <a:headEnd/>
+                      <a:tailEnd/>
+                    </a:ln>
+                  </pic:spPr>
+                </pic:pic>
+              </a:graphicData>
+            </a:graphic>
+          </wp:inline>
+        </w:drawing>
+      </w:r>
+    </w:p>
+    <w:p>
+      <w:pPr>
+        <w:pStyle w:val="BodyText"/>
+      </w:pPr>
+      <w:r>
+        <w:rPr>
+          <w:b/>
+          <w:bCs/>
+        </w:rPr>
+        <w:t xml:space="preserve">Figure 4.26: Report Generation (report_generator.py)</w:t>
+      </w:r>
+    </w:p>
+    <w:p>
+      <w:pPr>
+        <w:pStyle w:val="BodyText"/>
+      </w:pPr>
+      <w:r>
+        <w:rPr>
+          <w:rStyle w:val="VerbatimChar"/>
+        </w:rPr>
+        <w:t xml:space="preserve">generate</w:t>
+      </w:r>
+      <w:r>
+        <w:t xml:space="preserve"> </w:t>
+      </w:r>
+      <w:r>
+        <w:t xml:space="preserve">loads the report record and its findings, marks the report as</w:t>
+      </w:r>
+      <w:r>
+        <w:t xml:space="preserve"> </w:t>
+      </w:r>
+      <w:r>
+        <w:rPr>
+          <w:i/>
+          <w:iCs/>
+        </w:rPr>
+        <w:t xml:space="preserve">generating</w:t>
+      </w:r>
+      <w:r>
+        <w:t xml:space="preserve">, builds the PDF document with the ReportLab library (delegating the layout to</w:t>
+      </w:r>
+      <w:r>
+        <w:t xml:space="preserve"> </w:t>
+      </w:r>
+      <w:r>
+        <w:rPr>
+          <w:rStyle w:val="VerbatimChar"/>
+        </w:rPr>
+        <w:t xml:space="preserve">_build_pdf</w:t>
+      </w:r>
+      <w:r>
+        <w:t xml:space="preserve">), and finally records the output file path and marks the report</w:t>
+      </w:r>
+      <w:r>
+        <w:t xml:space="preserve"> </w:t>
+      </w:r>
+      <w:r>
+        <w:rPr>
+          <w:i/>
+          <w:iCs/>
+        </w:rPr>
+        <w:t xml:space="preserve">completed</w:t>
+      </w:r>
+      <w:r>
+        <w:t xml:space="preserve">. Because the report reads from the same normalised findings and confidence scores as the interface, the on-screen and exported views are always consistent.</w:t>
+      </w:r>
+    </w:p>
+    <w:bookmarkEnd w:id="119"/>
+    <w:bookmarkEnd w:id="120"/>
+    <w:bookmarkStart w:id="124" w:name="X37b70d44e5d2782d7cd4cb819e29306febc6675"/>
+    <w:p>
+      <w:pPr>
+        <w:pStyle w:val="Heading3"/>
+      </w:pPr>
+      <w:r>
+        <w:t xml:space="preserve">4.5.3 Auto-Scan Orchestration</w:t>
+      </w:r>
+    </w:p>
+    <w:p>
+      <w:pPr>
+        <w:pStyle w:val="FirstParagraph"/>
+      </w:pPr>
+      <w:r>
+        <w:t xml:space="preserve">The optional Auto Scan layer drives the scanners itself before triaging their output. Figure 4.27 shows the orchestration loop.</w:t>
+      </w:r>
+    </w:p>
+    <w:p>
+      <w:pPr>
+        <w:pStyle w:val="BodyText"/>
+      </w:pPr>
+      <w:r>
+        <w:drawing>
+          <wp:inline>
+            <wp:extent cx="5334000" cy="2451831"/>
+            <wp:effectExtent b="0" l="0" r="0" t="0"/>
+            <wp:docPr descr="Auto-scan orchestration loop" title="" id="122" name="Picture"/>
+            <a:graphic>
+              <a:graphicData uri="http://schemas.openxmlformats.org/drawingml/2006/picture">
+                <pic:pic>
+                  <pic:nvPicPr>
+                    <pic:cNvPr descr="images/code-autoscan.png" id="123" name="Picture"/>
+                    <pic:cNvPicPr>
+                      <a:picLocks noChangeArrowheads="1" noChangeAspect="1"/>
+                    </pic:cNvPicPr>
+                  </pic:nvPicPr>
+                  <pic:blipFill>
+                    <a:blip r:embed="rId121"/>
+                    <a:stretch>
+                      <a:fillRect/>
+                    </a:stretch>
+                  </pic:blipFill>
+                  <pic:spPr bwMode="auto">
+                    <a:xfrm>
+                      <a:off x="0" y="0"/>
+                      <a:ext cx="5334000" cy="2451831"/>
+                    </a:xfrm>
+                    <a:prstGeom prst="rect">
+                      <a:avLst/>
+                    </a:prstGeom>
+                    <a:noFill/>
+                    <a:ln w="9525">
+                      <a:noFill/>
+                      <a:headEnd/>
+                      <a:tailEnd/>
+                    </a:ln>
+                  </pic:spPr>
+                </pic:pic>
+              </a:graphicData>
+            </a:graphic>
+          </wp:inline>
+        </w:drawing>
+      </w:r>
+    </w:p>
+    <w:p>
+      <w:pPr>
+        <w:pStyle w:val="BodyText"/>
+      </w:pPr>
+      <w:r>
+        <w:rPr>
+          <w:b/>
+          <w:bCs/>
+        </w:rPr>
+        <w:t xml:space="preserve">Figure 4.27: Auto-Scan Orchestration (auto_scan.py)</w:t>
+      </w:r>
+    </w:p>
+    <w:p>
+      <w:pPr>
+        <w:pStyle w:val="BodyText"/>
+      </w:pPr>
+      <w:r>
+        <w:t xml:space="preserve">The</w:t>
+      </w:r>
+      <w:r>
+        <w:t xml:space="preserve"> </w:t>
+      </w:r>
+      <w:r>
+        <w:rPr>
+          <w:rStyle w:val="VerbatimChar"/>
+        </w:rPr>
+        <w:t xml:space="preserve">run</w:t>
+      </w:r>
+      <w:r>
+        <w:t xml:space="preserve"> </w:t>
+      </w:r>
+      <w:r>
+        <w:t xml:space="preserve">method iterates over the selected scanners</w:t>
+      </w:r>
+      <w:r>
+        <w:t xml:space="preserve"> </w:t>
+      </w:r>
+      <w:r>
+        <w:rPr>
+          <w:b/>
+          <w:bCs/>
+        </w:rPr>
+        <w:t xml:space="preserve">sequentially</w:t>
+      </w:r>
+      <w:r>
+        <w:t xml:space="preserve"> </w:t>
+      </w:r>
+      <w:r>
+        <w:t xml:space="preserve">—</w:t>
+      </w:r>
+      <w:r>
+        <w:t xml:space="preserve"> </w:t>
+      </w:r>
+      <w:r>
+        <w:rPr>
+          <w:rStyle w:val="VerbatimChar"/>
+        </w:rPr>
+        <w:t xml:space="preserve">run_scanner</w:t>
+      </w:r>
+      <w:r>
+        <w:t xml:space="preserve"> </w:t>
+      </w:r>
+      <w:r>
+        <w:t xml:space="preserve">blocks until each scanner finishes before the next begins — which is a deliberate decision to avoid the memory exhaustion that running a heavyweight active scan (ZAP, with its headless browser) alongside a second scanner would risk. Each scanner's report is ingested through the normal parser, and after all scanners complete, the unified triage pipeline runs once across all of the uploads, so that a finding reported by two scanners is merged and its corroboration counted. The whole operation is gated behind an</w:t>
+      </w:r>
+      <w:r>
+        <w:t xml:space="preserve"> </w:t>
+      </w:r>
+      <w:r>
+        <w:rPr>
+          <w:rStyle w:val="VerbatimChar"/>
+        </w:rPr>
+        <w:t xml:space="preserve">authorise=True</w:t>
+      </w:r>
+      <w:r>
+        <w:t xml:space="preserve"> </w:t>
+      </w:r>
+      <w:r>
+        <w:t xml:space="preserve">acknowledgement.</w:t>
+      </w:r>
+    </w:p>
+    <w:bookmarkEnd w:id="124"/>
+    <w:bookmarkStart w:id="128" w:name="X09db528d8686426bb1f0b08be7dcca13a28f5e2"/>
+    <w:p>
+      <w:pPr>
+        <w:pStyle w:val="Heading3"/>
+      </w:pPr>
+      <w:r>
+        <w:t xml:space="preserve">4.5.4 Authentication and API Wiring</w:t>
+      </w:r>
+    </w:p>
+    <w:p>
+      <w:pPr>
+        <w:pStyle w:val="FirstParagraph"/>
+      </w:pPr>
+      <w:r>
+        <w:t xml:space="preserve">Finally, Figure 4.28 shows the two pieces that secure the system and wire the engines together: the login endpoint and the pipeline route.</w:t>
+      </w:r>
+    </w:p>
+    <w:p>
+      <w:pPr>
+        <w:pStyle w:val="BodyText"/>
+      </w:pPr>
+      <w:r>
+        <w:drawing>
+          <wp:inline>
+            <wp:extent cx="5334000" cy="5996392"/>
+            <wp:effectExtent b="0" l="0" r="0" t="0"/>
+            <wp:docPr descr="JWT login and the pipeline route" title="" id="126" name="Picture"/>
+            <a:graphic>
+              <a:graphicData uri="http://schemas.openxmlformats.org/drawingml/2006/picture">
+                <pic:pic>
+                  <pic:nvPicPr>
+                    <pic:cNvPr descr="images/code-auth-route.png" id="127" name="Picture"/>
+                    <pic:cNvPicPr>
+                      <a:picLocks noChangeArrowheads="1" noChangeAspect="1"/>
+                    </pic:cNvPicPr>
+                  </pic:nvPicPr>
+                  <pic:blipFill>
+                    <a:blip r:embed="rId125"/>
+                    <a:stretch>
+                      <a:fillRect/>
+                    </a:stretch>
+                  </pic:blipFill>
+                  <pic:spPr bwMode="auto">
+                    <a:xfrm>
+                      <a:off x="0" y="0"/>
+                      <a:ext cx="5334000" cy="5996392"/>
+                    </a:xfrm>
+                    <a:prstGeom prst="rect">
+                      <a:avLst/>
+                    </a:prstGeom>
+                    <a:noFill/>
+                    <a:ln w="9525">
+                      <a:noFill/>
+                      <a:headEnd/>
+                      <a:tailEnd/>
+                    </a:ln>
+                  </pic:spPr>
+                </pic:pic>
+              </a:graphicData>
+            </a:graphic>
+          </wp:inline>
+        </w:drawing>
+      </w:r>
+    </w:p>
+    <w:p>
+      <w:pPr>
+        <w:pStyle w:val="BodyText"/>
+      </w:pPr>
+      <w:r>
+        <w:rPr>
+          <w:b/>
+          <w:bCs/>
+        </w:rPr>
+        <w:t xml:space="preserve">Figure 4.28: JWT Authentication and Pipeline Wiring (auth.py, pipeline.py)</w:t>
+      </w:r>
+    </w:p>
+    <w:p>
+      <w:pPr>
+        <w:pStyle w:val="BodyText"/>
+      </w:pPr>
+      <w:r>
+        <w:rPr>
+          <w:rStyle w:val="VerbatimChar"/>
+        </w:rPr>
+        <w:t xml:space="preserve">login</w:t>
+      </w:r>
+      <w:r>
+        <w:t xml:space="preserve"> </w:t>
+      </w:r>
+      <w:r>
+        <w:t xml:space="preserve">validates the submitted email and password, verifies the stored password hash, and — on success — issues a JSON Web Token with</w:t>
+      </w:r>
+      <w:r>
+        <w:t xml:space="preserve"> </w:t>
+      </w:r>
+      <w:r>
+        <w:rPr>
+          <w:rStyle w:val="VerbatimChar"/>
+        </w:rPr>
+        <w:t xml:space="preserve">create_access_token</w:t>
+      </w:r>
+      <w:r>
+        <w:t xml:space="preserve">; that token authorises every subsequent request.</w:t>
+      </w:r>
+      <w:r>
+        <w:t xml:space="preserve"> </w:t>
+      </w:r>
+      <w:r>
+        <w:rPr>
+          <w:rStyle w:val="VerbatimChar"/>
+        </w:rPr>
+        <w:t xml:space="preserve">run_pipeline</w:t>
+      </w:r>
+      <w:r>
+        <w:t xml:space="preserve"> </w:t>
+      </w:r>
+      <w:r>
+        <w:t xml:space="preserve">is the JWT-protected endpoint that realises the abstract pipeline of §4.5.2 in concrete code: it loads the authenticated user's upload and then invokes each engine in order — normalisation, deduplication, CWE mapping, NVD enrichment, CWE→CVSS enrichment, and so on — accumulating the per-stage counts into a</w:t>
+      </w:r>
+      <w:r>
+        <w:t xml:space="preserve"> </w:t>
+      </w:r>
+      <w:r>
+        <w:rPr>
+          <w:rStyle w:val="VerbatimChar"/>
+        </w:rPr>
+        <w:t xml:space="preserve">results</w:t>
+      </w:r>
+      <w:r>
+        <w:t xml:space="preserve"> </w:t>
+      </w:r>
+      <w:r>
+        <w:t xml:space="preserve">dictionary that is returned to the client. This method is therefore the executable definition of the triage pipeline.</w:t>
+      </w:r>
+    </w:p>
+    <w:p>
+      <w:r>
+        <w:pict>
+          <v:rect style="width:0;height:1.5pt" o:hralign="center" o:hrstd="t" o:hr="t"/>
+        </w:pict>
+      </w:r>
+    </w:p>
+    <w:bookmarkEnd w:id="128"/>
+    <w:bookmarkEnd w:id="129"/>
+    <w:bookmarkStart w:id="169" w:name="X54341d584745e7411aa4f4707f5121fcc739cb5"/>
+    <w:p>
+      <w:pPr>
+        <w:pStyle w:val="Heading2"/>
+      </w:pPr>
+      <w:r>
+        <w:t xml:space="preserve">4.6 Screenshot</w:t>
+      </w:r>
+    </w:p>
+    <w:p>
+      <w:pPr>
+        <w:pStyle w:val="FirstParagraph"/>
+      </w:pPr>
+      <w:r>
+        <w:t xml:space="preserve">This section presents annotated screenshots of the completed product with a justification for each. The screenshots were captured from the running web application driven against a triaged dataset produced by an Auto Scan of a local test target (OWASP Juice Shop), yielding sixteen findings of which four are</w:t>
+      </w:r>
+      <w:r>
+        <w:t xml:space="preserve"> </w:t>
+      </w:r>
+      <w:r>
+        <w:rPr>
+          <w:i/>
+          <w:iCs/>
+        </w:rPr>
+        <w:t xml:space="preserve">Confirmed</w:t>
+      </w:r>
+      <w:r>
+        <w:t xml:space="preserve">.</w:t>
+      </w:r>
+    </w:p>
+    <w:bookmarkStart w:id="133" w:name="X831bf8cb68fb81f8f88eb045a3d2ee1390654c7"/>
+    <w:p>
+      <w:pPr>
+        <w:pStyle w:val="Heading3"/>
+      </w:pPr>
+      <w:r>
+        <w:t xml:space="preserve">4.6.1 Login</w:t>
+      </w:r>
+    </w:p>
+    <w:p>
+      <w:pPr>
+        <w:pStyle w:val="FirstParagraph"/>
+      </w:pPr>
+      <w:r>
+        <w:drawing>
+          <wp:inline>
+            <wp:extent cx="5334000" cy="3189287"/>
+            <wp:effectExtent b="0" l="0" r="0" t="0"/>
+            <wp:docPr descr="Login screen" title="" id="131" name="Picture"/>
+            <a:graphic>
+              <a:graphicData uri="http://schemas.openxmlformats.org/drawingml/2006/picture">
+                <pic:pic>
+                  <pic:nvPicPr>
+                    <pic:cNvPr descr="images/01-login.png" id="132" name="Picture"/>
+                    <pic:cNvPicPr>
+                      <a:picLocks noChangeArrowheads="1" noChangeAspect="1"/>
+                    </pic:cNvPicPr>
+                  </pic:nvPicPr>
+                  <pic:blipFill>
+                    <a:blip r:embed="rId130"/>
                     <a:stretch>
                       <a:fillRect/>
                     </a:stretch>
@@ -5770,7 +7154,7 @@
           <w:b/>
           <w:bCs/>
         </w:rPr>
-        <w:t xml:space="preserve">Figure 4.18: Login Screen.</w:t>
+        <w:t xml:space="preserve">Figure 4.29: Login Screen.</w:t>
       </w:r>
       <w:r>
         <w:t xml:space="preserve"> </w:t>
@@ -5789,8 +7173,8 @@
         <w:t xml:space="preserve">The entry point demonstrates the JWT-secured authentication gate. All data routes are protected, and unauthenticated access redirects here. The focused, minimal form reflects the design priority of getting an analyst into the workspace quickly.</w:t>
       </w:r>
     </w:p>
-    <w:bookmarkEnd w:id="91"/>
-    <w:bookmarkStart w:id="95" w:name="X554ca8f5079771fa3b5a9c73f668d2a59be3842"/>
+    <w:bookmarkEnd w:id="133"/>
+    <w:bookmarkStart w:id="137" w:name="X554ca8f5079771fa3b5a9c73f668d2a59be3842"/>
     <w:p>
       <w:pPr>
         <w:pStyle w:val="Heading3"/>
@@ -5808,18 +7192,18 @@
           <wp:inline>
             <wp:extent cx="5334000" cy="3189287"/>
             <wp:effectExtent b="0" l="0" r="0" t="0"/>
-            <wp:docPr descr="Registration screen" title="" id="93" name="Picture"/>
+            <wp:docPr descr="Registration screen" title="" id="135" name="Picture"/>
             <a:graphic>
               <a:graphicData uri="http://schemas.openxmlformats.org/drawingml/2006/picture">
                 <pic:pic>
                   <pic:nvPicPr>
-                    <pic:cNvPr descr="images/02-register.png" id="94" name="Picture"/>
+                    <pic:cNvPr descr="images/02-register.png" id="136" name="Picture"/>
                     <pic:cNvPicPr>
                       <a:picLocks noChangeArrowheads="1" noChangeAspect="1"/>
                     </pic:cNvPicPr>
                   </pic:nvPicPr>
                   <pic:blipFill>
-                    <a:blip r:embed="rId92"/>
+                    <a:blip r:embed="rId134"/>
                     <a:stretch>
                       <a:fillRect/>
                     </a:stretch>
@@ -5855,7 +7239,7 @@
           <w:b/>
           <w:bCs/>
         </w:rPr>
-        <w:t xml:space="preserve">Figure 4.19: Registration Screen.</w:t>
+        <w:t xml:space="preserve">Figure 4.30: Registration Screen.</w:t>
       </w:r>
       <w:r>
         <w:t xml:space="preserve"> </w:t>
@@ -5874,8 +7258,8 @@
         <w:t xml:space="preserve">New analysts self-register; the API hashes the password and issues a token on success. It documents the complete account-creation path (UC1).</w:t>
       </w:r>
     </w:p>
-    <w:bookmarkEnd w:id="95"/>
-    <w:bookmarkStart w:id="99" w:name="Xc736af9b4f661537cca52631185f21e222e4ab8"/>
+    <w:bookmarkEnd w:id="137"/>
+    <w:bookmarkStart w:id="141" w:name="Xc736af9b4f661537cca52631185f21e222e4ab8"/>
     <w:p>
       <w:pPr>
         <w:pStyle w:val="Heading3"/>
@@ -5893,18 +7277,18 @@
           <wp:inline>
             <wp:extent cx="5334000" cy="4663545"/>
             <wp:effectExtent b="0" l="0" r="0" t="0"/>
-            <wp:docPr descr="Dashboard" title="" id="97" name="Picture"/>
+            <wp:docPr descr="Dashboard" title="" id="139" name="Picture"/>
             <a:graphic>
               <a:graphicData uri="http://schemas.openxmlformats.org/drawingml/2006/picture">
                 <pic:pic>
                   <pic:nvPicPr>
-                    <pic:cNvPr descr="images/03-dashboard.png" id="98" name="Picture"/>
+                    <pic:cNvPr descr="images/03-dashboard.png" id="140" name="Picture"/>
                     <pic:cNvPicPr>
                       <a:picLocks noChangeArrowheads="1" noChangeAspect="1"/>
                     </pic:cNvPicPr>
                   </pic:nvPicPr>
                   <pic:blipFill>
-                    <a:blip r:embed="rId96"/>
+                    <a:blip r:embed="rId138"/>
                     <a:stretch>
                       <a:fillRect/>
                     </a:stretch>
@@ -5940,7 +7324,7 @@
           <w:b/>
           <w:bCs/>
         </w:rPr>
-        <w:t xml:space="preserve">Figure 4.20: Dashboard.</w:t>
+        <w:t xml:space="preserve">Figure 4.31: Dashboard.</w:t>
       </w:r>
       <w:r>
         <w:t xml:space="preserve"> </w:t>
@@ -5975,8 +7359,8 @@
         <w:t xml:space="preserve">and none need review — the remainder auto-dismissed); the three charts characterise the dataset; and the Top-10 table surfaces the highest-CVSS findings with their classification and CWE. Together they show the triage system converting raw scanner noise into a prioritised, actionable shortlist.</w:t>
       </w:r>
     </w:p>
-    <w:bookmarkEnd w:id="99"/>
-    <w:bookmarkStart w:id="103" w:name="Xc2857fb31bdd292898b6b05a29eb176d9346aa0"/>
+    <w:bookmarkEnd w:id="141"/>
+    <w:bookmarkStart w:id="145" w:name="Xc2857fb31bdd292898b6b05a29eb176d9346aa0"/>
     <w:p>
       <w:pPr>
         <w:pStyle w:val="Heading3"/>
@@ -5994,18 +7378,18 @@
           <wp:inline>
             <wp:extent cx="5334000" cy="3189287"/>
             <wp:effectExtent b="0" l="0" r="0" t="0"/>
-            <wp:docPr descr="Upload screen" title="" id="101" name="Picture"/>
+            <wp:docPr descr="Upload screen" title="" id="143" name="Picture"/>
             <a:graphic>
               <a:graphicData uri="http://schemas.openxmlformats.org/drawingml/2006/picture">
                 <pic:pic>
                   <pic:nvPicPr>
-                    <pic:cNvPr descr="images/04-upload.png" id="102" name="Picture"/>
+                    <pic:cNvPr descr="images/04-upload.png" id="144" name="Picture"/>
                     <pic:cNvPicPr>
                       <a:picLocks noChangeArrowheads="1" noChangeAspect="1"/>
                     </pic:cNvPicPr>
                   </pic:nvPicPr>
                   <pic:blipFill>
-                    <a:blip r:embed="rId100"/>
+                    <a:blip r:embed="rId142"/>
                     <a:stretch>
                       <a:fillRect/>
                     </a:stretch>
@@ -6041,7 +7425,7 @@
           <w:b/>
           <w:bCs/>
         </w:rPr>
-        <w:t xml:space="preserve">Figure 4.21: Upload Screen.</w:t>
+        <w:t xml:space="preserve">Figure 4.32: Upload Screen.</w:t>
       </w:r>
       <w:r>
         <w:t xml:space="preserve"> </w:t>
@@ -6076,8 +7460,8 @@
         <w:t xml:space="preserve">action.</w:t>
       </w:r>
     </w:p>
-    <w:bookmarkEnd w:id="103"/>
-    <w:bookmarkStart w:id="107" w:name="X51366124bbb38c79718f3316eb565126ea316b8"/>
+    <w:bookmarkEnd w:id="145"/>
+    <w:bookmarkStart w:id="149" w:name="X51366124bbb38c79718f3316eb565126ea316b8"/>
     <w:p>
       <w:pPr>
         <w:pStyle w:val="Heading3"/>
@@ -6095,18 +7479,18 @@
           <wp:inline>
             <wp:extent cx="5334000" cy="3189287"/>
             <wp:effectExtent b="0" l="0" r="0" t="0"/>
-            <wp:docPr descr="Auto Scan screen" title="" id="105" name="Picture"/>
+            <wp:docPr descr="Auto Scan screen" title="" id="147" name="Picture"/>
             <a:graphic>
               <a:graphicData uri="http://schemas.openxmlformats.org/drawingml/2006/picture">
                 <pic:pic>
                   <pic:nvPicPr>
-                    <pic:cNvPr descr="images/05-autoscan.png" id="106" name="Picture"/>
+                    <pic:cNvPr descr="images/05-autoscan.png" id="148" name="Picture"/>
                     <pic:cNvPicPr>
                       <a:picLocks noChangeArrowheads="1" noChangeAspect="1"/>
                     </pic:cNvPicPr>
                   </pic:nvPicPr>
                   <pic:blipFill>
-                    <a:blip r:embed="rId104"/>
+                    <a:blip r:embed="rId146"/>
                     <a:stretch>
                       <a:fillRect/>
                     </a:stretch>
@@ -6142,7 +7526,7 @@
           <w:b/>
           <w:bCs/>
         </w:rPr>
-        <w:t xml:space="preserve">Figure 4.22: Auto Scan Screen.</w:t>
+        <w:t xml:space="preserve">Figure 4.33: Auto Scan Screen.</w:t>
       </w:r>
       <w:r>
         <w:t xml:space="preserve"> </w:t>
@@ -6161,8 +7545,8 @@
         <w:t xml:space="preserve">This shows the optional orchestration layer (UC3): a target field, scanner selection, and the explicit authorisation acknowledgement that gates all active scanning. The screen embodies the responsible-use design constraint that intrusive scanning must be deliberately opted into.</w:t>
       </w:r>
     </w:p>
-    <w:bookmarkEnd w:id="107"/>
-    <w:bookmarkStart w:id="111" w:name="X82b1df9bde87e06f2113dd04155c164935be6fa"/>
+    <w:bookmarkEnd w:id="149"/>
+    <w:bookmarkStart w:id="153" w:name="X82b1df9bde87e06f2113dd04155c164935be6fa"/>
     <w:p>
       <w:pPr>
         <w:pStyle w:val="Heading3"/>
@@ -6180,18 +7564,18 @@
           <wp:inline>
             <wp:extent cx="5334000" cy="4911725"/>
             <wp:effectExtent b="0" l="0" r="0" t="0"/>
-            <wp:docPr descr="Findings list" title="" id="109" name="Picture"/>
+            <wp:docPr descr="Findings list" title="" id="151" name="Picture"/>
             <a:graphic>
               <a:graphicData uri="http://schemas.openxmlformats.org/drawingml/2006/picture">
                 <pic:pic>
                   <pic:nvPicPr>
-                    <pic:cNvPr descr="images/06-findings.png" id="110" name="Picture"/>
+                    <pic:cNvPr descr="images/06-findings.png" id="152" name="Picture"/>
                     <pic:cNvPicPr>
                       <a:picLocks noChangeArrowheads="1" noChangeAspect="1"/>
                     </pic:cNvPicPr>
                   </pic:nvPicPr>
                   <pic:blipFill>
-                    <a:blip r:embed="rId108"/>
+                    <a:blip r:embed="rId150"/>
                     <a:stretch>
                       <a:fillRect/>
                     </a:stretch>
@@ -6227,7 +7611,7 @@
           <w:b/>
           <w:bCs/>
         </w:rPr>
-        <w:t xml:space="preserve">Figure 4.23: Findings List.</w:t>
+        <w:t xml:space="preserve">Figure 4.34: Findings List.</w:t>
       </w:r>
       <w:r>
         <w:t xml:space="preserve"> </w:t>
@@ -6262,8 +7646,8 @@
         <w:t xml:space="preserve">items, demonstrating the practical false-positive reduction the project set out to achieve.</w:t>
       </w:r>
     </w:p>
-    <w:bookmarkEnd w:id="111"/>
-    <w:bookmarkStart w:id="115" w:name="X94c2a5a95d007c0a47c95b07faa6257478ed869"/>
+    <w:bookmarkEnd w:id="153"/>
+    <w:bookmarkStart w:id="157" w:name="X94c2a5a95d007c0a47c95b07faa6257478ed869"/>
     <w:p>
       <w:pPr>
         <w:pStyle w:val="Heading3"/>
@@ -6281,18 +7665,18 @@
           <wp:inline>
             <wp:extent cx="5334000" cy="8026929"/>
             <wp:effectExtent b="0" l="0" r="0" t="0"/>
-            <wp:docPr descr="Finding detail" title="" id="113" name="Picture"/>
+            <wp:docPr descr="Finding detail" title="" id="155" name="Picture"/>
             <a:graphic>
               <a:graphicData uri="http://schemas.openxmlformats.org/drawingml/2006/picture">
                 <pic:pic>
                   <pic:nvPicPr>
-                    <pic:cNvPr descr="images/07-finding-detail.png" id="114" name="Picture"/>
+                    <pic:cNvPr descr="images/07-finding-detail.png" id="156" name="Picture"/>
                     <pic:cNvPicPr>
                       <a:picLocks noChangeArrowheads="1" noChangeAspect="1"/>
                     </pic:cNvPicPr>
                   </pic:nvPicPr>
                   <pic:blipFill>
-                    <a:blip r:embed="rId112"/>
+                    <a:blip r:embed="rId154"/>
                     <a:stretch>
                       <a:fillRect/>
                     </a:stretch>
@@ -6328,7 +7712,7 @@
           <w:b/>
           <w:bCs/>
         </w:rPr>
-        <w:t xml:space="preserve">Figure 4.24: Finding Detail.</w:t>
+        <w:t xml:space="preserve">Figure 4.35: Finding Detail.</w:t>
       </w:r>
       <w:r>
         <w:t xml:space="preserve"> </w:t>
@@ -6344,11 +7728,11 @@
         <w:t xml:space="preserve"> </w:t>
       </w:r>
       <w:r>
-        <w:t xml:space="preserve">The most important screen for the project's thesis. For the confirmed SQL-injection finding it shows the confidence score with its full six-factor breakdown, the machine-learning priority prediction, the CVSS v3 metrics, the description and recommended solution, and the proof-of-concept evidence that triggered the confirmation. This is the concrete realisation of explainable, evidence-backed triage. (The confidence panel is examined in isolation in Figure 4.17.)</w:t>
-      </w:r>
-    </w:p>
-    <w:bookmarkEnd w:id="115"/>
-    <w:bookmarkStart w:id="119" w:name="X3b8ffb2c2c8594b656bd2a544a17692c9dbd9a7"/>
+        <w:t xml:space="preserve">The most important screen for the project's thesis. For the confirmed SQL-injection finding it shows the confidence score with its full six-factor breakdown, the machine-learning priority prediction, the CVSS v3 metrics, the description and recommended solution, and the proof-of-concept evidence that triggered the confirmation. This is the concrete realisation of explainable, evidence-backed triage. (The confidence panel is examined in isolation in Figure 4.24.)</w:t>
+      </w:r>
+    </w:p>
+    <w:bookmarkEnd w:id="157"/>
+    <w:bookmarkStart w:id="161" w:name="X3b8ffb2c2c8594b656bd2a544a17692c9dbd9a7"/>
     <w:p>
       <w:pPr>
         <w:pStyle w:val="Heading3"/>
@@ -6366,18 +7750,18 @@
           <wp:inline>
             <wp:extent cx="5334000" cy="3189287"/>
             <wp:effectExtent b="0" l="0" r="0" t="0"/>
-            <wp:docPr descr="Reports list" title="" id="117" name="Picture"/>
+            <wp:docPr descr="Reports list" title="" id="159" name="Picture"/>
             <a:graphic>
               <a:graphicData uri="http://schemas.openxmlformats.org/drawingml/2006/picture">
                 <pic:pic>
                   <pic:nvPicPr>
-                    <pic:cNvPr descr="images/08-reports.png" id="118" name="Picture"/>
+                    <pic:cNvPr descr="images/08-reports.png" id="160" name="Picture"/>
                     <pic:cNvPicPr>
                       <a:picLocks noChangeArrowheads="1" noChangeAspect="1"/>
                     </pic:cNvPicPr>
                   </pic:nvPicPr>
                   <pic:blipFill>
-                    <a:blip r:embed="rId116"/>
+                    <a:blip r:embed="rId158"/>
                     <a:stretch>
                       <a:fillRect/>
                     </a:stretch>
@@ -6413,7 +7797,7 @@
           <w:b/>
           <w:bCs/>
         </w:rPr>
-        <w:t xml:space="preserve">Figure 4.25: Reports List.</w:t>
+        <w:t xml:space="preserve">Figure 4.36: Reports List.</w:t>
       </w:r>
       <w:r>
         <w:t xml:space="preserve"> </w:t>
@@ -6432,8 +7816,8 @@
         <w:t xml:space="preserve">Completes the workflow (UC9): generated PDF reports are listed and downloadable, providing the deliverable an analyst hands to stakeholders.</w:t>
       </w:r>
     </w:p>
-    <w:bookmarkEnd w:id="119"/>
-    <w:bookmarkStart w:id="126" w:name="Xc9cdf9694989309be5c9b710b76adc554a0427e"/>
+    <w:bookmarkEnd w:id="161"/>
+    <w:bookmarkStart w:id="168" w:name="Xc9cdf9694989309be5c9b710b76adc554a0427e"/>
     <w:p>
       <w:pPr>
         <w:pStyle w:val="Heading3"/>
@@ -6451,18 +7835,18 @@
           <wp:inline>
             <wp:extent cx="5334000" cy="7541944"/>
             <wp:effectExtent b="0" l="0" r="0" t="0"/>
-            <wp:docPr descr="PDF report cover page" title="" id="121" name="Picture"/>
+            <wp:docPr descr="PDF report cover page" title="" id="163" name="Picture"/>
             <a:graphic>
               <a:graphicData uri="http://schemas.openxmlformats.org/drawingml/2006/picture">
                 <pic:pic>
                   <pic:nvPicPr>
-                    <pic:cNvPr descr="images/09-report-cover.png" id="122" name="Picture"/>
+                    <pic:cNvPr descr="images/09-report-cover.png" id="164" name="Picture"/>
                     <pic:cNvPicPr>
                       <a:picLocks noChangeArrowheads="1" noChangeAspect="1"/>
                     </pic:cNvPicPr>
                   </pic:nvPicPr>
                   <pic:blipFill>
-                    <a:blip r:embed="rId120"/>
+                    <a:blip r:embed="rId162"/>
                     <a:stretch>
                       <a:fillRect/>
                     </a:stretch>
@@ -6498,7 +7882,7 @@
           <w:b/>
           <w:bCs/>
         </w:rPr>
-        <w:t xml:space="preserve">Figure 4.26: PDF Report — Cover and Severity Summary.</w:t>
+        <w:t xml:space="preserve">Figure 4.37: PDF Report — Cover and Severity Summary.</w:t>
       </w:r>
       <w:r>
         <w:t xml:space="preserve"> </w:t>
@@ -6526,18 +7910,18 @@
           <wp:inline>
             <wp:extent cx="5334000" cy="7541944"/>
             <wp:effectExtent b="0" l="0" r="0" t="0"/>
-            <wp:docPr descr="PDF report executive summary" title="" id="124" name="Picture"/>
+            <wp:docPr descr="PDF report executive summary" title="" id="166" name="Picture"/>
             <a:graphic>
               <a:graphicData uri="http://schemas.openxmlformats.org/drawingml/2006/picture">
                 <pic:pic>
                   <pic:nvPicPr>
-                    <pic:cNvPr descr="images/10-report-summary.png" id="125" name="Picture"/>
+                    <pic:cNvPr descr="images/10-report-summary.png" id="167" name="Picture"/>
                     <pic:cNvPicPr>
                       <a:picLocks noChangeArrowheads="1" noChangeAspect="1"/>
                     </pic:cNvPicPr>
                   </pic:nvPicPr>
                   <pic:blipFill>
-                    <a:blip r:embed="rId123"/>
+                    <a:blip r:embed="rId165"/>
                     <a:stretch>
                       <a:fillRect/>
                     </a:stretch>
@@ -6573,7 +7957,7 @@
           <w:b/>
           <w:bCs/>
         </w:rPr>
-        <w:t xml:space="preserve">Figure 4.27: PDF Report — Executive Summary.</w:t>
+        <w:t xml:space="preserve">Figure 4.38: PDF Report — Executive Summary.</w:t>
       </w:r>
       <w:r>
         <w:t xml:space="preserve"> </w:t>
@@ -6625,9 +8009,9 @@
         </w:pict>
       </w:r>
     </w:p>
-    <w:bookmarkEnd w:id="126"/>
-    <w:bookmarkEnd w:id="127"/>
-    <w:bookmarkStart w:id="128" w:name="X623c2de98ec25c30e3c670a591e51ee904911e5"/>
+    <w:bookmarkEnd w:id="168"/>
+    <w:bookmarkEnd w:id="169"/>
+    <w:bookmarkStart w:id="170" w:name="X623c2de98ec25c30e3c670a591e51ee904911e5"/>
     <w:p>
       <w:pPr>
         <w:pStyle w:val="Heading2"/>
@@ -6641,7 +8025,7 @@
         <w:pStyle w:val="FirstParagraph"/>
       </w:pPr>
       <w:r>
-        <w:t xml:space="preserve">This chapter presented the design and the completed implementation of VulnTriage using an object-oriented methodology. Section 4.2 set out the five design principles that govern the system and then modelled it with a layered system-architecture diagram, a use case diagram, an activity diagram of the triage pipeline, two sequence diagrams for the principal workflows, a class diagram separating domain models from engine services, and a two-level data flow diagram. Section 4.3 documented the nine-table relational schema as an entity-relationship diagram, described each table, and justified the normalisation and the single deliberate denormalisation. Section 4.4 described the interface-design philosophy, the navigation structure, each principal screen, and the user-journey storyboard. Section 4.5 explained how the system executes across its three deployment modes, detailed the ordered engine pipeline, and examined the two most important pieces of the implementation at the source-code level — the machine-learning component (with its anti-leakage feature design and its inference code) and the Confidence Engine (with its weighted-scoring code, its factor computations, and a worked example from the interface). Section 4.6 presented eleven annotated screenshots of the finished product — including the exported PDF report — with a justification for each. In total the chapter contains twelve diagrams, four annotated code figures, eleven application screenshots, and two component tables.</w:t>
+        <w:t xml:space="preserve">This chapter presented the design and the completed implementation of VulnTriage using an object-oriented methodology. Section 4.2 set out the five design principles that govern the system and then modelled it with a layered system-architecture diagram, a use case diagram, an activity diagram of the triage pipeline, two sequence diagrams for the principal workflows, a class diagram separating domain models from engine services, and a two-level data flow diagram. Section 4.3 documented the nine-table relational schema as an entity-relationship diagram, described each table, and justified the normalisation and the single deliberate denormalisation. Section 4.4 described the interface-design philosophy, the navigation structure, each principal screen, and the user-journey storyboard. Section 4.5 explained how the system executes across its three deployment modes and then presented a full source-code walkthrough of the implementation: every essential engine of the triage pipeline — scanner parsing, normalisation, deduplication, CWE mapping, NVD enrichment, CWE→CVSS enrichment, machine-learning prioritisation, confidence scoring, PoC validation, and report generation — together with the Auto-Scan orchestrator and the authentication-and-wiring layer, was shown as an annotated code figure and explained block by block. Section 4.6 presented ten annotated screenshots of the finished product — including the exported PDF report — with a justification for each. In total the chapter contains twelve diagrams, sixteen annotated code and interface figures across the engine walkthrough, ten application screenshots, and two component tables.</w:t>
       </w:r>
     </w:p>
     <w:p>
@@ -6652,8 +8036,8 @@
         <w:t xml:space="preserve">Taken together, these artefacts describe a fully realised system that ingests multi-scanner output and, through a normalisation–enrichment–prioritisation–confidence pipeline, produces explainable, prioritised, and confirmation-backed vulnerability findings. The following chapter evaluates the system's performance and effectiveness against the objectives established for the project.</w:t>
       </w:r>
     </w:p>
-    <w:bookmarkEnd w:id="128"/>
-    <w:bookmarkEnd w:id="129"/>
+    <w:bookmarkEnd w:id="170"/>
+    <w:bookmarkEnd w:id="171"/>
     <w:sectPr>
       <w:footnotePr>
         <w:numRestart w:val="eachSect"/>
@@ -7020,9 +8404,6 @@
     <w:lvlOverride w:ilvl="8">
       <w:startOverride w:val="1"/>
     </w:lvlOverride>
-  </w:num>
-  <w:num w:numId="1005">
-    <w:abstractNumId w:val="991"/>
   </w:num>
 </w:numbering>
 </file>

</xml_diff>

<commit_message>
Chapter 4 §4.5.2.10: document the optional AI-Assisted Analysis
Expand Report Generation to describe the optional LLM analysis section
(executive overview, per-finding risk + fix, prioritised actions),
its provider-agnostic design (Gemini, by key), key-gated
no-op/graceful-degradation, and data-not-instructions handling.
Re-render the report_generator code figure to show the updated
generate() with the ai_summary path, and make its docstring
provider-neutral. Isolate the AI-disabled test from env keys now that
.env may carry a provider key. 97 tests pass; .docx rebuilt.
</commit_message>
<xml_diff>
--- a/docs/Chapter_4_Design_and_Implementation.docx
+++ b/docs/Chapter_4_Design_and_Implementation.docx
@@ -6650,7 +6650,7 @@
         <w:pStyle w:val="FirstParagraph"/>
       </w:pPr>
       <w:r>
-        <w:t xml:space="preserve">The final stage renders a professional PDF triage report. Figure 4.26 shows the generation method.</w:t>
+        <w:t xml:space="preserve">The final stage renders a professional PDF triage report and can optionally enrich it with a large-language-model analysis. Figure 4.26 shows the generation method.</w:t>
       </w:r>
     </w:p>
     <w:p>
@@ -6660,7 +6660,7 @@
       <w:r>
         <w:drawing>
           <wp:inline>
-            <wp:extent cx="5334000" cy="3296643"/>
+            <wp:extent cx="5334000" cy="3840355"/>
             <wp:effectExtent b="0" l="0" r="0" t="0"/>
             <wp:docPr descr="Report generation" title="" id="117" name="Picture"/>
             <a:graphic>
@@ -6681,7 +6681,7 @@
                   <pic:spPr bwMode="auto">
                     <a:xfrm>
                       <a:off x="0" y="0"/>
-                      <a:ext cx="5334000" cy="3296643"/>
+                      <a:ext cx="5334000" cy="3840355"/>
                     </a:xfrm>
                     <a:prstGeom prst="rect">
                       <a:avLst/>
@@ -6765,6 +6765,132 @@
       </w:r>
       <w:r>
         <w:t xml:space="preserve">. Because the report reads from the same normalised findings and confidence scores as the interface, the on-screen and exported views are always consistent.</w:t>
+      </w:r>
+    </w:p>
+    <w:p>
+      <w:pPr>
+        <w:pStyle w:val="BodyText"/>
+      </w:pPr>
+      <w:r>
+        <w:rPr>
+          <w:b/>
+          <w:bCs/>
+        </w:rPr>
+        <w:t xml:space="preserve">Optional AI-Assisted Analysis.</w:t>
+      </w:r>
+      <w:r>
+        <w:t xml:space="preserve"> </w:t>
+      </w:r>
+      <w:r>
+        <w:t xml:space="preserve">The</w:t>
+      </w:r>
+      <w:r>
+        <w:t xml:space="preserve"> </w:t>
+      </w:r>
+      <w:r>
+        <w:rPr>
+          <w:rStyle w:val="VerbatimChar"/>
+        </w:rPr>
+        <w:t xml:space="preserve">generate</w:t>
+      </w:r>
+      <w:r>
+        <w:t xml:space="preserve"> </w:t>
+      </w:r>
+      <w:r>
+        <w:t xml:space="preserve">method accepts an</w:t>
+      </w:r>
+      <w:r>
+        <w:t xml:space="preserve"> </w:t>
+      </w:r>
+      <w:r>
+        <w:rPr>
+          <w:rStyle w:val="VerbatimChar"/>
+        </w:rPr>
+        <w:t xml:space="preserve">ai_summary</w:t>
+      </w:r>
+      <w:r>
+        <w:t xml:space="preserve"> </w:t>
+      </w:r>
+      <w:r>
+        <w:t xml:space="preserve">flag. When it is set — and an API key is configured — the report generator first calls an optional AI engine (</w:t>
+      </w:r>
+      <w:r>
+        <w:rPr>
+          <w:rStyle w:val="VerbatimChar"/>
+        </w:rPr>
+        <w:t xml:space="preserve">engines/ai_summary.py</w:t>
+      </w:r>
+      <w:r>
+        <w:t xml:space="preserve">) over the findings and inserts an additional</w:t>
+      </w:r>
+      <w:r>
+        <w:t xml:space="preserve"> </w:t>
+      </w:r>
+      <w:r>
+        <w:rPr>
+          <w:b/>
+          <w:bCs/>
+        </w:rPr>
+        <w:t xml:space="preserve">"AI-Assisted Analysis"</w:t>
+      </w:r>
+      <w:r>
+        <w:t xml:space="preserve"> </w:t>
+      </w:r>
+      <w:r>
+        <w:t xml:space="preserve">page into the PDF, containing an executive risk overview, a per-finding plain-language explanation of the risk together with concrete remediation, and a prioritised list of actions. This is the point at which the project's "AI-Assisted" remit is realised end-to-end: a large language model turns the structured triage data into an analyst-ready narrative. The engine is</w:t>
+      </w:r>
+      <w:r>
+        <w:t xml:space="preserve"> </w:t>
+      </w:r>
+      <w:r>
+        <w:rPr>
+          <w:b/>
+          <w:bCs/>
+        </w:rPr>
+        <w:t xml:space="preserve">provider-agnostic</w:t>
+      </w:r>
+      <w:r>
+        <w:t xml:space="preserve"> </w:t>
+      </w:r>
+      <w:r>
+        <w:t xml:space="preserve">— it uses Google Gemini or Anthropic Claude depending on which API key is present (</w:t>
+      </w:r>
+      <w:r>
+        <w:rPr>
+          <w:rStyle w:val="VerbatimChar"/>
+        </w:rPr>
+        <w:t xml:space="preserve">GEMINI_API_KEY</w:t>
+      </w:r>
+      <w:r>
+        <w:t xml:space="preserve"> </w:t>
+      </w:r>
+      <w:r>
+        <w:t xml:space="preserve">or</w:t>
+      </w:r>
+      <w:r>
+        <w:t xml:space="preserve"> </w:t>
+      </w:r>
+      <w:r>
+        <w:rPr>
+          <w:rStyle w:val="VerbatimChar"/>
+        </w:rPr>
+        <w:t xml:space="preserve">ANTHROPIC_API_KEY</w:t>
+      </w:r>
+      <w:r>
+        <w:t xml:space="preserve">) — and makes a single structured-output request per report. Like the NVD enrichment and exploit-lookup features, it is</w:t>
+      </w:r>
+      <w:r>
+        <w:t xml:space="preserve"> </w:t>
+      </w:r>
+      <w:r>
+        <w:rPr>
+          <w:b/>
+          <w:bCs/>
+        </w:rPr>
+        <w:t xml:space="preserve">gated behind an API key</w:t>
+      </w:r>
+      <w:r>
+        <w:t xml:space="preserve">: with no key it is a silent no-op and the offline report is produced exactly as before, and any API error degrades gracefully to a report without the section. Scanner-supplied text is passed to the model strictly as data, never as instructions, so the feature does not widen the system's trust boundary.</w:t>
       </w:r>
     </w:p>
     <w:bookmarkEnd w:id="119"/>

</xml_diff>

<commit_message>
docs: add pre-implementation wireframe sketches to Ch4 §4.4.3 Screen Design
Add six low-fidelity 'draft wireframe' mockups (Authentication, Dashboard,
Upload, Auto Scan, Findings, Finding Details) showing the intended UI layout
before implementation, as Figures 4.11-4.16. Rewrote §4.4.3 to present each
screen's wireframe with its design description. Shifted existing Figures
4.11-4.38 -> 4.17-4.44 (storyboard, deployment, code figures, screenshots)
to make room; verified caption sequence 1-44 has no gaps/dupes and the
confidence-panel cross-ref still resolves. Rebuilt .docx (44 images).
</commit_message>
<xml_diff>
--- a/docs/Chapter_4_Design_and_Implementation.docx
+++ b/docs/Chapter_4_Design_and_Implementation.docx
@@ -2,7 +2,7 @@
 <file path=word/document.xml><?xml version="1.0" encoding="utf-8"?>
 <w:document xmlns:w="http://schemas.openxmlformats.org/wordprocessingml/2006/main" xmlns:m="http://schemas.openxmlformats.org/officeDocument/2006/math" xmlns:r="http://schemas.openxmlformats.org/officeDocument/2006/relationships" xmlns:o="urn:schemas-microsoft-com:office:office" xmlns:v="urn:schemas-microsoft-com:vml" xmlns:w10="urn:schemas-microsoft-com:office:word" xmlns:a="http://schemas.openxmlformats.org/drawingml/2006/main" xmlns:pic="http://schemas.openxmlformats.org/drawingml/2006/picture" xmlns:wp="http://schemas.openxmlformats.org/drawingml/2006/wordprocessingDrawing">
   <w:body>
-    <w:bookmarkStart w:id="171" w:name="chapter-4-design-and-implementation"/>
+    <w:bookmarkStart w:id="189" w:name="chapter-4-design-and-implementation"/>
     <w:p>
       <w:pPr>
         <w:pStyle w:val="Heading1"/>
@@ -3336,7 +3336,7 @@
     </w:p>
     <w:bookmarkEnd w:id="51"/>
     <w:bookmarkEnd w:id="52"/>
-    <w:bookmarkStart w:id="63" w:name="Xfac0272877f1f31de89a90c2aa41c7f06fa3a0a"/>
+    <w:bookmarkStart w:id="81" w:name="Xfac0272877f1f31de89a90c2aa41c7f06fa3a0a"/>
     <w:p>
       <w:pPr>
         <w:pStyle w:val="Heading2"/>
@@ -3469,7 +3469,7 @@
       </w:r>
     </w:p>
     <w:bookmarkEnd w:id="57"/>
-    <w:bookmarkStart w:id="58" w:name="X4dc1cb5376edc7889a3716170578ee1fa879461"/>
+    <w:bookmarkStart w:id="76" w:name="X4dc1cb5376edc7889a3716170578ee1fa879461"/>
     <w:p>
       <w:pPr>
         <w:pStyle w:val="Heading3"/>
@@ -3483,61 +3483,20 @@
         <w:pStyle w:val="FirstParagraph"/>
       </w:pPr>
       <w:r>
-        <w:t xml:space="preserve">Each principal screen is described below with reference to its screenshot. (The screenshots are collected, with justifications, in §4.6; here they are discussed from the standpoint of interface design.)</w:t>
-      </w:r>
-    </w:p>
-    <w:p>
-      <w:pPr>
-        <w:pStyle w:val="BodyText"/>
-      </w:pPr>
-      <w:r>
-        <w:rPr>
-          <w:b/>
-          <w:bCs/>
-        </w:rPr>
-        <w:t xml:space="preserve">Authentication.</w:t>
-      </w:r>
-      <w:r>
-        <w:t xml:space="preserve"> </w:t>
-      </w:r>
-      <w:r>
-        <w:t xml:space="preserve">The login and registration screens (Figures 4.29 and 4.30) present a single focused form. Their minimalism reflects the design goal of moving the analyst into the workspace with the least friction; all other functionality is gated behind successful authentication.</w:t>
-      </w:r>
-    </w:p>
-    <w:p>
-      <w:pPr>
-        <w:pStyle w:val="BodyText"/>
-      </w:pPr>
-      <w:r>
-        <w:rPr>
-          <w:b/>
-          <w:bCs/>
-        </w:rPr>
-        <w:t xml:space="preserve">Dashboard.</w:t>
-      </w:r>
-      <w:r>
-        <w:t xml:space="preserve"> </w:t>
-      </w:r>
-      <w:r>
-        <w:t xml:space="preserve">The dashboard (Figure 4.31) is the landing screen and the clearest expression of the system's value. It is organised top-to-bottom in decreasing order of abstraction: four key-performance-indicator cards give the headline counts (Total Findings, Confirmed, Needs Review, Total Uploads); three charts characterise the dataset (a severity-breakdown pie, a classification-results pie, and a scans-by-tool bar chart); and a Top-10-by-CVSS table lets the analyst drill straight into the most severe findings. This layout embodies the "overview first, detail on demand" principle of information-dashboard design.</w:t>
-      </w:r>
-    </w:p>
-    <w:p>
-      <w:pPr>
-        <w:pStyle w:val="BodyText"/>
-      </w:pPr>
-      <w:r>
-        <w:rPr>
-          <w:b/>
-          <w:bCs/>
-        </w:rPr>
-        <w:t xml:space="preserve">Upload.</w:t>
-      </w:r>
-      <w:r>
-        <w:t xml:space="preserve"> </w:t>
-      </w:r>
-      <w:r>
-        <w:t xml:space="preserve">The upload screen (Figure 4.32) is the primary ingestion path. It is divided into three regions: a scanner-type selector and drag-and-drop file zone; a</w:t>
+        <w:t xml:space="preserve">Before implementation began, the intended appearance of each principal screen was sketched as a</w:t>
+      </w:r>
+      <w:r>
+        <w:t xml:space="preserve"> </w:t>
+      </w:r>
+      <w:r>
+        <w:rPr>
+          <w:b/>
+          <w:bCs/>
+        </w:rPr>
+        <w:t xml:space="preserve">low-fidelity wireframe</w:t>
+      </w:r>
+      <w:r>
+        <w:t xml:space="preserve">. These wireframes (Figures 4.11–4.16) are deliberately draft-quality — greyscale placeholder boxes, dashed drop-zones and squiggle text lines rather than final styling — so that the</w:t>
       </w:r>
       <w:r>
         <w:t xml:space="preserve"> </w:t>
@@ -3547,117 +3506,31 @@
           <w:i/>
           <w:iCs/>
         </w:rPr>
-        <w:t xml:space="preserve">Pipeline Options</w:t>
-      </w:r>
-      <w:r>
-        <w:t xml:space="preserve"> </w:t>
-      </w:r>
-      <w:r>
-        <w:t xml:space="preserve">region exposing the Exploit-Lookup and PoC-Validation toggles, each annotated with a plain-language description of what it does and its safety implications; and an upload-history table with a per-row action to run the pipeline. Surfacing the two optional, potentially intrusive capabilities as clearly-labelled toggles — rather than hiding them in configuration — is a deliberate usability and safety decision.</w:t>
-      </w:r>
-    </w:p>
-    <w:p>
-      <w:pPr>
-        <w:pStyle w:val="BodyText"/>
-      </w:pPr>
-      <w:r>
-        <w:rPr>
-          <w:b/>
-          <w:bCs/>
-        </w:rPr>
-        <w:t xml:space="preserve">Auto Scan.</w:t>
-      </w:r>
-      <w:r>
-        <w:t xml:space="preserve"> </w:t>
-      </w:r>
-      <w:r>
-        <w:t xml:space="preserve">The Auto Scan screen (Figure 4.33) provides a target field, scanner check-boxes, and, crucially, an explicit authorisation acknowledgement that must be ticked before a scan can start. This gate is the interface-level expression of the responsible-operation principle.</w:t>
-      </w:r>
-    </w:p>
-    <w:p>
-      <w:pPr>
-        <w:pStyle w:val="BodyText"/>
-      </w:pPr>
-      <w:r>
-        <w:rPr>
-          <w:b/>
-          <w:bCs/>
-        </w:rPr>
-        <w:t xml:space="preserve">Findings.</w:t>
-      </w:r>
-      <w:r>
-        <w:t xml:space="preserve"> </w:t>
-      </w:r>
-      <w:r>
-        <w:t xml:space="preserve">The findings screen (Figure 4.34) is the analyst's primary working list: a filterable, sortable table of all normalised findings, with columns for severity, CVSS, classification, scanner, and CWE. The classification badge in each row lets the analyst immediately focus on</w:t>
-      </w:r>
-      <w:r>
-        <w:t xml:space="preserve"> </w:t>
-      </w:r>
-      <w:r>
-        <w:rPr>
-          <w:i/>
-          <w:iCs/>
-        </w:rPr>
-        <w:t xml:space="preserve">Confirmed</w:t>
-      </w:r>
-      <w:r>
-        <w:t xml:space="preserve"> </w:t>
-      </w:r>
-      <w:r>
-        <w:t xml:space="preserve">items and ignore auto-dismissed noise — the practical payoff of the whole system.</w:t>
-      </w:r>
-    </w:p>
-    <w:p>
-      <w:pPr>
-        <w:pStyle w:val="BodyText"/>
-      </w:pPr>
-      <w:r>
-        <w:rPr>
-          <w:b/>
-          <w:bCs/>
-        </w:rPr>
-        <w:t xml:space="preserve">Finding detail.</w:t>
-      </w:r>
-      <w:r>
-        <w:t xml:space="preserve"> </w:t>
-      </w:r>
-      <w:r>
-        <w:t xml:space="preserve">The finding-detail screen (Figure 4.35) is the deepest and most important screen. It presents, in a single scroll, the finding's identity and metadata, its classification (with an override control), the</w:t>
-      </w:r>
-      <w:r>
-        <w:t xml:space="preserve"> </w:t>
-      </w:r>
-      <w:r>
-        <w:rPr>
-          <w:b/>
-          <w:bCs/>
-        </w:rPr>
-        <w:t xml:space="preserve">confidence score and its full six-factor breakdown</w:t>
-      </w:r>
-      <w:r>
-        <w:t xml:space="preserve"> </w:t>
-      </w:r>
-      <w:r>
-        <w:t xml:space="preserve">(discussed in detail in §4.5.4), the machine-learning priority prediction, the CVSS v3 metrics, the description and recommended solution, and the proof-of-concept evidence. This screen is where the system's commitment to explainability becomes concrete.</w:t>
-      </w:r>
-    </w:p>
-    <w:bookmarkEnd w:id="58"/>
-    <w:bookmarkStart w:id="62" w:name="Xfe4b3d2a1603b4266f0d9d4011d3a335f86431b"/>
-    <w:p>
-      <w:pPr>
-        <w:pStyle w:val="Heading3"/>
-      </w:pPr>
-      <w:r>
-        <w:t xml:space="preserve">4.4.4 Storyboard</w:t>
-      </w:r>
-    </w:p>
-    <w:p>
-      <w:pPr>
-        <w:pStyle w:val="FirstParagraph"/>
-      </w:pPr>
-      <w:r>
-        <w:t xml:space="preserve">Figure 4.11 summarises the intended user journey through the interface, from authentication to the final report.</w:t>
+        <w:t xml:space="preserve">layout and information hierarchy</w:t>
+      </w:r>
+      <w:r>
+        <w:t xml:space="preserve"> </w:t>
+      </w:r>
+      <w:r>
+        <w:t xml:space="preserve">could be agreed before any code was written. Their role is to fix, up front, where each element sits, what data each screen surfaces, and how the analyst moves through the workflow; the finished, working screens are shown later as real screenshots in §4.6, and can be compared against these drafts. There are a number of main screens in the graphical user interface that assist with the entire vulnerability triage process, each built to serve a particular purpose while sharing a common layout and navigation system.</w:t>
+      </w:r>
+    </w:p>
+    <w:p>
+      <w:pPr>
+        <w:pStyle w:val="BodyText"/>
+      </w:pPr>
+      <w:r>
+        <w:rPr>
+          <w:b/>
+          <w:bCs/>
+        </w:rPr>
+        <w:t xml:space="preserve">Authentication Screen.</w:t>
+      </w:r>
+      <w:r>
+        <w:t xml:space="preserve"> </w:t>
+      </w:r>
+      <w:r>
+        <w:t xml:space="preserve">The authentication interface (Figure 4.11) allows users to sign up for new accounts as well as log into the application securely. The interface has a straightforward form that asks for user information and only allows access to the system when it is entered. If authentication succeeds, the user gains access to the protected features of the application, and a user session is established. Its minimalism reflects the design goal of moving the analyst into the workspace with the least friction; all other functionality is gated behind successful authentication.</w:t>
       </w:r>
     </w:p>
     <w:p>
@@ -3667,20 +3540,542 @@
       <w:r>
         <w:drawing>
           <wp:inline>
-            <wp:extent cx="5334000" cy="222587"/>
+            <wp:extent cx="5334000" cy="2362962"/>
             <wp:effectExtent b="0" l="0" r="0" t="0"/>
-            <wp:docPr descr="Figure 4.11: Storyboard — User Journey" title="" id="60" name="Picture"/>
+            <wp:docPr descr="Figure 4.11: Authentication Screen wireframe" title="" id="59" name="Picture"/>
             <a:graphic>
               <a:graphicData uri="http://schemas.openxmlformats.org/drawingml/2006/picture">
                 <pic:pic>
                   <pic:nvPicPr>
-                    <pic:cNvPr descr="diagrams/diagram-11.png" id="61" name="Picture"/>
+                    <pic:cNvPr descr="wireframes/wf-01-auth.png" id="60" name="Picture"/>
                     <pic:cNvPicPr>
                       <a:picLocks noChangeArrowheads="1" noChangeAspect="1"/>
                     </pic:cNvPicPr>
                   </pic:nvPicPr>
                   <pic:blipFill>
-                    <a:blip r:embed="rId59"/>
+                    <a:blip r:embed="rId58"/>
+                    <a:stretch>
+                      <a:fillRect/>
+                    </a:stretch>
+                  </pic:blipFill>
+                  <pic:spPr bwMode="auto">
+                    <a:xfrm>
+                      <a:off x="0" y="0"/>
+                      <a:ext cx="5334000" cy="2362962"/>
+                    </a:xfrm>
+                    <a:prstGeom prst="rect">
+                      <a:avLst/>
+                    </a:prstGeom>
+                    <a:noFill/>
+                    <a:ln w="9525">
+                      <a:noFill/>
+                      <a:headEnd/>
+                      <a:tailEnd/>
+                    </a:ln>
+                  </pic:spPr>
+                </pic:pic>
+              </a:graphicData>
+            </a:graphic>
+          </wp:inline>
+        </w:drawing>
+      </w:r>
+    </w:p>
+    <w:p>
+      <w:pPr>
+        <w:pStyle w:val="BodyText"/>
+      </w:pPr>
+      <w:r>
+        <w:rPr>
+          <w:b/>
+          <w:bCs/>
+        </w:rPr>
+        <w:t xml:space="preserve">Figure 4.11: Authentication Screen — pre-implementation wireframe.</w:t>
+      </w:r>
+      <w:r>
+        <w:t xml:space="preserve"> </w:t>
+      </w:r>
+      <w:r>
+        <w:rPr>
+          <w:i/>
+          <w:iCs/>
+        </w:rPr>
+        <w:t xml:space="preserve">A single focused login/register card; access to every other screen is gated behind it.</w:t>
+      </w:r>
+    </w:p>
+    <w:p>
+      <w:pPr>
+        <w:pStyle w:val="BodyText"/>
+      </w:pPr>
+      <w:r>
+        <w:rPr>
+          <w:b/>
+          <w:bCs/>
+        </w:rPr>
+        <w:t xml:space="preserve">Dashboard.</w:t>
+      </w:r>
+      <w:r>
+        <w:t xml:space="preserve"> </w:t>
+      </w:r>
+      <w:r>
+        <w:t xml:space="preserve">After authentication, the dashboard (Figure 4.12) is the primary landing page and displays the results of the vulnerability assessment. Several key performance indicators are listed at the top of the page — the total number of findings, confirmed vulnerabilities, findings requiring manual verification, and uploaded scanner reports. Interactive charts provide a summary of the severity of the vulnerabilities, the distribution of their classification, and the scanners used to detect them. A ranked table lists the most severe vulnerabilities by CVSS score. This layout embodies the "overview first, detail on demand" principle of information-dashboard design, organised top-to-bottom in decreasing order of abstraction.</w:t>
+      </w:r>
+    </w:p>
+    <w:p>
+      <w:pPr>
+        <w:pStyle w:val="BodyText"/>
+      </w:pPr>
+      <w:r>
+        <w:drawing>
+          <wp:inline>
+            <wp:extent cx="5334000" cy="3211068"/>
+            <wp:effectExtent b="0" l="0" r="0" t="0"/>
+            <wp:docPr descr="Figure 4.12: Dashboard wireframe" title="" id="62" name="Picture"/>
+            <a:graphic>
+              <a:graphicData uri="http://schemas.openxmlformats.org/drawingml/2006/picture">
+                <pic:pic>
+                  <pic:nvPicPr>
+                    <pic:cNvPr descr="wireframes/wf-02-dashboard.png" id="63" name="Picture"/>
+                    <pic:cNvPicPr>
+                      <a:picLocks noChangeArrowheads="1" noChangeAspect="1"/>
+                    </pic:cNvPicPr>
+                  </pic:nvPicPr>
+                  <pic:blipFill>
+                    <a:blip r:embed="rId61"/>
+                    <a:stretch>
+                      <a:fillRect/>
+                    </a:stretch>
+                  </pic:blipFill>
+                  <pic:spPr bwMode="auto">
+                    <a:xfrm>
+                      <a:off x="0" y="0"/>
+                      <a:ext cx="5334000" cy="3211068"/>
+                    </a:xfrm>
+                    <a:prstGeom prst="rect">
+                      <a:avLst/>
+                    </a:prstGeom>
+                    <a:noFill/>
+                    <a:ln w="9525">
+                      <a:noFill/>
+                      <a:headEnd/>
+                      <a:tailEnd/>
+                    </a:ln>
+                  </pic:spPr>
+                </pic:pic>
+              </a:graphicData>
+            </a:graphic>
+          </wp:inline>
+        </w:drawing>
+      </w:r>
+    </w:p>
+    <w:p>
+      <w:pPr>
+        <w:pStyle w:val="BodyText"/>
+      </w:pPr>
+      <w:r>
+        <w:rPr>
+          <w:b/>
+          <w:bCs/>
+        </w:rPr>
+        <w:t xml:space="preserve">Figure 4.12: Dashboard — pre-implementation wireframe.</w:t>
+      </w:r>
+      <w:r>
+        <w:t xml:space="preserve"> </w:t>
+      </w:r>
+      <w:r>
+        <w:rPr>
+          <w:i/>
+          <w:iCs/>
+        </w:rPr>
+        <w:t xml:space="preserve">KPI cards, three summary charts, and a top-vulnerabilities-by-CVSS table.</w:t>
+      </w:r>
+    </w:p>
+    <w:p>
+      <w:pPr>
+        <w:pStyle w:val="BodyText"/>
+      </w:pPr>
+      <w:r>
+        <w:rPr>
+          <w:b/>
+          <w:bCs/>
+        </w:rPr>
+        <w:t xml:space="preserve">Upload Screen.</w:t>
+      </w:r>
+      <w:r>
+        <w:t xml:space="preserve"> </w:t>
+      </w:r>
+      <w:r>
+        <w:t xml:space="preserve">Supported scanners such as OWASP ZAP, Nuclei and Nessus can be used to report vulnerabilities on the Upload screen (Figure 4.13). It is possible to enable optional processing functionality — an exploit search and Proof-of-Concept (PoC) checking — prior to the start of a vulnerability triage pipeline. Previous reports are also visible, to aid reprocessing and review. Surfacing the two optional, potentially intrusive capabilities as clearly-labelled toggles — rather than hiding them in configuration — is a deliberate usability and safety decision.</w:t>
+      </w:r>
+    </w:p>
+    <w:p>
+      <w:pPr>
+        <w:pStyle w:val="BodyText"/>
+      </w:pPr>
+      <w:r>
+        <w:drawing>
+          <wp:inline>
+            <wp:extent cx="5334000" cy="2368296"/>
+            <wp:effectExtent b="0" l="0" r="0" t="0"/>
+            <wp:docPr descr="Figure 4.13: Upload Screen wireframe" title="" id="65" name="Picture"/>
+            <a:graphic>
+              <a:graphicData uri="http://schemas.openxmlformats.org/drawingml/2006/picture">
+                <pic:pic>
+                  <pic:nvPicPr>
+                    <pic:cNvPr descr="wireframes/wf-03-upload.png" id="66" name="Picture"/>
+                    <pic:cNvPicPr>
+                      <a:picLocks noChangeArrowheads="1" noChangeAspect="1"/>
+                    </pic:cNvPicPr>
+                  </pic:nvPicPr>
+                  <pic:blipFill>
+                    <a:blip r:embed="rId64"/>
+                    <a:stretch>
+                      <a:fillRect/>
+                    </a:stretch>
+                  </pic:blipFill>
+                  <pic:spPr bwMode="auto">
+                    <a:xfrm>
+                      <a:off x="0" y="0"/>
+                      <a:ext cx="5334000" cy="2368296"/>
+                    </a:xfrm>
+                    <a:prstGeom prst="rect">
+                      <a:avLst/>
+                    </a:prstGeom>
+                    <a:noFill/>
+                    <a:ln w="9525">
+                      <a:noFill/>
+                      <a:headEnd/>
+                      <a:tailEnd/>
+                    </a:ln>
+                  </pic:spPr>
+                </pic:pic>
+              </a:graphicData>
+            </a:graphic>
+          </wp:inline>
+        </w:drawing>
+      </w:r>
+    </w:p>
+    <w:p>
+      <w:pPr>
+        <w:pStyle w:val="BodyText"/>
+      </w:pPr>
+      <w:r>
+        <w:rPr>
+          <w:b/>
+          <w:bCs/>
+        </w:rPr>
+        <w:t xml:space="preserve">Figure 4.13: Upload Screen — pre-implementation wireframe.</w:t>
+      </w:r>
+      <w:r>
+        <w:t xml:space="preserve"> </w:t>
+      </w:r>
+      <w:r>
+        <w:rPr>
+          <w:i/>
+          <w:iCs/>
+        </w:rPr>
+        <w:t xml:space="preserve">Scanner-type selector, drag-and-drop zone, pipeline-option toggles, and an upload-history table.</w:t>
+      </w:r>
+    </w:p>
+    <w:p>
+      <w:pPr>
+        <w:pStyle w:val="BodyText"/>
+      </w:pPr>
+      <w:r>
+        <w:rPr>
+          <w:b/>
+          <w:bCs/>
+        </w:rPr>
+        <w:t xml:space="preserve">Auto Scan Screen.</w:t>
+      </w:r>
+      <w:r>
+        <w:t xml:space="preserve"> </w:t>
+      </w:r>
+      <w:r>
+        <w:t xml:space="preserve">Authorised users are able to conduct their vulnerability assessments directly from the Auto Scan interface (Figure 4.14). Before the scanning process starts, users define the target URL, select the scanning tools they wish to use, and confirm they have permission to evaluate the specified target. This acknowledgement helps validate the ethical and authorised use of active security testing, and is the interface-level expression of the responsible-operation principle.</w:t>
+      </w:r>
+    </w:p>
+    <w:p>
+      <w:pPr>
+        <w:pStyle w:val="BodyText"/>
+      </w:pPr>
+      <w:r>
+        <w:drawing>
+          <wp:inline>
+            <wp:extent cx="5334000" cy="2837688"/>
+            <wp:effectExtent b="0" l="0" r="0" t="0"/>
+            <wp:docPr descr="Figure 4.14: Auto Scan Screen wireframe" title="" id="68" name="Picture"/>
+            <a:graphic>
+              <a:graphicData uri="http://schemas.openxmlformats.org/drawingml/2006/picture">
+                <pic:pic>
+                  <pic:nvPicPr>
+                    <pic:cNvPr descr="wireframes/wf-04-autoscan.png" id="69" name="Picture"/>
+                    <pic:cNvPicPr>
+                      <a:picLocks noChangeArrowheads="1" noChangeAspect="1"/>
+                    </pic:cNvPicPr>
+                  </pic:nvPicPr>
+                  <pic:blipFill>
+                    <a:blip r:embed="rId67"/>
+                    <a:stretch>
+                      <a:fillRect/>
+                    </a:stretch>
+                  </pic:blipFill>
+                  <pic:spPr bwMode="auto">
+                    <a:xfrm>
+                      <a:off x="0" y="0"/>
+                      <a:ext cx="5334000" cy="2837688"/>
+                    </a:xfrm>
+                    <a:prstGeom prst="rect">
+                      <a:avLst/>
+                    </a:prstGeom>
+                    <a:noFill/>
+                    <a:ln w="9525">
+                      <a:noFill/>
+                      <a:headEnd/>
+                      <a:tailEnd/>
+                    </a:ln>
+                  </pic:spPr>
+                </pic:pic>
+              </a:graphicData>
+            </a:graphic>
+          </wp:inline>
+        </w:drawing>
+      </w:r>
+    </w:p>
+    <w:p>
+      <w:pPr>
+        <w:pStyle w:val="BodyText"/>
+      </w:pPr>
+      <w:r>
+        <w:rPr>
+          <w:b/>
+          <w:bCs/>
+        </w:rPr>
+        <w:t xml:space="preserve">Figure 4.14: Auto Scan Screen — pre-implementation wireframe.</w:t>
+      </w:r>
+      <w:r>
+        <w:t xml:space="preserve"> </w:t>
+      </w:r>
+      <w:r>
+        <w:rPr>
+          <w:i/>
+          <w:iCs/>
+        </w:rPr>
+        <w:t xml:space="preserve">Target field, scanner selection, and the mandatory authorisation gate that must be ticked before scanning.</w:t>
+      </w:r>
+    </w:p>
+    <w:p>
+      <w:pPr>
+        <w:pStyle w:val="BodyText"/>
+      </w:pPr>
+      <w:r>
+        <w:rPr>
+          <w:b/>
+          <w:bCs/>
+        </w:rPr>
+        <w:t xml:space="preserve">Findings Screen.</w:t>
+      </w:r>
+      <w:r>
+        <w:t xml:space="preserve"> </w:t>
+      </w:r>
+      <w:r>
+        <w:t xml:space="preserve">All processed vulnerabilities are listed in the Findings screen (Figure 4.15) in a table that is searchable and filterable. For each vulnerability, the table shows the severity level, CVSS score, CWE ID, the scanner that found it, the confidence level, and the status. Filtering and sorting enable analysts to quickly narrow down the results to find the high-priority findings that need further analysis — the practical payoff of the whole system.</w:t>
+      </w:r>
+    </w:p>
+    <w:p>
+      <w:pPr>
+        <w:pStyle w:val="BodyText"/>
+      </w:pPr>
+      <w:r>
+        <w:drawing>
+          <wp:inline>
+            <wp:extent cx="5334000" cy="2186940"/>
+            <wp:effectExtent b="0" l="0" r="0" t="0"/>
+            <wp:docPr descr="Figure 4.15: Findings Screen wireframe" title="" id="71" name="Picture"/>
+            <a:graphic>
+              <a:graphicData uri="http://schemas.openxmlformats.org/drawingml/2006/picture">
+                <pic:pic>
+                  <pic:nvPicPr>
+                    <pic:cNvPr descr="wireframes/wf-05-findings.png" id="72" name="Picture"/>
+                    <pic:cNvPicPr>
+                      <a:picLocks noChangeArrowheads="1" noChangeAspect="1"/>
+                    </pic:cNvPicPr>
+                  </pic:nvPicPr>
+                  <pic:blipFill>
+                    <a:blip r:embed="rId70"/>
+                    <a:stretch>
+                      <a:fillRect/>
+                    </a:stretch>
+                  </pic:blipFill>
+                  <pic:spPr bwMode="auto">
+                    <a:xfrm>
+                      <a:off x="0" y="0"/>
+                      <a:ext cx="5334000" cy="2186940"/>
+                    </a:xfrm>
+                    <a:prstGeom prst="rect">
+                      <a:avLst/>
+                    </a:prstGeom>
+                    <a:noFill/>
+                    <a:ln w="9525">
+                      <a:noFill/>
+                      <a:headEnd/>
+                      <a:tailEnd/>
+                    </a:ln>
+                  </pic:spPr>
+                </pic:pic>
+              </a:graphicData>
+            </a:graphic>
+          </wp:inline>
+        </w:drawing>
+      </w:r>
+    </w:p>
+    <w:p>
+      <w:pPr>
+        <w:pStyle w:val="BodyText"/>
+      </w:pPr>
+      <w:r>
+        <w:rPr>
+          <w:b/>
+          <w:bCs/>
+        </w:rPr>
+        <w:t xml:space="preserve">Figure 4.15: Findings Screen — pre-implementation wireframe.</w:t>
+      </w:r>
+      <w:r>
+        <w:t xml:space="preserve"> </w:t>
+      </w:r>
+      <w:r>
+        <w:rPr>
+          <w:i/>
+          <w:iCs/>
+        </w:rPr>
+        <w:t xml:space="preserve">A searchable, filterable table of every triaged finding with its classification status.</w:t>
+      </w:r>
+    </w:p>
+    <w:p>
+      <w:pPr>
+        <w:pStyle w:val="BodyText"/>
+      </w:pPr>
+      <w:r>
+        <w:rPr>
+          <w:b/>
+          <w:bCs/>
+        </w:rPr>
+        <w:t xml:space="preserve">Finding Details Screen.</w:t>
+      </w:r>
+      <w:r>
+        <w:t xml:space="preserve"> </w:t>
+      </w:r>
+      <w:r>
+        <w:t xml:space="preserve">The Finding Details interface (Figure 4.16) shows detailed information about a single vulnerability. The page outlines the vulnerability description, CVSS metrics, CWE information, the machine-learning prediction, the confidence score, the factor breakdown, the Proof-of-Concept (PoC) validation results, and remediation recommendations. The classification may also be manually changed by analysts when professional judgement deems a different classification warranted. This interface gives full visibility into the rationale behind every vulnerability classification and enables informed security decision-making — the point at which the system's commitment to explainability becomes concrete.</w:t>
+      </w:r>
+    </w:p>
+    <w:p>
+      <w:pPr>
+        <w:pStyle w:val="BodyText"/>
+      </w:pPr>
+      <w:r>
+        <w:drawing>
+          <wp:inline>
+            <wp:extent cx="5334000" cy="3781806"/>
+            <wp:effectExtent b="0" l="0" r="0" t="0"/>
+            <wp:docPr descr="Figure 4.16: Finding Details Screen wireframe" title="" id="74" name="Picture"/>
+            <a:graphic>
+              <a:graphicData uri="http://schemas.openxmlformats.org/drawingml/2006/picture">
+                <pic:pic>
+                  <pic:nvPicPr>
+                    <pic:cNvPr descr="wireframes/wf-06-details.png" id="75" name="Picture"/>
+                    <pic:cNvPicPr>
+                      <a:picLocks noChangeArrowheads="1" noChangeAspect="1"/>
+                    </pic:cNvPicPr>
+                  </pic:nvPicPr>
+                  <pic:blipFill>
+                    <a:blip r:embed="rId73"/>
+                    <a:stretch>
+                      <a:fillRect/>
+                    </a:stretch>
+                  </pic:blipFill>
+                  <pic:spPr bwMode="auto">
+                    <a:xfrm>
+                      <a:off x="0" y="0"/>
+                      <a:ext cx="5334000" cy="3781806"/>
+                    </a:xfrm>
+                    <a:prstGeom prst="rect">
+                      <a:avLst/>
+                    </a:prstGeom>
+                    <a:noFill/>
+                    <a:ln w="9525">
+                      <a:noFill/>
+                      <a:headEnd/>
+                      <a:tailEnd/>
+                    </a:ln>
+                  </pic:spPr>
+                </pic:pic>
+              </a:graphicData>
+            </a:graphic>
+          </wp:inline>
+        </w:drawing>
+      </w:r>
+    </w:p>
+    <w:p>
+      <w:pPr>
+        <w:pStyle w:val="BodyText"/>
+      </w:pPr>
+      <w:r>
+        <w:rPr>
+          <w:b/>
+          <w:bCs/>
+        </w:rPr>
+        <w:t xml:space="preserve">Figure 4.16: Finding Details Screen — pre-implementation wireframe.</w:t>
+      </w:r>
+      <w:r>
+        <w:t xml:space="preserve"> </w:t>
+      </w:r>
+      <w:r>
+        <w:rPr>
+          <w:i/>
+          <w:iCs/>
+        </w:rPr>
+        <w:t xml:space="preserve">Full per-finding rationale: description, CVSS/CWE, ML prediction, confidence score with its six-factor breakdown, PoC evidence, remediation, and an analyst reclassify control.</w:t>
+      </w:r>
+    </w:p>
+    <w:bookmarkEnd w:id="76"/>
+    <w:bookmarkStart w:id="80" w:name="Xfe4b3d2a1603b4266f0d9d4011d3a335f86431b"/>
+    <w:p>
+      <w:pPr>
+        <w:pStyle w:val="Heading3"/>
+      </w:pPr>
+      <w:r>
+        <w:t xml:space="preserve">4.4.4 Storyboard</w:t>
+      </w:r>
+    </w:p>
+    <w:p>
+      <w:pPr>
+        <w:pStyle w:val="FirstParagraph"/>
+      </w:pPr>
+      <w:r>
+        <w:t xml:space="preserve">Figure 4.17 summarises the intended user journey through the interface, from authentication to the final report.</w:t>
+      </w:r>
+    </w:p>
+    <w:p>
+      <w:pPr>
+        <w:pStyle w:val="BodyText"/>
+      </w:pPr>
+      <w:r>
+        <w:drawing>
+          <wp:inline>
+            <wp:extent cx="5334000" cy="222587"/>
+            <wp:effectExtent b="0" l="0" r="0" t="0"/>
+            <wp:docPr descr="Figure 4.17: Storyboard — User Journey" title="" id="78" name="Picture"/>
+            <a:graphic>
+              <a:graphicData uri="http://schemas.openxmlformats.org/drawingml/2006/picture">
+                <pic:pic>
+                  <pic:nvPicPr>
+                    <pic:cNvPr descr="diagrams/diagram-11.png" id="79" name="Picture"/>
+                    <pic:cNvPicPr>
+                      <a:picLocks noChangeArrowheads="1" noChangeAspect="1"/>
+                    </pic:cNvPicPr>
+                  </pic:nvPicPr>
+                  <pic:blipFill>
+                    <a:blip r:embed="rId77"/>
                     <a:stretch>
                       <a:fillRect/>
                     </a:stretch>
@@ -3716,7 +4111,7 @@
           <w:b/>
           <w:bCs/>
         </w:rPr>
-        <w:t xml:space="preserve">Figure 4.11: Storyboard — User Journey</w:t>
+        <w:t xml:space="preserve">Figure 4.17: Storyboard — User Journey</w:t>
       </w:r>
     </w:p>
     <w:p>
@@ -3726,9 +4121,9 @@
         </w:pict>
       </w:r>
     </w:p>
-    <w:bookmarkEnd w:id="62"/>
-    <w:bookmarkEnd w:id="63"/>
-    <w:bookmarkStart w:id="129" w:name="X91b3a7e34e6a6cb09e8dd74f95685ddbfe6f32d"/>
+    <w:bookmarkEnd w:id="80"/>
+    <w:bookmarkEnd w:id="81"/>
+    <w:bookmarkStart w:id="147" w:name="X91b3a7e34e6a6cb09e8dd74f95685ddbfe6f32d"/>
     <w:p>
       <w:pPr>
         <w:pStyle w:val="Heading2"/>
@@ -3737,7 +4132,7 @@
         <w:t xml:space="preserve">4.5 Execution</w:t>
       </w:r>
     </w:p>
-    <w:bookmarkStart w:id="67" w:name="X6434f5108974b9e75af8f7d507078b1e7c590c4"/>
+    <w:bookmarkStart w:id="85" w:name="X6434f5108974b9e75af8f7d507078b1e7c590c4"/>
     <w:p>
       <w:pPr>
         <w:pStyle w:val="Heading3"/>
@@ -3751,7 +4146,7 @@
         <w:pStyle w:val="FirstParagraph"/>
       </w:pPr>
       <w:r>
-        <w:t xml:space="preserve">From a single codebase, VulnTriage runs in three modes so that it suits both interactive analysis and automation. Figure 4.12 shows how the three modes share the engine pipeline and the model while differing in their front end and database.</w:t>
+        <w:t xml:space="preserve">From a single codebase, VulnTriage runs in three modes so that it suits both interactive analysis and automation. Figure 4.18 shows how the three modes share the engine pipeline and the model while differing in their front end and database.</w:t>
       </w:r>
     </w:p>
     <w:p>
@@ -3763,18 +4158,18 @@
           <wp:inline>
             <wp:extent cx="5334000" cy="1436076"/>
             <wp:effectExtent b="0" l="0" r="0" t="0"/>
-            <wp:docPr descr="Figure 4.12: Deployment Diagram — Three Run Modes" title="" id="65" name="Picture"/>
+            <wp:docPr descr="Figure 4.18: Deployment Diagram — Three Run Modes" title="" id="83" name="Picture"/>
             <a:graphic>
               <a:graphicData uri="http://schemas.openxmlformats.org/drawingml/2006/picture">
                 <pic:pic>
                   <pic:nvPicPr>
-                    <pic:cNvPr descr="diagrams/diagram-12.png" id="66" name="Picture"/>
+                    <pic:cNvPr descr="diagrams/diagram-12.png" id="84" name="Picture"/>
                     <pic:cNvPicPr>
                       <a:picLocks noChangeArrowheads="1" noChangeAspect="1"/>
                     </pic:cNvPicPr>
                   </pic:nvPicPr>
                   <pic:blipFill>
-                    <a:blip r:embed="rId64"/>
+                    <a:blip r:embed="rId82"/>
                     <a:stretch>
                       <a:fillRect/>
                     </a:stretch>
@@ -3810,7 +4205,7 @@
           <w:b/>
           <w:bCs/>
         </w:rPr>
-        <w:t xml:space="preserve">Figure 4.12: Deployment Diagram — Three Run Modes</w:t>
+        <w:t xml:space="preserve">Figure 4.18: Deployment Diagram — Three Run Modes</w:t>
       </w:r>
     </w:p>
     <w:p>
@@ -3956,8 +4351,8 @@
         <w:t xml:space="preserve">Because all three modes invoke the same engine services, their triage results are identical regardless of how the system is invoked — a direct benefit of the single-responsibility engine design.</w:t>
       </w:r>
     </w:p>
-    <w:bookmarkEnd w:id="67"/>
-    <w:bookmarkStart w:id="120" w:name="X23ae556abcc7c78b47557acf8f0115359dcfbb9"/>
+    <w:bookmarkEnd w:id="85"/>
+    <w:bookmarkStart w:id="138" w:name="X23ae556abcc7c78b47557acf8f0115359dcfbb9"/>
     <w:p>
       <w:pPr>
         <w:pStyle w:val="Heading3"/>
@@ -3993,7 +4388,7 @@
         <w:t xml:space="preserve">The ordering is not arbitrary; each stage depends on the outputs of the previous ones. The remainder of this section walks through the implementation of each engine in this order, presenting the essential code and explaining how it works. (The route that wires the engines together is shown in §4.5.4.)</w:t>
       </w:r>
     </w:p>
-    <w:bookmarkStart w:id="71" w:name="Xbdfcf480f175ce15e4a2fd3a422c1366e4d5db3"/>
+    <w:bookmarkStart w:id="89" w:name="Xbdfcf480f175ce15e4a2fd3a422c1366e4d5db3"/>
     <w:p>
       <w:pPr>
         <w:pStyle w:val="Heading4"/>
@@ -4037,7 +4432,7 @@
         <w:t xml:space="preserve"> </w:t>
       </w:r>
       <w:r>
-        <w:t xml:space="preserve">record. Figure 4.13 shows the dispatch function.</w:t>
+        <w:t xml:space="preserve">record. Figure 4.19 shows the dispatch function.</w:t>
       </w:r>
     </w:p>
     <w:p>
@@ -4049,18 +4444,18 @@
           <wp:inline>
             <wp:extent cx="5334000" cy="2183580"/>
             <wp:effectExtent b="0" l="0" r="0" t="0"/>
-            <wp:docPr descr="Scanner-parser dispatch" title="" id="69" name="Picture"/>
+            <wp:docPr descr="Scanner-parser dispatch" title="" id="87" name="Picture"/>
             <a:graphic>
               <a:graphicData uri="http://schemas.openxmlformats.org/drawingml/2006/picture">
                 <pic:pic>
                   <pic:nvPicPr>
-                    <pic:cNvPr descr="images/code-parsing.png" id="70" name="Picture"/>
+                    <pic:cNvPr descr="images/code-parsing.png" id="88" name="Picture"/>
                     <pic:cNvPicPr>
                       <a:picLocks noChangeArrowheads="1" noChangeAspect="1"/>
                     </pic:cNvPicPr>
                   </pic:nvPicPr>
                   <pic:blipFill>
-                    <a:blip r:embed="rId68"/>
+                    <a:blip r:embed="rId86"/>
                     <a:stretch>
                       <a:fillRect/>
                     </a:stretch>
@@ -4096,7 +4491,7 @@
           <w:b/>
           <w:bCs/>
         </w:rPr>
-        <w:t xml:space="preserve">Figure 4.13: Scanner-Parser Dispatch (parsers/</w:t>
+        <w:t xml:space="preserve">Figure 4.19: Scanner-Parser Dispatch (parsers/</w:t>
       </w:r>
       <w:r>
         <w:rPr>
@@ -4208,8 +4603,8 @@
         <w:t xml:space="preserve">: adding support for a new scanner is a matter of writing one parser class and registering it, with no change to any downstream engine — the practical expression of the "separation of scanning from triage" principle from §4.2.1.</w:t>
       </w:r>
     </w:p>
-    <w:bookmarkEnd w:id="71"/>
-    <w:bookmarkStart w:id="75" w:name="Xc438c1e55f8c0357d519f7249fc51e9f69775bd"/>
+    <w:bookmarkEnd w:id="89"/>
+    <w:bookmarkStart w:id="93" w:name="Xc438c1e55f8c0357d519f7249fc51e9f69775bd"/>
     <w:p>
       <w:pPr>
         <w:pStyle w:val="Heading4"/>
@@ -4253,7 +4648,7 @@
         <w:t xml:space="preserve"> </w:t>
       </w:r>
       <w:r>
-        <w:t xml:space="preserve">that the rest of the pipeline operates on, and it is the single chokepoint at which the data is cleaned. Figure 4.14 shows the core of the transformation.</w:t>
+        <w:t xml:space="preserve">that the rest of the pipeline operates on, and it is the single chokepoint at which the data is cleaned. Figure 4.20 shows the core of the transformation.</w:t>
       </w:r>
     </w:p>
     <w:p>
@@ -4265,18 +4660,18 @@
           <wp:inline>
             <wp:extent cx="5334000" cy="3677405"/>
             <wp:effectExtent b="0" l="0" r="0" t="0"/>
-            <wp:docPr descr="Building the NormalizedFinding" title="" id="73" name="Picture"/>
+            <wp:docPr descr="Building the NormalizedFinding" title="" id="91" name="Picture"/>
             <a:graphic>
               <a:graphicData uri="http://schemas.openxmlformats.org/drawingml/2006/picture">
                 <pic:pic>
                   <pic:nvPicPr>
-                    <pic:cNvPr descr="images/code-normalisation.png" id="74" name="Picture"/>
+                    <pic:cNvPr descr="images/code-normalisation.png" id="92" name="Picture"/>
                     <pic:cNvPicPr>
                       <a:picLocks noChangeArrowheads="1" noChangeAspect="1"/>
                     </pic:cNvPicPr>
                   </pic:nvPicPr>
                   <pic:blipFill>
-                    <a:blip r:embed="rId72"/>
+                    <a:blip r:embed="rId90"/>
                     <a:stretch>
                       <a:fillRect/>
                     </a:stretch>
@@ -4312,7 +4707,7 @@
           <w:b/>
           <w:bCs/>
         </w:rPr>
-        <w:t xml:space="preserve">Figure 4.14: Normalisation — Building the Canonical Finding (normalisation.py)</w:t>
+        <w:t xml:space="preserve">Figure 4.20: Normalisation — Building the Canonical Finding (normalisation.py)</w:t>
       </w:r>
     </w:p>
     <w:p>
@@ -4455,8 +4850,8 @@
         <w:t xml:space="preserve">records the originating scanner, both of which the deduplication and confidence stages later use.</w:t>
       </w:r>
     </w:p>
-    <w:bookmarkEnd w:id="75"/>
-    <w:bookmarkStart w:id="79" w:name="X7be591afe95c2511561b53376ab9fd8754b87c1"/>
+    <w:bookmarkEnd w:id="93"/>
+    <w:bookmarkStart w:id="97" w:name="X7be591afe95c2511561b53376ab9fd8754b87c1"/>
     <w:p>
       <w:pPr>
         <w:pStyle w:val="Heading4"/>
@@ -4470,7 +4865,7 @@
         <w:pStyle w:val="FirstParagraph"/>
       </w:pPr>
       <w:r>
-        <w:t xml:space="preserve">A single issue is frequently reported more than once — by the same scanner on different URLs, or by two different scanners. Deduplication collapses these into one canonical finding and, crucially, records the corroboration. Figure 4.15 shows the hashing and merging code.</w:t>
+        <w:t xml:space="preserve">A single issue is frequently reported more than once — by the same scanner on different URLs, or by two different scanners. Deduplication collapses these into one canonical finding and, crucially, records the corroboration. Figure 4.21 shows the hashing and merging code.</w:t>
       </w:r>
     </w:p>
     <w:p>
@@ -4482,18 +4877,18 @@
           <wp:inline>
             <wp:extent cx="5334000" cy="4944964"/>
             <wp:effectExtent b="0" l="0" r="0" t="0"/>
-            <wp:docPr descr="Group-hash computation and cross-scanner merge" title="" id="77" name="Picture"/>
+            <wp:docPr descr="Group-hash computation and cross-scanner merge" title="" id="95" name="Picture"/>
             <a:graphic>
               <a:graphicData uri="http://schemas.openxmlformats.org/drawingml/2006/picture">
                 <pic:pic>
                   <pic:nvPicPr>
-                    <pic:cNvPr descr="images/code-dedup.png" id="78" name="Picture"/>
+                    <pic:cNvPr descr="images/code-dedup.png" id="96" name="Picture"/>
                     <pic:cNvPicPr>
                       <a:picLocks noChangeArrowheads="1" noChangeAspect="1"/>
                     </pic:cNvPicPr>
                   </pic:nvPicPr>
                   <pic:blipFill>
-                    <a:blip r:embed="rId76"/>
+                    <a:blip r:embed="rId94"/>
                     <a:stretch>
                       <a:fillRect/>
                     </a:stretch>
@@ -4529,7 +4924,7 @@
           <w:b/>
           <w:bCs/>
         </w:rPr>
-        <w:t xml:space="preserve">Figure 4.15: Deduplication — SHA-256 Group Hash and Merge (deduplication.py)</w:t>
+        <w:t xml:space="preserve">Figure 4.21: Deduplication — SHA-256 Group Hash and Merge (deduplication.py)</w:t>
       </w:r>
     </w:p>
     <w:p>
@@ -4663,8 +5058,8 @@
         <w:t xml:space="preserve">is exactly the cross-tool corroboration signal that the Confidence Engine reads as its highest-weighted factor (§4.5.2.8), so deduplication is not merely tidying — it produces evidence.</w:t>
       </w:r>
     </w:p>
-    <w:bookmarkEnd w:id="79"/>
-    <w:bookmarkStart w:id="83" w:name="X473f28712003964d423f4b3ae4b099f9e263702"/>
+    <w:bookmarkEnd w:id="97"/>
+    <w:bookmarkStart w:id="101" w:name="X473f28712003964d423f4b3ae4b099f9e263702"/>
     <w:p>
       <w:pPr>
         <w:pStyle w:val="Heading4"/>
@@ -4678,7 +5073,7 @@
         <w:pStyle w:val="FirstParagraph"/>
       </w:pPr>
       <w:r>
-        <w:t xml:space="preserve">When a scanner supplies no weakness class, the CWE mapper assigns one from a curated keyword table so that later stages (the CVSS-vector inference and the confidence factor) have something to work with. Figure 4.16 shows the table and the matching function.</w:t>
+        <w:t xml:space="preserve">When a scanner supplies no weakness class, the CWE mapper assigns one from a curated keyword table so that later stages (the CVSS-vector inference and the confidence factor) have something to work with. Figure 4.22 shows the table and the matching function.</w:t>
       </w:r>
     </w:p>
     <w:p>
@@ -4690,18 +5085,18 @@
           <wp:inline>
             <wp:extent cx="5334000" cy="3670013"/>
             <wp:effectExtent b="0" l="0" r="0" t="0"/>
-            <wp:docPr descr="Keyword-to-CWE table and matcher" title="" id="81" name="Picture"/>
+            <wp:docPr descr="Keyword-to-CWE table and matcher" title="" id="99" name="Picture"/>
             <a:graphic>
               <a:graphicData uri="http://schemas.openxmlformats.org/drawingml/2006/picture">
                 <pic:pic>
                   <pic:nvPicPr>
-                    <pic:cNvPr descr="images/code-cwe-mapper.png" id="82" name="Picture"/>
+                    <pic:cNvPr descr="images/code-cwe-mapper.png" id="100" name="Picture"/>
                     <pic:cNvPicPr>
                       <a:picLocks noChangeArrowheads="1" noChangeAspect="1"/>
                     </pic:cNvPicPr>
                   </pic:nvPicPr>
                   <pic:blipFill>
-                    <a:blip r:embed="rId80"/>
+                    <a:blip r:embed="rId98"/>
                     <a:stretch>
                       <a:fillRect/>
                     </a:stretch>
@@ -4737,7 +5132,7 @@
           <w:b/>
           <w:bCs/>
         </w:rPr>
-        <w:t xml:space="preserve">Figure 4.16: CWE Mapping — Keyword Table and Matcher (cwe_mapper.py)</w:t>
+        <w:t xml:space="preserve">Figure 4.22: CWE Mapping — Keyword Table and Matcher (cwe_mapper.py)</w:t>
       </w:r>
     </w:p>
     <w:p>
@@ -4823,8 +5218,8 @@
         <w:t xml:space="preserve">" contains "rce".</w:t>
       </w:r>
     </w:p>
-    <w:bookmarkEnd w:id="83"/>
-    <w:bookmarkStart w:id="87" w:name="Xe1abe990cc56514e7f0542e8b01d4f9f1b3486b"/>
+    <w:bookmarkEnd w:id="101"/>
+    <w:bookmarkStart w:id="105" w:name="Xe1abe990cc56514e7f0542e8b01d4f9f1b3486b"/>
     <w:p>
       <w:pPr>
         <w:pStyle w:val="Heading4"/>
@@ -4838,7 +5233,7 @@
         <w:pStyle w:val="FirstParagraph"/>
       </w:pPr>
       <w:r>
-        <w:t xml:space="preserve">For findings that carry a CVE identifier, the NVD enrichment engine fills the authoritative CVSS vector and back-fills a weakness class from the National Vulnerability Database — working entirely offline from local compressed feeds. Figure 4.17 shows the CWE extraction and the streaming feed reader.</w:t>
+        <w:t xml:space="preserve">For findings that carry a CVE identifier, the NVD enrichment engine fills the authoritative CVSS vector and back-fills a weakness class from the National Vulnerability Database — working entirely offline from local compressed feeds. Figure 4.23 shows the CWE extraction and the streaming feed reader.</w:t>
       </w:r>
     </w:p>
     <w:p>
@@ -4850,18 +5245,18 @@
           <wp:inline>
             <wp:extent cx="5334000" cy="5219732"/>
             <wp:effectExtent b="0" l="0" r="0" t="0"/>
-            <wp:docPr descr="NVD CWE extraction and streaming feed reader" title="" id="85" name="Picture"/>
+            <wp:docPr descr="NVD CWE extraction and streaming feed reader" title="" id="103" name="Picture"/>
             <a:graphic>
               <a:graphicData uri="http://schemas.openxmlformats.org/drawingml/2006/picture">
                 <pic:pic>
                   <pic:nvPicPr>
-                    <pic:cNvPr descr="images/code-nvd.png" id="86" name="Picture"/>
+                    <pic:cNvPr descr="images/code-nvd.png" id="104" name="Picture"/>
                     <pic:cNvPicPr>
                       <a:picLocks noChangeArrowheads="1" noChangeAspect="1"/>
                     </pic:cNvPicPr>
                   </pic:nvPicPr>
                   <pic:blipFill>
-                    <a:blip r:embed="rId84"/>
+                    <a:blip r:embed="rId102"/>
                     <a:stretch>
                       <a:fillRect/>
                     </a:stretch>
@@ -4897,7 +5292,7 @@
           <w:b/>
           <w:bCs/>
         </w:rPr>
-        <w:t xml:space="preserve">Figure 4.17: NVD Enrichment — CWE Back-fill and .xz Streaming (nvd_enrichment.py)</w:t>
+        <w:t xml:space="preserve">Figure 4.23: NVD Enrichment — CWE Back-fill and .xz Streaming (nvd_enrichment.py)</w:t>
       </w:r>
     </w:p>
     <w:p>
@@ -4992,8 +5387,8 @@
         <w:t xml:space="preserve">form, keeping only the CVE identifiers actually being looked up. This constant-memory approach is a deliberate constraint: the feeds contain over one hundred thousand records and must never be decompressed to disk, so streaming is the only viable technique. The live NVD API is retained only as a fallback when a CVE is absent from the local feeds.</w:t>
       </w:r>
     </w:p>
-    <w:bookmarkEnd w:id="87"/>
-    <w:bookmarkStart w:id="91" w:name="X7238be38575327c7928f0732eaa64031f17a4ad"/>
+    <w:bookmarkEnd w:id="105"/>
+    <w:bookmarkStart w:id="109" w:name="X7238be38575327c7928f0732eaa64031f17a4ad"/>
     <w:p>
       <w:pPr>
         <w:pStyle w:val="Heading4"/>
@@ -5007,7 +5402,7 @@
         <w:pStyle w:val="FirstParagraph"/>
       </w:pPr>
       <w:r>
-        <w:t xml:space="preserve">Web-application findings frequently have a weakness class but no CVSS vector, which would leave the machine-learning model with an all-zero feature vector. This engine derives a plausible, data-driven vector from the CWE. Figure 4.18 shows the enrichment method.</w:t>
+        <w:t xml:space="preserve">Web-application findings frequently have a weakness class but no CVSS vector, which would leave the machine-learning model with an all-zero feature vector. This engine derives a plausible, data-driven vector from the CWE. Figure 4.24 shows the enrichment method.</w:t>
       </w:r>
     </w:p>
     <w:p>
@@ -5019,18 +5414,18 @@
           <wp:inline>
             <wp:extent cx="5334000" cy="2756442"/>
             <wp:effectExtent b="0" l="0" r="0" t="0"/>
-            <wp:docPr descr="CWE-to-CVSS vector inference" title="" id="89" name="Picture"/>
+            <wp:docPr descr="CWE-to-CVSS vector inference" title="" id="107" name="Picture"/>
             <a:graphic>
               <a:graphicData uri="http://schemas.openxmlformats.org/drawingml/2006/picture">
                 <pic:pic>
                   <pic:nvPicPr>
-                    <pic:cNvPr descr="images/code-cwe-cvss.png" id="90" name="Picture"/>
+                    <pic:cNvPr descr="images/code-cwe-cvss.png" id="108" name="Picture"/>
                     <pic:cNvPicPr>
                       <a:picLocks noChangeArrowheads="1" noChangeAspect="1"/>
                     </pic:cNvPicPr>
                   </pic:nvPicPr>
                   <pic:blipFill>
-                    <a:blip r:embed="rId88"/>
+                    <a:blip r:embed="rId106"/>
                     <a:stretch>
                       <a:fillRect/>
                     </a:stretch>
@@ -5066,7 +5461,7 @@
           <w:b/>
           <w:bCs/>
         </w:rPr>
-        <w:t xml:space="preserve">Figure 4.18: CWE→CVSS Vector Inference (cwe_cvss_enrichment.py)</w:t>
+        <w:t xml:space="preserve">Figure 4.24: CWE→CVSS Vector Inference (cwe_cvss_enrichment.py)</w:t>
       </w:r>
     </w:p>
     <w:p>
@@ -5116,8 +5511,8 @@
         <w:t xml:space="preserve">so that the provenance of the vector is recorded and can be noted in the confidence rationale. This step is what allows a vector-less ZAP finding such as a SQL injection to be prioritised as High by the model rather than defaulting to Low.</w:t>
       </w:r>
     </w:p>
-    <w:bookmarkEnd w:id="91"/>
-    <w:bookmarkStart w:id="101" w:name="Xbd3597ea3cf465b4e44519a10656f9ef4af3d85"/>
+    <w:bookmarkEnd w:id="109"/>
+    <w:bookmarkStart w:id="119" w:name="Xbd3597ea3cf465b4e44519a10656f9ef4af3d85"/>
     <w:p>
       <w:pPr>
         <w:pStyle w:val="Heading4"/>
@@ -5406,7 +5801,7 @@
         <w:t xml:space="preserve">which inputs it is permitted to see</w:t>
       </w:r>
       <w:r>
-        <w:t xml:space="preserve">. Figure 4.19 shows the feature definition. The model is given the eight CVSS v3 sub-metrics together with the numeric CWE identifier — nine features in total — but it is deliberately</w:t>
+        <w:t xml:space="preserve">. Figure 4.25 shows the feature definition. The model is given the eight CVSS v3 sub-metrics together with the numeric CWE identifier — nine features in total — but it is deliberately</w:t>
       </w:r>
       <w:r>
         <w:t xml:space="preserve"> </w:t>
@@ -5450,18 +5845,18 @@
           <wp:inline>
             <wp:extent cx="5334000" cy="1942011"/>
             <wp:effectExtent b="0" l="0" r="0" t="0"/>
-            <wp:docPr descr="Feature definition excluding the CVSS base score" title="" id="93" name="Picture"/>
+            <wp:docPr descr="Feature definition excluding the CVSS base score" title="" id="111" name="Picture"/>
             <a:graphic>
               <a:graphicData uri="http://schemas.openxmlformats.org/drawingml/2006/picture">
                 <pic:pic>
                   <pic:nvPicPr>
-                    <pic:cNvPr descr="images/code-ml-features.png" id="94" name="Picture"/>
+                    <pic:cNvPr descr="images/code-ml-features.png" id="112" name="Picture"/>
                     <pic:cNvPicPr>
                       <a:picLocks noChangeArrowheads="1" noChangeAspect="1"/>
                     </pic:cNvPicPr>
                   </pic:nvPicPr>
                   <pic:blipFill>
-                    <a:blip r:embed="rId92"/>
+                    <a:blip r:embed="rId110"/>
                     <a:stretch>
                       <a:fillRect/>
                     </a:stretch>
@@ -5497,7 +5892,7 @@
           <w:b/>
           <w:bCs/>
         </w:rPr>
-        <w:t xml:space="preserve">Figure 4.19: Feature Definition (predictor.py) — the CVSS base score is deliberately excluded to prevent target leakage</w:t>
+        <w:t xml:space="preserve">Figure 4.25: Feature Definition (predictor.py) — the CVSS base score is deliberately excluded to prevent target leakage</w:t>
       </w:r>
     </w:p>
     <w:p>
@@ -5515,7 +5910,7 @@
         <w:t xml:space="preserve"> </w:t>
       </w:r>
       <w:r>
-        <w:t xml:space="preserve">Figure 4.20 shows how a stored finding is converted into a feature vector and classified. The</w:t>
+        <w:t xml:space="preserve">Figure 4.26 shows how a stored finding is converted into a feature vector and classified. The</w:t>
       </w:r>
       <w:r>
         <w:t xml:space="preserve"> </w:t>
@@ -5575,7 +5970,7 @@
         <w:t xml:space="preserve"> </w:t>
       </w:r>
       <w:r>
-        <w:t xml:space="preserve">methods to obtain both the predicted severity band and the per-class probabilities, which are persisted so that the interface can display the model's confidence in each band (the "ML Priority Prediction" panel of Figure 4.35).</w:t>
+        <w:t xml:space="preserve">methods to obtain both the predicted severity band and the per-class probabilities, which are persisted so that the interface can display the model's confidence in each band (the "ML Priority Prediction" panel of Figure 4.41).</w:t>
       </w:r>
     </w:p>
     <w:p>
@@ -5587,18 +5982,18 @@
           <wp:inline>
             <wp:extent cx="5334000" cy="4375870"/>
             <wp:effectExtent b="0" l="0" r="0" t="0"/>
-            <wp:docPr descr="Feature extraction and prediction" title="" id="96" name="Picture"/>
+            <wp:docPr descr="Feature extraction and prediction" title="" id="114" name="Picture"/>
             <a:graphic>
               <a:graphicData uri="http://schemas.openxmlformats.org/drawingml/2006/picture">
                 <pic:pic>
                   <pic:nvPicPr>
-                    <pic:cNvPr descr="images/code-ml-inference.png" id="97" name="Picture"/>
+                    <pic:cNvPr descr="images/code-ml-inference.png" id="115" name="Picture"/>
                     <pic:cNvPicPr>
                       <a:picLocks noChangeArrowheads="1" noChangeAspect="1"/>
                     </pic:cNvPicPr>
                   </pic:nvPicPr>
                   <pic:blipFill>
-                    <a:blip r:embed="rId95"/>
+                    <a:blip r:embed="rId113"/>
                     <a:stretch>
                       <a:fillRect/>
                     </a:stretch>
@@ -5634,7 +6029,7 @@
           <w:b/>
           <w:bCs/>
         </w:rPr>
-        <w:t xml:space="preserve">Figure 4.20: Feature Extraction and Prediction (predictor.py)</w:t>
+        <w:t xml:space="preserve">Figure 4.26: Feature Extraction and Prediction (predictor.py)</w:t>
       </w:r>
     </w:p>
     <w:p>
@@ -5652,7 +6047,7 @@
         <w:t xml:space="preserve"> </w:t>
       </w:r>
       <w:r>
-        <w:t xml:space="preserve">Figure 4.21 shows the core of the training routine. The real records are split into training and test sets</w:t>
+        <w:t xml:space="preserve">Figure 4.27 shows the core of the training routine. The real records are split into training and test sets</w:t>
       </w:r>
       <w:r>
         <w:t xml:space="preserve"> </w:t>
@@ -5680,18 +6075,18 @@
           <wp:inline>
             <wp:extent cx="5334000" cy="4266391"/>
             <wp:effectExtent b="0" l="0" r="0" t="0"/>
-            <wp:docPr descr="Random Forest training with a leakage-safe split" title="" id="99" name="Picture"/>
+            <wp:docPr descr="Random Forest training with a leakage-safe split" title="" id="117" name="Picture"/>
             <a:graphic>
               <a:graphicData uri="http://schemas.openxmlformats.org/drawingml/2006/picture">
                 <pic:pic>
                   <pic:nvPicPr>
-                    <pic:cNvPr descr="images/code-ml-trainer.png" id="100" name="Picture"/>
+                    <pic:cNvPr descr="images/code-ml-trainer.png" id="118" name="Picture"/>
                     <pic:cNvPicPr>
                       <a:picLocks noChangeArrowheads="1" noChangeAspect="1"/>
                     </pic:cNvPicPr>
                   </pic:nvPicPr>
                   <pic:blipFill>
-                    <a:blip r:embed="rId98"/>
+                    <a:blip r:embed="rId116"/>
                     <a:stretch>
                       <a:fillRect/>
                     </a:stretch>
@@ -5727,7 +6122,7 @@
           <w:b/>
           <w:bCs/>
         </w:rPr>
-        <w:t xml:space="preserve">Figure 4.21: Model Training — Leakage-Safe Split and Fit (model_trainer.py)</w:t>
+        <w:t xml:space="preserve">Figure 4.27: Model Training — Leakage-Safe Split and Fit (model_trainer.py)</w:t>
       </w:r>
     </w:p>
     <w:p>
@@ -5738,8 +6133,8 @@
         <w:t xml:space="preserve">An honest limitation is stated for completeness: the CVSS base score is a deterministic function of its sub-metrics, so this task is close to deterministic and the model is effectively relearning the CVSS scoring formula. The high accuracy is therefore legitimate (there is no leakage) but reflects the near-deterministic nature of the task. The genuinely novel analytical contribution is the Confidence Engine described next, which predicts something CVSS cannot express — the probability that a finding is a true positive.</w:t>
       </w:r>
     </w:p>
-    <w:bookmarkEnd w:id="101"/>
-    <w:bookmarkStart w:id="111" w:name="Xb876a7173b23e144718db5730c7d0b5f52e5ef0"/>
+    <w:bookmarkEnd w:id="119"/>
+    <w:bookmarkStart w:id="129" w:name="Xb876a7173b23e144718db5730c7d0b5f52e5ef0"/>
     <w:p>
       <w:pPr>
         <w:pStyle w:val="Heading4"/>
@@ -6142,7 +6537,7 @@
         <w:t xml:space="preserve"> </w:t>
       </w:r>
       <w:r>
-        <w:t xml:space="preserve">Figure 4.22 shows the core of the scoring method. Each factor returns a raw score in the range 0–100; the total is the weighted sum of those raw scores, capped to the 0–100 range. Two overrides then apply. First, if any</w:t>
+        <w:t xml:space="preserve">Figure 4.28 shows the core of the scoring method. Each factor returns a raw score in the range 0–100; the total is the weighted sum of those raw scores, capped to the 0–100 range. Two overrides then apply. First, if any</w:t>
       </w:r>
       <w:r>
         <w:t xml:space="preserve"> </w:t>
@@ -6202,18 +6597,18 @@
           <wp:inline>
             <wp:extent cx="5334000" cy="3604666"/>
             <wp:effectExtent b="0" l="0" r="0" t="0"/>
-            <wp:docPr descr="Weighted scoring, PoC override, and classification" title="" id="103" name="Picture"/>
+            <wp:docPr descr="Weighted scoring, PoC override, and classification" title="" id="121" name="Picture"/>
             <a:graphic>
               <a:graphicData uri="http://schemas.openxmlformats.org/drawingml/2006/picture">
                 <pic:pic>
                   <pic:nvPicPr>
-                    <pic:cNvPr descr="images/code-confidence-score.png" id="104" name="Picture"/>
+                    <pic:cNvPr descr="images/code-confidence-score.png" id="122" name="Picture"/>
                     <pic:cNvPicPr>
                       <a:picLocks noChangeArrowheads="1" noChangeAspect="1"/>
                     </pic:cNvPicPr>
                   </pic:nvPicPr>
                   <pic:blipFill>
-                    <a:blip r:embed="rId102"/>
+                    <a:blip r:embed="rId120"/>
                     <a:stretch>
                       <a:fillRect/>
                     </a:stretch>
@@ -6249,7 +6644,7 @@
           <w:b/>
           <w:bCs/>
         </w:rPr>
-        <w:t xml:space="preserve">Figure 4.22: Confidence Scoring — Weights, Weighted Sum, and Overrides (confidence_engine.py)</w:t>
+        <w:t xml:space="preserve">Figure 4.28: Confidence Scoring — Weights, Weighted Sum, and Overrides (confidence_engine.py)</w:t>
       </w:r>
     </w:p>
     <w:p>
@@ -6267,7 +6662,7 @@
         <w:t xml:space="preserve"> </w:t>
       </w:r>
       <w:r>
-        <w:t xml:space="preserve">Figure 4.23 shows two representative factor methods and the classification-threshold function. The scanner-agreement factor scales with the number of corroborating scanners and returns a human-readable</w:t>
+        <w:t xml:space="preserve">Figure 4.29 shows two representative factor methods and the classification-threshold function. The scanner-agreement factor scales with the number of corroborating scanners and returns a human-readable</w:t>
       </w:r>
       <w:r>
         <w:t xml:space="preserve"> </w:t>
@@ -6310,18 +6705,18 @@
           <wp:inline>
             <wp:extent cx="5334000" cy="3200400"/>
             <wp:effectExtent b="0" l="0" r="0" t="0"/>
-            <wp:docPr descr="Example factor computations and the classification thresholds" title="" id="106" name="Picture"/>
+            <wp:docPr descr="Example factor computations and the classification thresholds" title="" id="124" name="Picture"/>
             <a:graphic>
               <a:graphicData uri="http://schemas.openxmlformats.org/drawingml/2006/picture">
                 <pic:pic>
                   <pic:nvPicPr>
-                    <pic:cNvPr descr="images/code-confidence-factor.png" id="107" name="Picture"/>
+                    <pic:cNvPr descr="images/code-confidence-factor.png" id="125" name="Picture"/>
                     <pic:cNvPicPr>
                       <a:picLocks noChangeArrowheads="1" noChangeAspect="1"/>
                     </pic:cNvPicPr>
                   </pic:nvPicPr>
                   <pic:blipFill>
-                    <a:blip r:embed="rId105"/>
+                    <a:blip r:embed="rId123"/>
                     <a:stretch>
                       <a:fillRect/>
                     </a:stretch>
@@ -6357,7 +6752,7 @@
           <w:b/>
           <w:bCs/>
         </w:rPr>
-        <w:t xml:space="preserve">Figure 4.23: Example Factor Computations and Classification Thresholds (confidence_engine.py)</w:t>
+        <w:t xml:space="preserve">Figure 4.29: Example Factor Computations and Classification Thresholds (confidence_engine.py)</w:t>
       </w:r>
     </w:p>
     <w:p>
@@ -6375,7 +6770,7 @@
         <w:t xml:space="preserve"> </w:t>
       </w:r>
       <w:r>
-        <w:t xml:space="preserve">Figure 4.24 shows the confidence panel from the interface for a confirmed SQL-injection finding, which makes the computation concrete. The finding scores</w:t>
+        <w:t xml:space="preserve">Figure 4.30 shows the confidence panel from the interface for a confirmed SQL-injection finding, which makes the computation concrete. The finding scores</w:t>
       </w:r>
       <w:r>
         <w:t xml:space="preserve"> </w:t>
@@ -6432,18 +6827,18 @@
           <wp:inline>
             <wp:extent cx="5334000" cy="3036093"/>
             <wp:effectExtent b="0" l="0" r="0" t="0"/>
-            <wp:docPr descr="Confidence-score breakdown panel" title="" id="109" name="Picture"/>
+            <wp:docPr descr="Confidence-score breakdown panel" title="" id="127" name="Picture"/>
             <a:graphic>
               <a:graphicData uri="http://schemas.openxmlformats.org/drawingml/2006/picture">
                 <pic:pic>
                   <pic:nvPicPr>
-                    <pic:cNvPr descr="images/11-confidence-panel.png" id="110" name="Picture"/>
+                    <pic:cNvPr descr="images/11-confidence-panel.png" id="128" name="Picture"/>
                     <pic:cNvPicPr>
                       <a:picLocks noChangeArrowheads="1" noChangeAspect="1"/>
                     </pic:cNvPicPr>
                   </pic:nvPicPr>
                   <pic:blipFill>
-                    <a:blip r:embed="rId108"/>
+                    <a:blip r:embed="rId126"/>
                     <a:stretch>
                       <a:fillRect/>
                     </a:stretch>
@@ -6479,11 +6874,11 @@
           <w:b/>
           <w:bCs/>
         </w:rPr>
-        <w:t xml:space="preserve">Figure 4.24: Confidence-Score Breakdown (Finding Detail)</w:t>
-      </w:r>
-    </w:p>
-    <w:bookmarkEnd w:id="111"/>
-    <w:bookmarkStart w:id="115" w:name="X494fa9d2e84e76cabd26c06ff6352e957e43761"/>
+        <w:t xml:space="preserve">Figure 4.30: Confidence-Score Breakdown (Finding Detail)</w:t>
+      </w:r>
+    </w:p>
+    <w:bookmarkEnd w:id="129"/>
+    <w:bookmarkStart w:id="133" w:name="X494fa9d2e84e76cabd26c06ff6352e957e43761"/>
     <w:p>
       <w:pPr>
         <w:pStyle w:val="Heading4"/>
@@ -6513,7 +6908,7 @@
         <w:t xml:space="preserve"> </w:t>
       </w:r>
       <w:r>
-        <w:t xml:space="preserve">confirmation by sending non-destructive requests to in-scope targets. Figure 4.25 shows the authorisation guard and an example check.</w:t>
+        <w:t xml:space="preserve">confirmation by sending non-destructive requests to in-scope targets. Figure 4.31 shows the authorisation guard and an example check.</w:t>
       </w:r>
     </w:p>
     <w:p>
@@ -6525,18 +6920,18 @@
           <wp:inline>
             <wp:extent cx="5334000" cy="3749643"/>
             <wp:effectExtent b="0" l="0" r="0" t="0"/>
-            <wp:docPr descr="Scope guard and SQL-injection check" title="" id="113" name="Picture"/>
+            <wp:docPr descr="Scope guard and SQL-injection check" title="" id="131" name="Picture"/>
             <a:graphic>
               <a:graphicData uri="http://schemas.openxmlformats.org/drawingml/2006/picture">
                 <pic:pic>
                   <pic:nvPicPr>
-                    <pic:cNvPr descr="images/code-poc.png" id="114" name="Picture"/>
+                    <pic:cNvPr descr="images/code-poc.png" id="132" name="Picture"/>
                     <pic:cNvPicPr>
                       <a:picLocks noChangeArrowheads="1" noChangeAspect="1"/>
                     </pic:cNvPicPr>
                   </pic:nvPicPr>
                   <pic:blipFill>
-                    <a:blip r:embed="rId112"/>
+                    <a:blip r:embed="rId130"/>
                     <a:stretch>
                       <a:fillRect/>
                     </a:stretch>
@@ -6572,7 +6967,7 @@
           <w:b/>
           <w:bCs/>
         </w:rPr>
-        <w:t xml:space="preserve">Figure 4.25: PoC Validation — Scope Guard and SQLi Check (poc_validator.py)</w:t>
+        <w:t xml:space="preserve">Figure 4.31: PoC Validation — Scope Guard and SQLi Check (poc_validator.py)</w:t>
       </w:r>
     </w:p>
     <w:p>
@@ -6635,8 +7030,8 @@
         <w:t xml:space="preserve">. All checks are read-only or time-based only — they never modify data.</w:t>
       </w:r>
     </w:p>
-    <w:bookmarkEnd w:id="115"/>
-    <w:bookmarkStart w:id="119" w:name="Xfe117651097e576d749c642613b36911366ebea"/>
+    <w:bookmarkEnd w:id="133"/>
+    <w:bookmarkStart w:id="137" w:name="Xfe117651097e576d749c642613b36911366ebea"/>
     <w:p>
       <w:pPr>
         <w:pStyle w:val="Heading4"/>
@@ -6650,7 +7045,7 @@
         <w:pStyle w:val="FirstParagraph"/>
       </w:pPr>
       <w:r>
-        <w:t xml:space="preserve">The final stage renders a professional PDF triage report and can optionally enrich it with a large-language-model analysis. Figure 4.26 shows the generation method.</w:t>
+        <w:t xml:space="preserve">The final stage renders a professional PDF triage report and can optionally enrich it with a large-language-model analysis. Figure 4.32 shows the generation method.</w:t>
       </w:r>
     </w:p>
     <w:p>
@@ -6662,18 +7057,18 @@
           <wp:inline>
             <wp:extent cx="5334000" cy="3840355"/>
             <wp:effectExtent b="0" l="0" r="0" t="0"/>
-            <wp:docPr descr="Report generation" title="" id="117" name="Picture"/>
+            <wp:docPr descr="Report generation" title="" id="135" name="Picture"/>
             <a:graphic>
               <a:graphicData uri="http://schemas.openxmlformats.org/drawingml/2006/picture">
                 <pic:pic>
                   <pic:nvPicPr>
-                    <pic:cNvPr descr="images/code-report.png" id="118" name="Picture"/>
+                    <pic:cNvPr descr="images/code-report.png" id="136" name="Picture"/>
                     <pic:cNvPicPr>
                       <a:picLocks noChangeArrowheads="1" noChangeAspect="1"/>
                     </pic:cNvPicPr>
                   </pic:nvPicPr>
                   <pic:blipFill>
-                    <a:blip r:embed="rId116"/>
+                    <a:blip r:embed="rId134"/>
                     <a:stretch>
                       <a:fillRect/>
                     </a:stretch>
@@ -6709,7 +7104,7 @@
           <w:b/>
           <w:bCs/>
         </w:rPr>
-        <w:t xml:space="preserve">Figure 4.26: Report Generation (report_generator.py)</w:t>
+        <w:t xml:space="preserve">Figure 4.32: Report Generation (report_generator.py)</w:t>
       </w:r>
     </w:p>
     <w:p>
@@ -6893,9 +7288,9 @@
         <w:t xml:space="preserve">: with no key it is a silent no-op and the offline report is produced exactly as before, and any API error degrades gracefully to a report without the section. Scanner-supplied text is passed to the model strictly as data, never as instructions, so the feature does not widen the system's trust boundary.</w:t>
       </w:r>
     </w:p>
-    <w:bookmarkEnd w:id="119"/>
-    <w:bookmarkEnd w:id="120"/>
-    <w:bookmarkStart w:id="124" w:name="X37b70d44e5d2782d7cd4cb819e29306febc6675"/>
+    <w:bookmarkEnd w:id="137"/>
+    <w:bookmarkEnd w:id="138"/>
+    <w:bookmarkStart w:id="142" w:name="X37b70d44e5d2782d7cd4cb819e29306febc6675"/>
     <w:p>
       <w:pPr>
         <w:pStyle w:val="Heading3"/>
@@ -6909,7 +7304,7 @@
         <w:pStyle w:val="FirstParagraph"/>
       </w:pPr>
       <w:r>
-        <w:t xml:space="preserve">The optional Auto Scan layer drives the scanners itself before triaging their output. Figure 4.27 shows the orchestration loop.</w:t>
+        <w:t xml:space="preserve">The optional Auto Scan layer drives the scanners itself before triaging their output. Figure 4.33 shows the orchestration loop.</w:t>
       </w:r>
     </w:p>
     <w:p>
@@ -6921,18 +7316,18 @@
           <wp:inline>
             <wp:extent cx="5334000" cy="2451831"/>
             <wp:effectExtent b="0" l="0" r="0" t="0"/>
-            <wp:docPr descr="Auto-scan orchestration loop" title="" id="122" name="Picture"/>
+            <wp:docPr descr="Auto-scan orchestration loop" title="" id="140" name="Picture"/>
             <a:graphic>
               <a:graphicData uri="http://schemas.openxmlformats.org/drawingml/2006/picture">
                 <pic:pic>
                   <pic:nvPicPr>
-                    <pic:cNvPr descr="images/code-autoscan.png" id="123" name="Picture"/>
+                    <pic:cNvPr descr="images/code-autoscan.png" id="141" name="Picture"/>
                     <pic:cNvPicPr>
                       <a:picLocks noChangeArrowheads="1" noChangeAspect="1"/>
                     </pic:cNvPicPr>
                   </pic:nvPicPr>
                   <pic:blipFill>
-                    <a:blip r:embed="rId121"/>
+                    <a:blip r:embed="rId139"/>
                     <a:stretch>
                       <a:fillRect/>
                     </a:stretch>
@@ -6968,7 +7363,7 @@
           <w:b/>
           <w:bCs/>
         </w:rPr>
-        <w:t xml:space="preserve">Figure 4.27: Auto-Scan Orchestration (auto_scan.py)</w:t>
+        <w:t xml:space="preserve">Figure 4.33: Auto-Scan Orchestration (auto_scan.py)</w:t>
       </w:r>
     </w:p>
     <w:p>
@@ -7040,8 +7435,8 @@
         <w:t xml:space="preserve">acknowledgement.</w:t>
       </w:r>
     </w:p>
-    <w:bookmarkEnd w:id="124"/>
-    <w:bookmarkStart w:id="128" w:name="X09db528d8686426bb1f0b08be7dcca13a28f5e2"/>
+    <w:bookmarkEnd w:id="142"/>
+    <w:bookmarkStart w:id="146" w:name="X09db528d8686426bb1f0b08be7dcca13a28f5e2"/>
     <w:p>
       <w:pPr>
         <w:pStyle w:val="Heading3"/>
@@ -7055,7 +7450,7 @@
         <w:pStyle w:val="FirstParagraph"/>
       </w:pPr>
       <w:r>
-        <w:t xml:space="preserve">Finally, Figure 4.28 shows the two pieces that secure the system and wire the engines together: the login endpoint and the pipeline route.</w:t>
+        <w:t xml:space="preserve">Finally, Figure 4.34 shows the two pieces that secure the system and wire the engines together: the login endpoint and the pipeline route.</w:t>
       </w:r>
     </w:p>
     <w:p>
@@ -7067,18 +7462,18 @@
           <wp:inline>
             <wp:extent cx="5334000" cy="5996392"/>
             <wp:effectExtent b="0" l="0" r="0" t="0"/>
-            <wp:docPr descr="JWT login and the pipeline route" title="" id="126" name="Picture"/>
+            <wp:docPr descr="JWT login and the pipeline route" title="" id="144" name="Picture"/>
             <a:graphic>
               <a:graphicData uri="http://schemas.openxmlformats.org/drawingml/2006/picture">
                 <pic:pic>
                   <pic:nvPicPr>
-                    <pic:cNvPr descr="images/code-auth-route.png" id="127" name="Picture"/>
+                    <pic:cNvPr descr="images/code-auth-route.png" id="145" name="Picture"/>
                     <pic:cNvPicPr>
                       <a:picLocks noChangeArrowheads="1" noChangeAspect="1"/>
                     </pic:cNvPicPr>
                   </pic:nvPicPr>
                   <pic:blipFill>
-                    <a:blip r:embed="rId125"/>
+                    <a:blip r:embed="rId143"/>
                     <a:stretch>
                       <a:fillRect/>
                     </a:stretch>
@@ -7114,7 +7509,7 @@
           <w:b/>
           <w:bCs/>
         </w:rPr>
-        <w:t xml:space="preserve">Figure 4.28: JWT Authentication and Pipeline Wiring (auth.py, pipeline.py)</w:t>
+        <w:t xml:space="preserve">Figure 4.34: JWT Authentication and Pipeline Wiring (auth.py, pipeline.py)</w:t>
       </w:r>
     </w:p>
     <w:p>
@@ -7183,9 +7578,9 @@
         </w:pict>
       </w:r>
     </w:p>
-    <w:bookmarkEnd w:id="128"/>
-    <w:bookmarkEnd w:id="129"/>
-    <w:bookmarkStart w:id="169" w:name="X54341d584745e7411aa4f4707f5121fcc739cb5"/>
+    <w:bookmarkEnd w:id="146"/>
+    <w:bookmarkEnd w:id="147"/>
+    <w:bookmarkStart w:id="187" w:name="X54341d584745e7411aa4f4707f5121fcc739cb5"/>
     <w:p>
       <w:pPr>
         <w:pStyle w:val="Heading2"/>
@@ -7215,7 +7610,7 @@
         <w:t xml:space="preserve">.</w:t>
       </w:r>
     </w:p>
-    <w:bookmarkStart w:id="133" w:name="X831bf8cb68fb81f8f88eb045a3d2ee1390654c7"/>
+    <w:bookmarkStart w:id="151" w:name="X831bf8cb68fb81f8f88eb045a3d2ee1390654c7"/>
     <w:p>
       <w:pPr>
         <w:pStyle w:val="Heading3"/>
@@ -7233,18 +7628,18 @@
           <wp:inline>
             <wp:extent cx="5334000" cy="3189287"/>
             <wp:effectExtent b="0" l="0" r="0" t="0"/>
-            <wp:docPr descr="Login screen" title="" id="131" name="Picture"/>
+            <wp:docPr descr="Login screen" title="" id="149" name="Picture"/>
             <a:graphic>
               <a:graphicData uri="http://schemas.openxmlformats.org/drawingml/2006/picture">
                 <pic:pic>
                   <pic:nvPicPr>
-                    <pic:cNvPr descr="images/01-login.png" id="132" name="Picture"/>
+                    <pic:cNvPr descr="images/01-login.png" id="150" name="Picture"/>
                     <pic:cNvPicPr>
                       <a:picLocks noChangeArrowheads="1" noChangeAspect="1"/>
                     </pic:cNvPicPr>
                   </pic:nvPicPr>
                   <pic:blipFill>
-                    <a:blip r:embed="rId130"/>
+                    <a:blip r:embed="rId148"/>
                     <a:stretch>
                       <a:fillRect/>
                     </a:stretch>
@@ -7280,7 +7675,7 @@
           <w:b/>
           <w:bCs/>
         </w:rPr>
-        <w:t xml:space="preserve">Figure 4.29: Login Screen.</w:t>
+        <w:t xml:space="preserve">Figure 4.35: Login Screen.</w:t>
       </w:r>
       <w:r>
         <w:t xml:space="preserve"> </w:t>
@@ -7299,8 +7694,8 @@
         <w:t xml:space="preserve">The entry point demonstrates the JWT-secured authentication gate. All data routes are protected, and unauthenticated access redirects here. The focused, minimal form reflects the design priority of getting an analyst into the workspace quickly.</w:t>
       </w:r>
     </w:p>
-    <w:bookmarkEnd w:id="133"/>
-    <w:bookmarkStart w:id="137" w:name="X554ca8f5079771fa3b5a9c73f668d2a59be3842"/>
+    <w:bookmarkEnd w:id="151"/>
+    <w:bookmarkStart w:id="155" w:name="X554ca8f5079771fa3b5a9c73f668d2a59be3842"/>
     <w:p>
       <w:pPr>
         <w:pStyle w:val="Heading3"/>
@@ -7318,18 +7713,18 @@
           <wp:inline>
             <wp:extent cx="5334000" cy="3189287"/>
             <wp:effectExtent b="0" l="0" r="0" t="0"/>
-            <wp:docPr descr="Registration screen" title="" id="135" name="Picture"/>
+            <wp:docPr descr="Registration screen" title="" id="153" name="Picture"/>
             <a:graphic>
               <a:graphicData uri="http://schemas.openxmlformats.org/drawingml/2006/picture">
                 <pic:pic>
                   <pic:nvPicPr>
-                    <pic:cNvPr descr="images/02-register.png" id="136" name="Picture"/>
+                    <pic:cNvPr descr="images/02-register.png" id="154" name="Picture"/>
                     <pic:cNvPicPr>
                       <a:picLocks noChangeArrowheads="1" noChangeAspect="1"/>
                     </pic:cNvPicPr>
                   </pic:nvPicPr>
                   <pic:blipFill>
-                    <a:blip r:embed="rId134"/>
+                    <a:blip r:embed="rId152"/>
                     <a:stretch>
                       <a:fillRect/>
                     </a:stretch>
@@ -7365,7 +7760,7 @@
           <w:b/>
           <w:bCs/>
         </w:rPr>
-        <w:t xml:space="preserve">Figure 4.30: Registration Screen.</w:t>
+        <w:t xml:space="preserve">Figure 4.36: Registration Screen.</w:t>
       </w:r>
       <w:r>
         <w:t xml:space="preserve"> </w:t>
@@ -7384,8 +7779,8 @@
         <w:t xml:space="preserve">New analysts self-register; the API hashes the password and issues a token on success. It documents the complete account-creation path (UC1).</w:t>
       </w:r>
     </w:p>
-    <w:bookmarkEnd w:id="137"/>
-    <w:bookmarkStart w:id="141" w:name="Xc736af9b4f661537cca52631185f21e222e4ab8"/>
+    <w:bookmarkEnd w:id="155"/>
+    <w:bookmarkStart w:id="159" w:name="Xc736af9b4f661537cca52631185f21e222e4ab8"/>
     <w:p>
       <w:pPr>
         <w:pStyle w:val="Heading3"/>
@@ -7403,18 +7798,18 @@
           <wp:inline>
             <wp:extent cx="5334000" cy="4663545"/>
             <wp:effectExtent b="0" l="0" r="0" t="0"/>
-            <wp:docPr descr="Dashboard" title="" id="139" name="Picture"/>
+            <wp:docPr descr="Dashboard" title="" id="157" name="Picture"/>
             <a:graphic>
               <a:graphicData uri="http://schemas.openxmlformats.org/drawingml/2006/picture">
                 <pic:pic>
                   <pic:nvPicPr>
-                    <pic:cNvPr descr="images/03-dashboard.png" id="140" name="Picture"/>
+                    <pic:cNvPr descr="images/03-dashboard.png" id="158" name="Picture"/>
                     <pic:cNvPicPr>
                       <a:picLocks noChangeArrowheads="1" noChangeAspect="1"/>
                     </pic:cNvPicPr>
                   </pic:nvPicPr>
                   <pic:blipFill>
-                    <a:blip r:embed="rId138"/>
+                    <a:blip r:embed="rId156"/>
                     <a:stretch>
                       <a:fillRect/>
                     </a:stretch>
@@ -7450,7 +7845,7 @@
           <w:b/>
           <w:bCs/>
         </w:rPr>
-        <w:t xml:space="preserve">Figure 4.31: Dashboard.</w:t>
+        <w:t xml:space="preserve">Figure 4.37: Dashboard.</w:t>
       </w:r>
       <w:r>
         <w:t xml:space="preserve"> </w:t>
@@ -7485,8 +7880,8 @@
         <w:t xml:space="preserve">and none need review — the remainder auto-dismissed); the three charts characterise the dataset; and the Top-10 table surfaces the highest-CVSS findings with their classification and CWE. Together they show the triage system converting raw scanner noise into a prioritised, actionable shortlist.</w:t>
       </w:r>
     </w:p>
-    <w:bookmarkEnd w:id="141"/>
-    <w:bookmarkStart w:id="145" w:name="Xc2857fb31bdd292898b6b05a29eb176d9346aa0"/>
+    <w:bookmarkEnd w:id="159"/>
+    <w:bookmarkStart w:id="163" w:name="Xc2857fb31bdd292898b6b05a29eb176d9346aa0"/>
     <w:p>
       <w:pPr>
         <w:pStyle w:val="Heading3"/>
@@ -7504,18 +7899,18 @@
           <wp:inline>
             <wp:extent cx="5334000" cy="3189287"/>
             <wp:effectExtent b="0" l="0" r="0" t="0"/>
-            <wp:docPr descr="Upload screen" title="" id="143" name="Picture"/>
+            <wp:docPr descr="Upload screen" title="" id="161" name="Picture"/>
             <a:graphic>
               <a:graphicData uri="http://schemas.openxmlformats.org/drawingml/2006/picture">
                 <pic:pic>
                   <pic:nvPicPr>
-                    <pic:cNvPr descr="images/04-upload.png" id="144" name="Picture"/>
+                    <pic:cNvPr descr="images/04-upload.png" id="162" name="Picture"/>
                     <pic:cNvPicPr>
                       <a:picLocks noChangeArrowheads="1" noChangeAspect="1"/>
                     </pic:cNvPicPr>
                   </pic:nvPicPr>
                   <pic:blipFill>
-                    <a:blip r:embed="rId142"/>
+                    <a:blip r:embed="rId160"/>
                     <a:stretch>
                       <a:fillRect/>
                     </a:stretch>
@@ -7551,7 +7946,7 @@
           <w:b/>
           <w:bCs/>
         </w:rPr>
-        <w:t xml:space="preserve">Figure 4.32: Upload Screen.</w:t>
+        <w:t xml:space="preserve">Figure 4.38: Upload Screen.</w:t>
       </w:r>
       <w:r>
         <w:t xml:space="preserve"> </w:t>
@@ -7586,8 +7981,8 @@
         <w:t xml:space="preserve">action.</w:t>
       </w:r>
     </w:p>
-    <w:bookmarkEnd w:id="145"/>
-    <w:bookmarkStart w:id="149" w:name="X51366124bbb38c79718f3316eb565126ea316b8"/>
+    <w:bookmarkEnd w:id="163"/>
+    <w:bookmarkStart w:id="167" w:name="X51366124bbb38c79718f3316eb565126ea316b8"/>
     <w:p>
       <w:pPr>
         <w:pStyle w:val="Heading3"/>
@@ -7605,18 +8000,18 @@
           <wp:inline>
             <wp:extent cx="5334000" cy="3189287"/>
             <wp:effectExtent b="0" l="0" r="0" t="0"/>
-            <wp:docPr descr="Auto Scan screen" title="" id="147" name="Picture"/>
+            <wp:docPr descr="Auto Scan screen" title="" id="165" name="Picture"/>
             <a:graphic>
               <a:graphicData uri="http://schemas.openxmlformats.org/drawingml/2006/picture">
                 <pic:pic>
                   <pic:nvPicPr>
-                    <pic:cNvPr descr="images/05-autoscan.png" id="148" name="Picture"/>
+                    <pic:cNvPr descr="images/05-autoscan.png" id="166" name="Picture"/>
                     <pic:cNvPicPr>
                       <a:picLocks noChangeArrowheads="1" noChangeAspect="1"/>
                     </pic:cNvPicPr>
                   </pic:nvPicPr>
                   <pic:blipFill>
-                    <a:blip r:embed="rId146"/>
+                    <a:blip r:embed="rId164"/>
                     <a:stretch>
                       <a:fillRect/>
                     </a:stretch>
@@ -7652,7 +8047,7 @@
           <w:b/>
           <w:bCs/>
         </w:rPr>
-        <w:t xml:space="preserve">Figure 4.33: Auto Scan Screen.</w:t>
+        <w:t xml:space="preserve">Figure 4.39: Auto Scan Screen.</w:t>
       </w:r>
       <w:r>
         <w:t xml:space="preserve"> </w:t>
@@ -7671,8 +8066,8 @@
         <w:t xml:space="preserve">This shows the optional orchestration layer (UC3): a target field, scanner selection, and the explicit authorisation acknowledgement that gates all active scanning. The screen embodies the responsible-use design constraint that intrusive scanning must be deliberately opted into.</w:t>
       </w:r>
     </w:p>
-    <w:bookmarkEnd w:id="149"/>
-    <w:bookmarkStart w:id="153" w:name="X82b1df9bde87e06f2113dd04155c164935be6fa"/>
+    <w:bookmarkEnd w:id="167"/>
+    <w:bookmarkStart w:id="171" w:name="X82b1df9bde87e06f2113dd04155c164935be6fa"/>
     <w:p>
       <w:pPr>
         <w:pStyle w:val="Heading3"/>
@@ -7690,18 +8085,18 @@
           <wp:inline>
             <wp:extent cx="5334000" cy="4911725"/>
             <wp:effectExtent b="0" l="0" r="0" t="0"/>
-            <wp:docPr descr="Findings list" title="" id="151" name="Picture"/>
+            <wp:docPr descr="Findings list" title="" id="169" name="Picture"/>
             <a:graphic>
               <a:graphicData uri="http://schemas.openxmlformats.org/drawingml/2006/picture">
                 <pic:pic>
                   <pic:nvPicPr>
-                    <pic:cNvPr descr="images/06-findings.png" id="152" name="Picture"/>
+                    <pic:cNvPr descr="images/06-findings.png" id="170" name="Picture"/>
                     <pic:cNvPicPr>
                       <a:picLocks noChangeArrowheads="1" noChangeAspect="1"/>
                     </pic:cNvPicPr>
                   </pic:nvPicPr>
                   <pic:blipFill>
-                    <a:blip r:embed="rId150"/>
+                    <a:blip r:embed="rId168"/>
                     <a:stretch>
                       <a:fillRect/>
                     </a:stretch>
@@ -7737,7 +8132,7 @@
           <w:b/>
           <w:bCs/>
         </w:rPr>
-        <w:t xml:space="preserve">Figure 4.34: Findings List.</w:t>
+        <w:t xml:space="preserve">Figure 4.40: Findings List.</w:t>
       </w:r>
       <w:r>
         <w:t xml:space="preserve"> </w:t>
@@ -7772,8 +8167,8 @@
         <w:t xml:space="preserve">items, demonstrating the practical false-positive reduction the project set out to achieve.</w:t>
       </w:r>
     </w:p>
-    <w:bookmarkEnd w:id="153"/>
-    <w:bookmarkStart w:id="157" w:name="X94c2a5a95d007c0a47c95b07faa6257478ed869"/>
+    <w:bookmarkEnd w:id="171"/>
+    <w:bookmarkStart w:id="175" w:name="X94c2a5a95d007c0a47c95b07faa6257478ed869"/>
     <w:p>
       <w:pPr>
         <w:pStyle w:val="Heading3"/>
@@ -7791,18 +8186,18 @@
           <wp:inline>
             <wp:extent cx="5334000" cy="8026929"/>
             <wp:effectExtent b="0" l="0" r="0" t="0"/>
-            <wp:docPr descr="Finding detail" title="" id="155" name="Picture"/>
+            <wp:docPr descr="Finding detail" title="" id="173" name="Picture"/>
             <a:graphic>
               <a:graphicData uri="http://schemas.openxmlformats.org/drawingml/2006/picture">
                 <pic:pic>
                   <pic:nvPicPr>
-                    <pic:cNvPr descr="images/07-finding-detail.png" id="156" name="Picture"/>
+                    <pic:cNvPr descr="images/07-finding-detail.png" id="174" name="Picture"/>
                     <pic:cNvPicPr>
                       <a:picLocks noChangeArrowheads="1" noChangeAspect="1"/>
                     </pic:cNvPicPr>
                   </pic:nvPicPr>
                   <pic:blipFill>
-                    <a:blip r:embed="rId154"/>
+                    <a:blip r:embed="rId172"/>
                     <a:stretch>
                       <a:fillRect/>
                     </a:stretch>
@@ -7838,7 +8233,7 @@
           <w:b/>
           <w:bCs/>
         </w:rPr>
-        <w:t xml:space="preserve">Figure 4.35: Finding Detail.</w:t>
+        <w:t xml:space="preserve">Figure 4.41: Finding Detail.</w:t>
       </w:r>
       <w:r>
         <w:t xml:space="preserve"> </w:t>
@@ -7854,11 +8249,11 @@
         <w:t xml:space="preserve"> </w:t>
       </w:r>
       <w:r>
-        <w:t xml:space="preserve">The most important screen for the project's thesis. For the confirmed SQL-injection finding it shows the confidence score with its full six-factor breakdown, the machine-learning priority prediction, the CVSS v3 metrics, the description and recommended solution, and the proof-of-concept evidence that triggered the confirmation. This is the concrete realisation of explainable, evidence-backed triage. (The confidence panel is examined in isolation in Figure 4.24.)</w:t>
-      </w:r>
-    </w:p>
-    <w:bookmarkEnd w:id="157"/>
-    <w:bookmarkStart w:id="161" w:name="X3b8ffb2c2c8594b656bd2a544a17692c9dbd9a7"/>
+        <w:t xml:space="preserve">The most important screen for the project's thesis. For the confirmed SQL-injection finding it shows the confidence score with its full six-factor breakdown, the machine-learning priority prediction, the CVSS v3 metrics, the description and recommended solution, and the proof-of-concept evidence that triggered the confirmation. This is the concrete realisation of explainable, evidence-backed triage. (The confidence panel is examined in isolation in Figure 4.30.)</w:t>
+      </w:r>
+    </w:p>
+    <w:bookmarkEnd w:id="175"/>
+    <w:bookmarkStart w:id="179" w:name="X3b8ffb2c2c8594b656bd2a544a17692c9dbd9a7"/>
     <w:p>
       <w:pPr>
         <w:pStyle w:val="Heading3"/>
@@ -7876,18 +8271,18 @@
           <wp:inline>
             <wp:extent cx="5334000" cy="3189287"/>
             <wp:effectExtent b="0" l="0" r="0" t="0"/>
-            <wp:docPr descr="Reports list" title="" id="159" name="Picture"/>
+            <wp:docPr descr="Reports list" title="" id="177" name="Picture"/>
             <a:graphic>
               <a:graphicData uri="http://schemas.openxmlformats.org/drawingml/2006/picture">
                 <pic:pic>
                   <pic:nvPicPr>
-                    <pic:cNvPr descr="images/08-reports.png" id="160" name="Picture"/>
+                    <pic:cNvPr descr="images/08-reports.png" id="178" name="Picture"/>
                     <pic:cNvPicPr>
                       <a:picLocks noChangeArrowheads="1" noChangeAspect="1"/>
                     </pic:cNvPicPr>
                   </pic:nvPicPr>
                   <pic:blipFill>
-                    <a:blip r:embed="rId158"/>
+                    <a:blip r:embed="rId176"/>
                     <a:stretch>
                       <a:fillRect/>
                     </a:stretch>
@@ -7923,7 +8318,7 @@
           <w:b/>
           <w:bCs/>
         </w:rPr>
-        <w:t xml:space="preserve">Figure 4.36: Reports List.</w:t>
+        <w:t xml:space="preserve">Figure 4.42: Reports List.</w:t>
       </w:r>
       <w:r>
         <w:t xml:space="preserve"> </w:t>
@@ -7942,8 +8337,8 @@
         <w:t xml:space="preserve">Completes the workflow (UC9): generated PDF reports are listed and downloadable, providing the deliverable an analyst hands to stakeholders.</w:t>
       </w:r>
     </w:p>
-    <w:bookmarkEnd w:id="161"/>
-    <w:bookmarkStart w:id="168" w:name="Xc9cdf9694989309be5c9b710b76adc554a0427e"/>
+    <w:bookmarkEnd w:id="179"/>
+    <w:bookmarkStart w:id="186" w:name="Xc9cdf9694989309be5c9b710b76adc554a0427e"/>
     <w:p>
       <w:pPr>
         <w:pStyle w:val="Heading3"/>
@@ -7961,18 +8356,18 @@
           <wp:inline>
             <wp:extent cx="5334000" cy="7541944"/>
             <wp:effectExtent b="0" l="0" r="0" t="0"/>
-            <wp:docPr descr="PDF report cover page" title="" id="163" name="Picture"/>
+            <wp:docPr descr="PDF report cover page" title="" id="181" name="Picture"/>
             <a:graphic>
               <a:graphicData uri="http://schemas.openxmlformats.org/drawingml/2006/picture">
                 <pic:pic>
                   <pic:nvPicPr>
-                    <pic:cNvPr descr="images/09-report-cover.png" id="164" name="Picture"/>
+                    <pic:cNvPr descr="images/09-report-cover.png" id="182" name="Picture"/>
                     <pic:cNvPicPr>
                       <a:picLocks noChangeArrowheads="1" noChangeAspect="1"/>
                     </pic:cNvPicPr>
                   </pic:nvPicPr>
                   <pic:blipFill>
-                    <a:blip r:embed="rId162"/>
+                    <a:blip r:embed="rId180"/>
                     <a:stretch>
                       <a:fillRect/>
                     </a:stretch>
@@ -8008,7 +8403,7 @@
           <w:b/>
           <w:bCs/>
         </w:rPr>
-        <w:t xml:space="preserve">Figure 4.37: PDF Report — Cover and Severity Summary.</w:t>
+        <w:t xml:space="preserve">Figure 4.43: PDF Report — Cover and Severity Summary.</w:t>
       </w:r>
       <w:r>
         <w:t xml:space="preserve"> </w:t>
@@ -8036,18 +8431,18 @@
           <wp:inline>
             <wp:extent cx="5334000" cy="7541944"/>
             <wp:effectExtent b="0" l="0" r="0" t="0"/>
-            <wp:docPr descr="PDF report executive summary" title="" id="166" name="Picture"/>
+            <wp:docPr descr="PDF report executive summary" title="" id="184" name="Picture"/>
             <a:graphic>
               <a:graphicData uri="http://schemas.openxmlformats.org/drawingml/2006/picture">
                 <pic:pic>
                   <pic:nvPicPr>
-                    <pic:cNvPr descr="images/10-report-summary.png" id="167" name="Picture"/>
+                    <pic:cNvPr descr="images/10-report-summary.png" id="185" name="Picture"/>
                     <pic:cNvPicPr>
                       <a:picLocks noChangeArrowheads="1" noChangeAspect="1"/>
                     </pic:cNvPicPr>
                   </pic:nvPicPr>
                   <pic:blipFill>
-                    <a:blip r:embed="rId165"/>
+                    <a:blip r:embed="rId183"/>
                     <a:stretch>
                       <a:fillRect/>
                     </a:stretch>
@@ -8083,7 +8478,7 @@
           <w:b/>
           <w:bCs/>
         </w:rPr>
-        <w:t xml:space="preserve">Figure 4.38: PDF Report — Executive Summary.</w:t>
+        <w:t xml:space="preserve">Figure 4.44: PDF Report — Executive Summary.</w:t>
       </w:r>
       <w:r>
         <w:t xml:space="preserve"> </w:t>
@@ -8135,9 +8530,9 @@
         </w:pict>
       </w:r>
     </w:p>
-    <w:bookmarkEnd w:id="168"/>
-    <w:bookmarkEnd w:id="169"/>
-    <w:bookmarkStart w:id="170" w:name="X623c2de98ec25c30e3c670a591e51ee904911e5"/>
+    <w:bookmarkEnd w:id="186"/>
+    <w:bookmarkEnd w:id="187"/>
+    <w:bookmarkStart w:id="188" w:name="X623c2de98ec25c30e3c670a591e51ee904911e5"/>
     <w:p>
       <w:pPr>
         <w:pStyle w:val="Heading2"/>
@@ -8162,8 +8557,8 @@
         <w:t xml:space="preserve">Taken together, these artefacts describe a fully realised system that ingests multi-scanner output and, through a normalisation–enrichment–prioritisation–confidence pipeline, produces explainable, prioritised, and confirmation-backed vulnerability findings. The following chapter evaluates the system's performance and effectiveness against the objectives established for the project.</w:t>
       </w:r>
     </w:p>
-    <w:bookmarkEnd w:id="170"/>
-    <w:bookmarkEnd w:id="171"/>
+    <w:bookmarkEnd w:id="188"/>
+    <w:bookmarkEnd w:id="189"/>
     <w:sectPr>
       <w:footnotePr>
         <w:numRestart w:val="eachSect"/>

</xml_diff>

<commit_message>
docs: reflect Gemini-only AI provider; untrack Claude Code config
The AI-Assisted Analysis engine is Gemini-only (engines/ai_summary.py uses
GEMINI_API_KEY/GOOGLE_API_KEY). Update Chapters 4-6 (.md + .docx),
ARCHITECTURE.md and PROJECT_SUMMARY.md to drop the stale 'or Anthropic'
provider wording. Stop tracking .claude/ local config and add it to
.gitignore.
</commit_message>
<xml_diff>
--- a/docs/Chapter_4_Design_and_Implementation.docx
+++ b/docs/Chapter_4_Design_and_Implementation.docx
@@ -7248,7 +7248,7 @@
         <w:t xml:space="preserve"> </w:t>
       </w:r>
       <w:r>
-        <w:t xml:space="preserve">— it uses Google Gemini or Anthropic Claude depending on which API key is present (</w:t>
+        <w:t xml:space="preserve">— it uses Google Gemini depending on which API key is present (</w:t>
       </w:r>
       <w:r>
         <w:rPr>
@@ -7269,7 +7269,7 @@
         <w:rPr>
           <w:rStyle w:val="VerbatimChar"/>
         </w:rPr>
-        <w:t xml:space="preserve">ANTHROPIC_API_KEY</w:t>
+        <w:t xml:space="preserve">GOOGLE_API_KEY</w:t>
       </w:r>
       <w:r>
         <w:t xml:space="preserve">) — and makes a single structured-output request per report. Like the NVD enrichment and exploit-lookup features, it is</w:t>

</xml_diff>